<commit_message>
Discuss vgg_no_padding in the thesis
</commit_message>
<xml_diff>
--- a/mydocuments/Defence1/Sikolia_Thesis_Revision_5.docx
+++ b/mydocuments/Defence1/Sikolia_Thesis_Revision_5.docx
@@ -29906,6 +29906,7 @@
       <w:r>
         <w:rPr>
           <w:rFonts w:ascii="Times New Roman" w:hAnsi="Times New Roman" w:cs="Times New Roman"/>
+          <w:noProof/>
         </w:rPr>
         <w:lastRenderedPageBreak/>
         <w:drawing>
@@ -30073,6 +30074,7 @@
       <w:r>
         <w:rPr>
           <w:rFonts w:ascii="Times New Roman" w:hAnsi="Times New Roman" w:cs="Times New Roman"/>
+          <w:noProof/>
         </w:rPr>
         <w:drawing>
           <wp:inline distT="0" distB="0" distL="0" distR="0" wp14:anchorId="33D01B8B" wp14:editId="0621657F">
@@ -31134,6 +31136,7 @@
       <w:r>
         <w:rPr>
           <w:rFonts w:ascii="Times New Roman" w:eastAsia="Times New Roman" w:hAnsi="Times New Roman" w:cs="Times New Roman"/>
+          <w:noProof/>
           <w:kern w:val="0"/>
           <w:lang w:eastAsia="en-US" w:bidi="ar-SA"/>
         </w:rPr>
@@ -31204,6 +31207,7 @@
     <w:p>
       <w:pPr>
         <w:pStyle w:val="BodyText"/>
+        <w:spacing w:line="480" w:lineRule="auto"/>
         <w:ind w:firstLine="720"/>
         <w:rPr>
           <w:lang w:eastAsia="en-US" w:bidi="ar-SA"/>
@@ -31213,26 +31217,26 @@
         <w:rPr>
           <w:lang w:eastAsia="en-US" w:bidi="ar-SA"/>
         </w:rPr>
-        <w:t xml:space="preserve">If you have noticed from the title above, we ran our experiment on a modified VGG16 model instead of the original VGG16 model. </w:t>
+        <w:t xml:space="preserve">While the architecture presented in this study draws inspiration from the standard VGG16 framework, a strategic reduction in depth was necessitated by the decision to exclude zero-padding. </w:t>
       </w:r>
       <w:r>
         <w:rPr>
           <w:lang w:eastAsia="en-US" w:bidi="ar-SA"/>
         </w:rPr>
-        <w:t xml:space="preserve">While the architecture presented in this study draws inspiration from the standard VGG16 framework, a strategic reduction in depth was necessitated by </w:t>
+        <w:lastRenderedPageBreak/>
+        <w:t xml:space="preserve">In a standard VGG16 implementation, the repetitive application of 3 </w:t>
       </w:r>
       <w:r>
         <w:rPr>
           <w:lang w:eastAsia="en-US" w:bidi="ar-SA"/>
         </w:rPr>
-        <w:lastRenderedPageBreak/>
-        <w:t xml:space="preserve">the decision to exclude zero-padding. In a standard VGG16 implementation, the repetitive application of 3 </w:t>
+        <w:t>*</w:t>
       </w:r>
       <w:r>
         <w:rPr>
           <w:lang w:eastAsia="en-US" w:bidi="ar-SA"/>
         </w:rPr>
-        <w:t>*</w:t>
+        <w:t xml:space="preserve"> 3</w:t>
       </w:r>
       <w:r>
         <w:rPr>
@@ -31244,44 +31248,28 @@
         <w:rPr>
           <w:lang w:eastAsia="en-US" w:bidi="ar-SA"/>
         </w:rPr>
-        <w:t>3</w:t>
-      </w:r>
-      <w:r>
+        <w:t>kernels—when coupled with "valid" (unpadded) convolutions—results in a rapid spatial contraction of the feature maps.</w:t>
+      </w:r>
+    </w:p>
+    <w:p>
+      <w:pPr>
+        <w:pStyle w:val="BodyText"/>
+        <w:spacing w:line="480" w:lineRule="auto"/>
         <w:rPr>
           <w:lang w:eastAsia="en-US" w:bidi="ar-SA"/>
         </w:rPr>
-        <w:t xml:space="preserve"> </w:t>
-      </w:r>
+      </w:pPr>
       <w:r>
         <w:rPr>
           <w:lang w:eastAsia="en-US" w:bidi="ar-SA"/>
         </w:rPr>
-        <w:t>kernels</w:t>
-      </w:r>
-      <w:r>
-        <w:rPr>
-          <w:lang w:eastAsia="en-US" w:bidi="ar-SA"/>
-        </w:rPr>
-        <w:t>—when coupled with "valid" (unpadded) convolutions—results in a rapid spatial contraction of the feature maps.</w:t>
+        <w:t>Mathematically, the output dimension O of a convolutional layer is defined as:</w:t>
       </w:r>
     </w:p>
     <w:p>
       <w:pPr>
         <w:pStyle w:val="BodyText"/>
-        <w:rPr>
-          <w:lang w:eastAsia="en-US" w:bidi="ar-SA"/>
-        </w:rPr>
-      </w:pPr>
-      <w:r>
-        <w:rPr>
-          <w:lang w:eastAsia="en-US" w:bidi="ar-SA"/>
-        </w:rPr>
-        <w:t>Mathematically, the output dimension O of a convolutional layer is defined as:</w:t>
-      </w:r>
-    </w:p>
-    <w:p>
-      <w:pPr>
-        <w:pStyle w:val="BodyText"/>
+        <w:spacing w:line="480" w:lineRule="auto"/>
         <w:rPr>
           <w:lang w:eastAsia="en-US" w:bidi="ar-SA"/>
         </w:rPr>
@@ -31332,14 +31320,7 @@
               <w:rFonts w:ascii="Cambria Math" w:hAnsi="Cambria Math"/>
               <w:lang w:eastAsia="en-US" w:bidi="ar-SA"/>
             </w:rPr>
-            <m:t>+</m:t>
-          </m:r>
-          <m:r>
-            <w:rPr>
-              <w:rFonts w:ascii="Cambria Math" w:hAnsi="Cambria Math"/>
-              <w:lang w:eastAsia="en-US" w:bidi="ar-SA"/>
-            </w:rPr>
-            <m:t>1</m:t>
+            <m:t>+1</m:t>
           </m:r>
         </m:oMath>
       </m:oMathPara>
@@ -31347,6 +31328,7 @@
     <w:p>
       <w:pPr>
         <w:pStyle w:val="BodyText"/>
+        <w:spacing w:line="480" w:lineRule="auto"/>
         <w:rPr>
           <w:lang w:eastAsia="en-US" w:bidi="ar-SA"/>
         </w:rPr>
@@ -31397,6 +31379,7 @@
     <w:p>
       <w:pPr>
         <w:pStyle w:val="BodyText"/>
+        <w:spacing w:line="480" w:lineRule="auto"/>
         <w:ind w:firstLine="720"/>
         <w:rPr>
           <w:lang w:eastAsia="en-US" w:bidi="ar-SA"/>
@@ -31444,10 +31427,18 @@
         </w:rPr>
         <w:t xml:space="preserve"> 128) prior to flattening, ensuring that the classification head received a mathematically valid and feature-rich input.</w:t>
       </w:r>
+      <w:r>
+        <w:rPr>
+          <w:lang w:eastAsia="en-US" w:bidi="ar-SA"/>
+        </w:rPr>
+        <w:t xml:space="preserve"> In simple terms, all data will be lost if we used 16 layers like in the original VGG16 model.</w:t>
+      </w:r>
     </w:p>
     <w:p>
       <w:pPr>
         <w:pStyle w:val="BodyText"/>
+        <w:spacing w:line="480" w:lineRule="auto"/>
+        <w:ind w:firstLine="720"/>
         <w:rPr>
           <w:lang w:eastAsia="en-US" w:bidi="ar-SA"/>
         </w:rPr>
@@ -31456,196 +31447,67 @@
         <w:rPr>
           <w:lang w:eastAsia="en-US" w:bidi="ar-SA"/>
         </w:rPr>
-        <w:pict w14:anchorId="1F9F2F66">
-          <v:rect id="_x0000_i1031" style="width:0;height:1.5pt" o:hralign="center" o:hrstd="t" o:hr="t" fillcolor="#a0a0a0" stroked="f"/>
-        </w:pict>
-      </w:r>
-    </w:p>
-    <w:p>
-      <w:pPr>
-        <w:pStyle w:val="BodyText"/>
-        <w:numPr>
-          <w:ilvl w:val="0"/>
-          <w:numId w:val="8"/>
-        </w:numPr>
-        <w:rPr>
-          <w:b/>
-          <w:bCs/>
+        <w:t xml:space="preserve">While extending the architecture to </w:t>
+      </w:r>
+      <w:r>
+        <w:rPr>
           <w:lang w:eastAsia="en-US" w:bidi="ar-SA"/>
         </w:rPr>
-      </w:pPr>
-      <w:r>
-        <w:rPr>
-          <w:b/>
-          <w:bCs/>
+        <w:t>include more layers like in the original VGG16 model</w:t>
+      </w:r>
+      <w:r>
+        <w:rPr>
           <w:lang w:eastAsia="en-US" w:bidi="ar-SA"/>
         </w:rPr>
-        <w:t>Key Points for your Discussion:</w:t>
-      </w:r>
-    </w:p>
-    <w:p>
-      <w:pPr>
-        <w:pStyle w:val="BodyText"/>
-        <w:numPr>
-          <w:ilvl w:val="0"/>
-          <w:numId w:val="16"/>
-        </w:numPr>
+        <w:t xml:space="preserve"> would reduce parameter complexity, it would also result in an additional 9.8% reduction in spatial resolution</w:t>
+      </w:r>
+      <w:r>
         <w:rPr>
           <w:lang w:eastAsia="en-US" w:bidi="ar-SA"/>
         </w:rPr>
-      </w:pPr>
-      <w:r>
-        <w:rPr>
-          <w:b/>
-          <w:bCs/>
+        <w:t xml:space="preserve">. </w:t>
+      </w:r>
+      <w:r>
+        <w:rPr>
           <w:lang w:eastAsia="en-US" w:bidi="ar-SA"/>
         </w:rPr>
-        <w:t>Spatial Decay:</w:t>
-      </w:r>
-      <w:r>
+        <w:t>To prioritize the retention of fine-grained biometric textures essential for facial recognition, the architecture was truncated at Block 2, ensuring the classification head received the highest possible information density.</w:t>
+      </w:r>
+    </w:p>
+    <w:p>
+      <w:pPr>
+        <w:pStyle w:val="Heading3"/>
         <w:rPr>
           <w:lang w:eastAsia="en-US" w:bidi="ar-SA"/>
         </w:rPr>
-        <w:t xml:space="preserve"> By mentioning the "spatial decay" of the feature maps, you explain that the model "outran" its own resolution.</w:t>
-      </w:r>
-    </w:p>
-    <w:p>
-      <w:pPr>
-        <w:pStyle w:val="BodyText"/>
-        <w:numPr>
-          <w:ilvl w:val="0"/>
-          <w:numId w:val="16"/>
-        </w:numPr>
+      </w:pPr>
+      <w:r>
         <w:rPr>
           <w:lang w:eastAsia="en-US" w:bidi="ar-SA"/>
         </w:rPr>
-      </w:pPr>
-      <w:r>
-        <w:rPr>
-          <w:b/>
-          <w:bCs/>
-          <w:lang w:eastAsia="en-US" w:bidi="ar-SA"/>
-        </w:rPr>
-        <w:t>Comparison to Padding:</w:t>
-      </w:r>
-      <w:r>
-        <w:rPr>
-          <w:lang w:eastAsia="en-US" w:bidi="ar-SA"/>
-        </w:rPr>
-        <w:t xml:space="preserve"> This effectively highlights the trade-off you made: you sacrificed network depth (number of layers) to gain data purity (no padding).</w:t>
-      </w:r>
-    </w:p>
-    <w:p>
-      <w:pPr>
-        <w:pStyle w:val="BodyText"/>
-        <w:numPr>
-          <w:ilvl w:val="0"/>
-          <w:numId w:val="16"/>
-        </w:numPr>
-        <w:rPr>
-          <w:lang w:eastAsia="en-US" w:bidi="ar-SA"/>
-        </w:rPr>
-      </w:pPr>
-      <w:r>
-        <w:rPr>
-          <w:b/>
-          <w:bCs/>
-          <w:lang w:eastAsia="en-US" w:bidi="ar-SA"/>
-        </w:rPr>
-        <w:t>Information Density:</w:t>
-      </w:r>
-      <w:r>
-        <w:rPr>
-          <w:lang w:eastAsia="en-US" w:bidi="ar-SA"/>
-        </w:rPr>
-        <w:t xml:space="preserve"> You can argue that even with fewer layers, the unpadded model is more efficient because every pixel processed is an original biometric signal rather than an artificial zero.</w:t>
-      </w:r>
-    </w:p>
-    <w:p>
-      <w:pPr>
-        <w:pStyle w:val="BodyText"/>
-        <w:numPr>
-          <w:ilvl w:val="0"/>
-          <w:numId w:val="8"/>
-        </w:numPr>
-        <w:rPr>
-          <w:b/>
-          <w:bCs/>
-          <w:lang w:eastAsia="en-US" w:bidi="ar-SA"/>
-        </w:rPr>
-      </w:pPr>
-      <w:r>
-        <w:rPr>
-          <w:b/>
-          <w:bCs/>
-          <w:lang w:eastAsia="en-US" w:bidi="ar-SA"/>
-        </w:rPr>
-        <w:t>Data for your Summary Table:</w:t>
-      </w:r>
-    </w:p>
-    <w:p>
-      <w:pPr>
-        <w:pStyle w:val="BodyText"/>
-        <w:rPr>
-          <w:lang w:eastAsia="en-US" w:bidi="ar-SA"/>
-        </w:rPr>
-      </w:pPr>
-      <w:r>
-        <w:rPr>
-          <w:lang w:eastAsia="en-US" w:bidi="ar-SA"/>
-        </w:rPr>
-        <w:t>You can add a note to your architecture table:</w:t>
-      </w:r>
-    </w:p>
-    <w:p>
-      <w:pPr>
-        <w:pStyle w:val="BodyText"/>
-        <w:rPr>
-          <w:lang w:eastAsia="en-US" w:bidi="ar-SA"/>
-        </w:rPr>
-      </w:pPr>
-      <w:r>
-        <w:rPr>
-          <w:i/>
-          <w:iCs/>
-          <w:lang w:eastAsia="en-US" w:bidi="ar-SA"/>
-        </w:rPr>
-        <w:t>"Note: Truncated depth relative to VGG16 to prevent spatial dimensionality exhaustion under non-padding constraints."</w:t>
-      </w:r>
-    </w:p>
-    <w:p>
-      <w:pPr>
-        <w:pStyle w:val="BodyText"/>
-        <w:rPr>
-          <w:lang w:eastAsia="en-US" w:bidi="ar-SA"/>
-        </w:rPr>
-      </w:pPr>
-      <w:r>
-        <w:rPr>
-          <w:lang w:eastAsia="en-US" w:bidi="ar-SA"/>
-        </w:rPr>
-        <w:t>How would you like to incorporate this explanation into your final draft—as a standalone paragraph or as a footnote to your architecture table?</w:t>
-      </w:r>
-    </w:p>
-    <w:p>
-      <w:pPr>
-        <w:pStyle w:val="BodyText"/>
-        <w:rPr>
-          <w:lang w:eastAsia="en-US" w:bidi="ar-SA"/>
-        </w:rPr>
-      </w:pPr>
-    </w:p>
-    <w:p>
-      <w:pPr>
-        <w:numPr>
-          <w:ilvl w:val="0"/>
-          <w:numId w:val="8"/>
-        </w:numPr>
-        <w:tabs>
-          <w:tab w:val="num" w:pos="360"/>
-        </w:tabs>
+        <w:t>Modified VGG Architecture: VGG_No_Padding</w:t>
+      </w:r>
+    </w:p>
+    <w:p>
+      <w:pPr>
         <w:suppressAutoHyphens w:val="0"/>
         <w:spacing w:before="100" w:beforeAutospacing="1" w:after="100" w:afterAutospacing="1" w:line="480" w:lineRule="auto"/>
+        <w:ind w:firstLine="432"/>
+        <w:rPr>
+          <w:rFonts w:ascii="Times New Roman" w:eastAsia="Times New Roman" w:hAnsi="Times New Roman" w:cs="Times New Roman"/>
+          <w:kern w:val="0"/>
+          <w:lang w:eastAsia="en-US" w:bidi="ar-SA"/>
+        </w:rPr>
+      </w:pPr>
+      <w:r>
+        <w:rPr>
+          <w:rFonts w:ascii="Times New Roman" w:eastAsia="Times New Roman" w:hAnsi="Times New Roman" w:cs="Times New Roman"/>
+          <w:kern w:val="0"/>
+          <w:lang w:eastAsia="en-US" w:bidi="ar-SA"/>
+        </w:rPr>
+        <w:t xml:space="preserve">The </w:t>
+      </w:r>
+      <w:r>
         <w:rPr>
           <w:rFonts w:ascii="Times New Roman" w:eastAsia="Times New Roman" w:hAnsi="Times New Roman" w:cs="Times New Roman"/>
           <w:b/>
@@ -31653,7 +31515,32 @@
           <w:kern w:val="0"/>
           <w:lang w:eastAsia="en-US" w:bidi="ar-SA"/>
         </w:rPr>
-      </w:pPr>
+        <w:t>VGG_No_Padding</w:t>
+      </w:r>
+      <w:r>
+        <w:rPr>
+          <w:rFonts w:ascii="Times New Roman" w:eastAsia="Times New Roman" w:hAnsi="Times New Roman" w:cs="Times New Roman"/>
+          <w:kern w:val="0"/>
+          <w:lang w:eastAsia="en-US" w:bidi="ar-SA"/>
+        </w:rPr>
+        <w:t xml:space="preserve"> architecture is a customized deep convolutional neural network based on the VGG philosophy of utilizing small 3 </w:t>
+      </w:r>
+      <w:r>
+        <w:rPr>
+          <w:rFonts w:ascii="Times New Roman" w:eastAsia="Times New Roman" w:hAnsi="Times New Roman" w:cs="Times New Roman"/>
+          <w:kern w:val="0"/>
+          <w:lang w:eastAsia="en-US" w:bidi="ar-SA"/>
+        </w:rPr>
+        <w:t>*</w:t>
+      </w:r>
+      <w:r>
+        <w:rPr>
+          <w:rFonts w:ascii="Times New Roman" w:eastAsia="Times New Roman" w:hAnsi="Times New Roman" w:cs="Times New Roman"/>
+          <w:kern w:val="0"/>
+          <w:lang w:eastAsia="en-US" w:bidi="ar-SA"/>
+        </w:rPr>
+        <w:t xml:space="preserve"> 3. Unlike standard VGG implementations that employ zero-padding to maintain spatial resolution, this variant utilizes </w:t>
+      </w:r>
       <w:r>
         <w:rPr>
           <w:rFonts w:ascii="Times New Roman" w:eastAsia="Times New Roman" w:hAnsi="Times New Roman" w:cs="Times New Roman"/>
@@ -31662,133 +31549,34 @@
           <w:kern w:val="0"/>
           <w:lang w:eastAsia="en-US" w:bidi="ar-SA"/>
         </w:rPr>
-        <w:t xml:space="preserve">Modified VGG Architecture: </w:t>
-      </w:r>
-      <w:proofErr w:type="spellStart"/>
-      <w:r>
-        <w:rPr>
-          <w:rFonts w:ascii="Times New Roman" w:eastAsia="Times New Roman" w:hAnsi="Times New Roman" w:cs="Times New Roman"/>
-          <w:b/>
-          <w:bCs/>
-          <w:kern w:val="0"/>
-          <w:lang w:eastAsia="en-US" w:bidi="ar-SA"/>
-        </w:rPr>
-        <w:t>VGG_No_Padding</w:t>
-      </w:r>
-      <w:proofErr w:type="spellEnd"/>
-    </w:p>
-    <w:p>
-      <w:pPr>
-        <w:suppressAutoHyphens w:val="0"/>
-        <w:spacing w:before="100" w:beforeAutospacing="1" w:after="100" w:afterAutospacing="1" w:line="480" w:lineRule="auto"/>
+        <w:t>valid convolutions</w:t>
+      </w:r>
+      <w:r>
         <w:rPr>
           <w:rFonts w:ascii="Times New Roman" w:eastAsia="Times New Roman" w:hAnsi="Times New Roman" w:cs="Times New Roman"/>
           <w:kern w:val="0"/>
           <w:lang w:eastAsia="en-US" w:bidi="ar-SA"/>
         </w:rPr>
-      </w:pPr>
-      <w:r>
+        <w:t>. This design choice ensures that the model processes only original pixel data, thereby eliminating the potential for artificial foveation bias or boundary-induced artifacts.</w:t>
+      </w:r>
+    </w:p>
+    <w:p>
+      <w:pPr>
+        <w:suppressAutoHyphens w:val="0"/>
+        <w:spacing w:before="100" w:beforeAutospacing="1" w:after="100" w:afterAutospacing="1" w:line="480" w:lineRule="auto"/>
         <w:rPr>
           <w:rFonts w:ascii="Times New Roman" w:eastAsia="Times New Roman" w:hAnsi="Times New Roman" w:cs="Times New Roman"/>
           <w:kern w:val="0"/>
           <w:lang w:eastAsia="en-US" w:bidi="ar-SA"/>
         </w:rPr>
-        <w:t xml:space="preserve">The </w:t>
-      </w:r>
-      <w:proofErr w:type="spellStart"/>
-      <w:r>
-        <w:rPr>
-          <w:rFonts w:ascii="Times New Roman" w:eastAsia="Times New Roman" w:hAnsi="Times New Roman" w:cs="Times New Roman"/>
-          <w:b/>
-          <w:bCs/>
-          <w:kern w:val="0"/>
-          <w:lang w:eastAsia="en-US" w:bidi="ar-SA"/>
-        </w:rPr>
-        <w:t>VGG_No_Padding</w:t>
-      </w:r>
-      <w:proofErr w:type="spellEnd"/>
+      </w:pPr>
       <w:r>
         <w:rPr>
           <w:rFonts w:ascii="Times New Roman" w:eastAsia="Times New Roman" w:hAnsi="Times New Roman" w:cs="Times New Roman"/>
           <w:kern w:val="0"/>
           <w:lang w:eastAsia="en-US" w:bidi="ar-SA"/>
         </w:rPr>
-        <w:t xml:space="preserve"> architecture is a customized deep convolutional neural network based on the VGG philosophy of utilizing small $3 \times 3$ kernels. Unlike standard VGG implementations that employ zero-padding to maintain spatial resolution, this variant utilizes </w:t>
-      </w:r>
-      <w:r>
-        <w:rPr>
-          <w:rFonts w:ascii="Times New Roman" w:eastAsia="Times New Roman" w:hAnsi="Times New Roman" w:cs="Times New Roman"/>
-          <w:b/>
-          <w:bCs/>
-          <w:kern w:val="0"/>
-          <w:lang w:eastAsia="en-US" w:bidi="ar-SA"/>
-        </w:rPr>
-        <w:t>valid convolutions</w:t>
-      </w:r>
-      <w:r>
-        <w:rPr>
-          <w:rFonts w:ascii="Times New Roman" w:eastAsia="Times New Roman" w:hAnsi="Times New Roman" w:cs="Times New Roman"/>
-          <w:kern w:val="0"/>
-          <w:lang w:eastAsia="en-US" w:bidi="ar-SA"/>
-        </w:rPr>
-        <w:t xml:space="preserve">. </w:t>
-      </w:r>
-      <w:r>
-        <w:rPr>
-          <w:rFonts w:ascii="Times New Roman" w:eastAsia="Times New Roman" w:hAnsi="Times New Roman" w:cs="Times New Roman"/>
-          <w:kern w:val="0"/>
-          <w:lang w:eastAsia="en-US" w:bidi="ar-SA"/>
-        </w:rPr>
         <w:lastRenderedPageBreak/>
-        <w:t>This design choice ensures that the model processes only original pixel data, thereby eliminating the potential for artificial foveation bias or boundary-induced artifacts.</w:t>
-      </w:r>
-    </w:p>
-    <w:p>
-      <w:pPr>
-        <w:numPr>
-          <w:ilvl w:val="0"/>
-          <w:numId w:val="8"/>
-        </w:numPr>
-        <w:tabs>
-          <w:tab w:val="num" w:pos="360"/>
-        </w:tabs>
-        <w:suppressAutoHyphens w:val="0"/>
-        <w:spacing w:before="100" w:beforeAutospacing="1" w:after="100" w:afterAutospacing="1" w:line="480" w:lineRule="auto"/>
-        <w:rPr>
-          <w:rFonts w:ascii="Times New Roman" w:eastAsia="Times New Roman" w:hAnsi="Times New Roman" w:cs="Times New Roman"/>
-          <w:b/>
-          <w:bCs/>
-          <w:kern w:val="0"/>
-          <w:lang w:eastAsia="en-US" w:bidi="ar-SA"/>
-        </w:rPr>
-      </w:pPr>
-      <w:r>
-        <w:rPr>
-          <w:rFonts w:ascii="Times New Roman" w:eastAsia="Times New Roman" w:hAnsi="Times New Roman" w:cs="Times New Roman"/>
-          <w:b/>
-          <w:bCs/>
-          <w:kern w:val="0"/>
-          <w:lang w:eastAsia="en-US" w:bidi="ar-SA"/>
-        </w:rPr>
-        <w:t>3.X.1 Feature Extraction and Spatial Reduction</w:t>
-      </w:r>
-    </w:p>
-    <w:p>
-      <w:pPr>
-        <w:suppressAutoHyphens w:val="0"/>
-        <w:spacing w:before="100" w:beforeAutospacing="1" w:after="100" w:afterAutospacing="1" w:line="480" w:lineRule="auto"/>
-        <w:rPr>
-          <w:rFonts w:ascii="Times New Roman" w:eastAsia="Times New Roman" w:hAnsi="Times New Roman" w:cs="Times New Roman"/>
-          <w:kern w:val="0"/>
-          <w:lang w:eastAsia="en-US" w:bidi="ar-SA"/>
-        </w:rPr>
-      </w:pPr>
-      <w:r>
-        <w:rPr>
-          <w:rFonts w:ascii="Times New Roman" w:eastAsia="Times New Roman" w:hAnsi="Times New Roman" w:cs="Times New Roman"/>
-          <w:kern w:val="0"/>
-          <w:lang w:eastAsia="en-US" w:bidi="ar-SA"/>
-        </w:rPr>
         <w:t>The backbone of the model is organized into two primary convolutional blocks:</w:t>
       </w:r>
     </w:p>
@@ -31822,7 +31610,55 @@
           <w:kern w:val="0"/>
           <w:lang w:eastAsia="en-US" w:bidi="ar-SA"/>
         </w:rPr>
-        <w:t xml:space="preserve"> Comprises two convolutional layers with $64$ filters each. Given the absence of padding, the initial $256 \times 256$ input is reduced to $254 \times 254$ and then to $252 \times 252$ before entering the first max-pooling stage.</w:t>
+        <w:t xml:space="preserve"> Comprises two convolutional layers with 64 filters each. Given the absence of padding, the initial 256 </w:t>
+      </w:r>
+      <w:r>
+        <w:rPr>
+          <w:rFonts w:ascii="Times New Roman" w:eastAsia="Times New Roman" w:hAnsi="Times New Roman" w:cs="Times New Roman"/>
+          <w:kern w:val="0"/>
+          <w:lang w:eastAsia="en-US" w:bidi="ar-SA"/>
+        </w:rPr>
+        <w:t>*</w:t>
+      </w:r>
+      <w:r>
+        <w:rPr>
+          <w:rFonts w:ascii="Times New Roman" w:eastAsia="Times New Roman" w:hAnsi="Times New Roman" w:cs="Times New Roman"/>
+          <w:kern w:val="0"/>
+          <w:lang w:eastAsia="en-US" w:bidi="ar-SA"/>
+        </w:rPr>
+        <w:t xml:space="preserve"> 256 input is reduced to 254 </w:t>
+      </w:r>
+      <w:r>
+        <w:rPr>
+          <w:rFonts w:ascii="Times New Roman" w:eastAsia="Times New Roman" w:hAnsi="Times New Roman" w:cs="Times New Roman"/>
+          <w:kern w:val="0"/>
+          <w:lang w:eastAsia="en-US" w:bidi="ar-SA"/>
+        </w:rPr>
+        <w:t>*</w:t>
+      </w:r>
+      <w:r>
+        <w:rPr>
+          <w:rFonts w:ascii="Times New Roman" w:eastAsia="Times New Roman" w:hAnsi="Times New Roman" w:cs="Times New Roman"/>
+          <w:kern w:val="0"/>
+          <w:lang w:eastAsia="en-US" w:bidi="ar-SA"/>
+        </w:rPr>
+        <w:t xml:space="preserve"> 254 and then to 252 </w:t>
+      </w:r>
+      <w:r>
+        <w:rPr>
+          <w:rFonts w:ascii="Times New Roman" w:eastAsia="Times New Roman" w:hAnsi="Times New Roman" w:cs="Times New Roman"/>
+          <w:kern w:val="0"/>
+          <w:lang w:eastAsia="en-US" w:bidi="ar-SA"/>
+        </w:rPr>
+        <w:t>*</w:t>
+      </w:r>
+      <w:r>
+        <w:rPr>
+          <w:rFonts w:ascii="Times New Roman" w:eastAsia="Times New Roman" w:hAnsi="Times New Roman" w:cs="Times New Roman"/>
+          <w:kern w:val="0"/>
+          <w:lang w:eastAsia="en-US" w:bidi="ar-SA"/>
+        </w:rPr>
+        <w:t xml:space="preserve"> 252 before entering the first max-pooling stage.</w:t>
       </w:r>
     </w:p>
     <w:p>
@@ -31855,37 +31691,55 @@
           <w:kern w:val="0"/>
           <w:lang w:eastAsia="en-US" w:bidi="ar-SA"/>
         </w:rPr>
-        <w:t xml:space="preserve"> Consists of two convolutional layers with $128$ filters. Further "valid" convolutions reduce the spatial grid to $122 \times 122$ before the final pooling layer outputs a feature map of $61 \times 61 \times 128$.</w:t>
-      </w:r>
-    </w:p>
-    <w:p>
-      <w:pPr>
-        <w:numPr>
-          <w:ilvl w:val="0"/>
-          <w:numId w:val="8"/>
-        </w:numPr>
-        <w:tabs>
-          <w:tab w:val="num" w:pos="360"/>
-        </w:tabs>
-        <w:suppressAutoHyphens w:val="0"/>
-        <w:spacing w:before="100" w:beforeAutospacing="1" w:after="100" w:afterAutospacing="1" w:line="480" w:lineRule="auto"/>
+        <w:t xml:space="preserve"> Consists of two convolutional layers with 128 filters. Further "valid" convolutions reduce the spatial grid to 122 </w:t>
+      </w:r>
+      <w:r>
         <w:rPr>
           <w:rFonts w:ascii="Times New Roman" w:eastAsia="Times New Roman" w:hAnsi="Times New Roman" w:cs="Times New Roman"/>
-          <w:b/>
-          <w:bCs/>
           <w:kern w:val="0"/>
           <w:lang w:eastAsia="en-US" w:bidi="ar-SA"/>
         </w:rPr>
-      </w:pPr>
+        <w:t xml:space="preserve">* </w:t>
+      </w:r>
       <w:r>
         <w:rPr>
           <w:rFonts w:ascii="Times New Roman" w:eastAsia="Times New Roman" w:hAnsi="Times New Roman" w:cs="Times New Roman"/>
-          <w:b/>
-          <w:bCs/>
           <w:kern w:val="0"/>
           <w:lang w:eastAsia="en-US" w:bidi="ar-SA"/>
         </w:rPr>
-        <w:t>3.X.2 Classification Head and Parameter Distribution</w:t>
+        <w:t xml:space="preserve">122 before the final pooling layer outputs a feature map of 61 </w:t>
+      </w:r>
+      <w:r>
+        <w:rPr>
+          <w:rFonts w:ascii="Times New Roman" w:eastAsia="Times New Roman" w:hAnsi="Times New Roman" w:cs="Times New Roman"/>
+          <w:kern w:val="0"/>
+          <w:lang w:eastAsia="en-US" w:bidi="ar-SA"/>
+        </w:rPr>
+        <w:t>*</w:t>
+      </w:r>
+      <w:r>
+        <w:rPr>
+          <w:rFonts w:ascii="Times New Roman" w:eastAsia="Times New Roman" w:hAnsi="Times New Roman" w:cs="Times New Roman"/>
+          <w:kern w:val="0"/>
+          <w:lang w:eastAsia="en-US" w:bidi="ar-SA"/>
+        </w:rPr>
+        <w:t xml:space="preserve"> 61 </w:t>
+      </w:r>
+      <w:r>
+        <w:rPr>
+          <w:rFonts w:ascii="Times New Roman" w:eastAsia="Times New Roman" w:hAnsi="Times New Roman" w:cs="Times New Roman"/>
+          <w:kern w:val="0"/>
+          <w:lang w:eastAsia="en-US" w:bidi="ar-SA"/>
+        </w:rPr>
+        <w:t>*</w:t>
+      </w:r>
+      <w:r>
+        <w:rPr>
+          <w:rFonts w:ascii="Times New Roman" w:eastAsia="Times New Roman" w:hAnsi="Times New Roman" w:cs="Times New Roman"/>
+          <w:kern w:val="0"/>
+          <w:lang w:eastAsia="en-US" w:bidi="ar-SA"/>
+        </w:rPr>
+        <w:t xml:space="preserve"> 128.</w:t>
       </w:r>
     </w:p>
     <w:p>
@@ -32024,7 +31878,7 @@
           <w:kern w:val="0"/>
           <w:lang w:eastAsia="en-US" w:bidi="ar-SA"/>
         </w:rPr>
-        <w:t xml:space="preserve"> layer ($p=0.5$ typically) is implemented following the primary dense layer to enforce feature independence and mitigate overfitting, which is critical given the model's high capacity.</w:t>
+        <w:t xml:space="preserve"> layer (p=0.5 typically) is implemented following the primary dense layer to enforce feature independence and mitigate overfitting, which is critical given the model's high capacity.</w:t>
       </w:r>
     </w:p>
     <w:p>
@@ -32059,16 +31913,14 @@
         </w:rPr>
         <w:t xml:space="preserve"> The network terminates in a 50-unit dense layer with a </w:t>
       </w:r>
-      <w:proofErr w:type="spellStart"/>
       <w:r>
         <w:rPr>
           <w:rFonts w:ascii="Times New Roman" w:eastAsia="Times New Roman" w:hAnsi="Times New Roman" w:cs="Times New Roman"/>
           <w:kern w:val="0"/>
           <w:lang w:eastAsia="en-US" w:bidi="ar-SA"/>
         </w:rPr>
-        <w:t>Softmax</w:t>
-      </w:r>
-      <w:proofErr w:type="spellEnd"/>
+        <w:t>SoftMax</w:t>
+      </w:r>
       <w:r>
         <w:rPr>
           <w:rFonts w:ascii="Times New Roman" w:eastAsia="Times New Roman" w:hAnsi="Times New Roman" w:cs="Times New Roman"/>
@@ -32080,15 +31932,23 @@
     </w:p>
     <w:p>
       <w:pPr>
-        <w:numPr>
-          <w:ilvl w:val="0"/>
-          <w:numId w:val="8"/>
-        </w:numPr>
-        <w:tabs>
-          <w:tab w:val="num" w:pos="360"/>
-        </w:tabs>
         <w:suppressAutoHyphens w:val="0"/>
         <w:spacing w:before="100" w:beforeAutospacing="1" w:after="100" w:afterAutospacing="1" w:line="480" w:lineRule="auto"/>
+        <w:rPr>
+          <w:rFonts w:ascii="Times New Roman" w:eastAsia="Times New Roman" w:hAnsi="Times New Roman" w:cs="Times New Roman"/>
+          <w:kern w:val="0"/>
+          <w:lang w:eastAsia="en-US" w:bidi="ar-SA"/>
+        </w:rPr>
+      </w:pPr>
+      <w:r>
+        <w:rPr>
+          <w:rFonts w:ascii="Times New Roman" w:eastAsia="Times New Roman" w:hAnsi="Times New Roman" w:cs="Times New Roman"/>
+          <w:kern w:val="0"/>
+          <w:lang w:eastAsia="en-US" w:bidi="ar-SA"/>
+        </w:rPr>
+        <w:t xml:space="preserve">The model is characterized by a high parametric complexity, totaling approximately </w:t>
+      </w:r>
+      <w:r>
         <w:rPr>
           <w:rFonts w:ascii="Times New Roman" w:eastAsia="Times New Roman" w:hAnsi="Times New Roman" w:cs="Times New Roman"/>
           <w:b/>
@@ -32096,7 +31956,16 @@
           <w:kern w:val="0"/>
           <w:lang w:eastAsia="en-US" w:bidi="ar-SA"/>
         </w:rPr>
-      </w:pPr>
+        <w:t>488 million trainable parameters</w:t>
+      </w:r>
+      <w:r>
+        <w:rPr>
+          <w:rFonts w:ascii="Times New Roman" w:eastAsia="Times New Roman" w:hAnsi="Times New Roman" w:cs="Times New Roman"/>
+          <w:kern w:val="0"/>
+          <w:lang w:eastAsia="en-US" w:bidi="ar-SA"/>
+        </w:rPr>
+        <w:t xml:space="preserve">. Over </w:t>
+      </w:r>
       <w:r>
         <w:rPr>
           <w:rFonts w:ascii="Times New Roman" w:eastAsia="Times New Roman" w:hAnsi="Times New Roman" w:cs="Times New Roman"/>
@@ -32105,37 +31974,23 @@
           <w:kern w:val="0"/>
           <w:lang w:eastAsia="en-US" w:bidi="ar-SA"/>
         </w:rPr>
-        <w:t>3.X.3 Computational Complexity</w:t>
-      </w:r>
-    </w:p>
-    <w:p>
-      <w:pPr>
-        <w:suppressAutoHyphens w:val="0"/>
-        <w:spacing w:before="100" w:beforeAutospacing="1" w:after="100" w:afterAutospacing="1" w:line="480" w:lineRule="auto"/>
+        <w:t>99.9%</w:t>
+      </w:r>
+      <w:r>
         <w:rPr>
           <w:rFonts w:ascii="Times New Roman" w:eastAsia="Times New Roman" w:hAnsi="Times New Roman" w:cs="Times New Roman"/>
           <w:kern w:val="0"/>
           <w:lang w:eastAsia="en-US" w:bidi="ar-SA"/>
         </w:rPr>
-      </w:pPr>
+        <w:t xml:space="preserve"> of these parameters ($487.7$ million) are localized in the single weight matrix connecting the flattened layer to the first dense layer. This indicates a model with immense capacity for learning complex latent representations, albeit requiring significant memory overhead (approx</w:t>
+      </w:r>
       <w:r>
         <w:rPr>
           <w:rFonts w:ascii="Times New Roman" w:eastAsia="Times New Roman" w:hAnsi="Times New Roman" w:cs="Times New Roman"/>
           <w:kern w:val="0"/>
           <w:lang w:eastAsia="en-US" w:bidi="ar-SA"/>
         </w:rPr>
-        <w:lastRenderedPageBreak/>
-        <w:t xml:space="preserve">The model is characterized by a high parametric complexity, totaling approximately </w:t>
-      </w:r>
-      <w:r>
-        <w:rPr>
-          <w:rFonts w:ascii="Times New Roman" w:eastAsia="Times New Roman" w:hAnsi="Times New Roman" w:cs="Times New Roman"/>
-          <w:b/>
-          <w:bCs/>
-          <w:kern w:val="0"/>
-          <w:lang w:eastAsia="en-US" w:bidi="ar-SA"/>
-        </w:rPr>
-        <w:t>488 million trainable parameters</w:t>
+        <w:t>imately</w:t>
       </w:r>
       <w:r>
         <w:rPr>
@@ -32143,43 +31998,7 @@
           <w:kern w:val="0"/>
           <w:lang w:eastAsia="en-US" w:bidi="ar-SA"/>
         </w:rPr>
-        <w:t xml:space="preserve">. Over </w:t>
-      </w:r>
-      <w:r>
-        <w:rPr>
-          <w:rFonts w:ascii="Times New Roman" w:eastAsia="Times New Roman" w:hAnsi="Times New Roman" w:cs="Times New Roman"/>
-          <w:b/>
-          <w:bCs/>
-          <w:kern w:val="0"/>
-          <w:lang w:eastAsia="en-US" w:bidi="ar-SA"/>
-        </w:rPr>
-        <w:t>99.9%</w:t>
-      </w:r>
-      <w:r>
-        <w:rPr>
-          <w:rFonts w:ascii="Times New Roman" w:eastAsia="Times New Roman" w:hAnsi="Times New Roman" w:cs="Times New Roman"/>
-          <w:kern w:val="0"/>
-          <w:lang w:eastAsia="en-US" w:bidi="ar-SA"/>
-        </w:rPr>
-        <w:t xml:space="preserve"> of these parameters ($487.7$ million) are localized in the single weight matrix connecting the flattened layer to the first dense layer. This indicates a model with immense capacity for learning complex latent representations, albeit requiring significant memory overhead ($\</w:t>
-      </w:r>
-      <w:proofErr w:type="spellStart"/>
-      <w:r>
-        <w:rPr>
-          <w:rFonts w:ascii="Times New Roman" w:eastAsia="Times New Roman" w:hAnsi="Times New Roman" w:cs="Times New Roman"/>
-          <w:kern w:val="0"/>
-          <w:lang w:eastAsia="en-US" w:bidi="ar-SA"/>
-        </w:rPr>
-        <w:t>approx</w:t>
-      </w:r>
-      <w:proofErr w:type="spellEnd"/>
-      <w:r>
-        <w:rPr>
-          <w:rFonts w:ascii="Times New Roman" w:eastAsia="Times New Roman" w:hAnsi="Times New Roman" w:cs="Times New Roman"/>
-          <w:kern w:val="0"/>
-          <w:lang w:eastAsia="en-US" w:bidi="ar-SA"/>
-        </w:rPr>
-        <w:t xml:space="preserve"> 1.82$ GB for weights).</w:t>
+        <w:t xml:space="preserve"> 1.82 GB for weights).</w:t>
       </w:r>
     </w:p>
     <w:p>
@@ -34642,8 +34461,13 @@
       <w:fldChar w:fldCharType="separate"/>
     </w:r>
     <w:r>
-      <w:t>viii</w:t>
+      <w:t>vii</w:t>
     </w:r>
+    <w:proofErr w:type="spellStart"/>
+    <w:r>
+      <w:t>i</w:t>
+    </w:r>
+    <w:proofErr w:type="spellEnd"/>
     <w:r>
       <w:fldChar w:fldCharType="end"/>
     </w:r>

</xml_diff>

<commit_message>
Working on the results and discussion
</commit_message>
<xml_diff>
--- a/mydocuments/Defence1/Sikolia_Thesis_Revision_5.docx
+++ b/mydocuments/Defence1/Sikolia_Thesis_Revision_5.docx
@@ -190,21 +190,7 @@
         <w:rPr>
           <w:rFonts w:ascii="Times New Roman" w:hAnsi="Times New Roman" w:cs="Times New Roman"/>
         </w:rPr>
-        <w:t xml:space="preserve">Wycliffe </w:t>
-      </w:r>
-      <w:proofErr w:type="spellStart"/>
-      <w:r>
-        <w:rPr>
-          <w:rFonts w:ascii="Times New Roman" w:hAnsi="Times New Roman" w:cs="Times New Roman"/>
-        </w:rPr>
-        <w:t>Atswenje</w:t>
-      </w:r>
-      <w:proofErr w:type="spellEnd"/>
-      <w:r>
-        <w:rPr>
-          <w:rFonts w:ascii="Times New Roman" w:hAnsi="Times New Roman" w:cs="Times New Roman"/>
-        </w:rPr>
-        <w:t xml:space="preserve"> Sikolia</w:t>
+        <w:t>Wycliffe Atswenje Sikolia</w:t>
       </w:r>
     </w:p>
     <w:p>
@@ -359,21 +345,7 @@
         <w:rPr>
           <w:rFonts w:ascii="Times New Roman" w:hAnsi="Times New Roman" w:cs="Times New Roman"/>
         </w:rPr>
-        <w:t xml:space="preserve">Wycliffe </w:t>
-      </w:r>
-      <w:proofErr w:type="spellStart"/>
-      <w:r>
-        <w:rPr>
-          <w:rFonts w:ascii="Times New Roman" w:hAnsi="Times New Roman" w:cs="Times New Roman"/>
-        </w:rPr>
-        <w:t>Atswenje</w:t>
-      </w:r>
-      <w:proofErr w:type="spellEnd"/>
-      <w:r>
-        <w:rPr>
-          <w:rFonts w:ascii="Times New Roman" w:hAnsi="Times New Roman" w:cs="Times New Roman"/>
-        </w:rPr>
-        <w:t xml:space="preserve"> Sikolia</w:t>
+        <w:t>Wycliffe Atswenje Sikolia</w:t>
       </w:r>
     </w:p>
     <w:p>
@@ -525,16 +497,8 @@
         <w:rPr>
           <w:rFonts w:ascii="Times New Roman" w:hAnsi="Times New Roman" w:cs="Times New Roman"/>
         </w:rPr>
-        <w:t xml:space="preserve">Dr. Jane </w:t>
-      </w:r>
-      <w:proofErr w:type="spellStart"/>
-      <w:r>
-        <w:rPr>
-          <w:rFonts w:ascii="Times New Roman" w:hAnsi="Times New Roman" w:cs="Times New Roman"/>
-        </w:rPr>
-        <w:t>Aduda</w:t>
-      </w:r>
-      <w:proofErr w:type="spellEnd"/>
+        <w:t>Dr. Jane Aduda</w:t>
+      </w:r>
     </w:p>
     <w:p>
       <w:pPr>
@@ -779,21 +743,7 @@
         <w:rPr>
           <w:rFonts w:ascii="Times New Roman" w:hAnsi="Times New Roman" w:cs="Times New Roman"/>
         </w:rPr>
-        <w:t xml:space="preserve">Special regards to my supervisors Dr. Anthony Kibira Wanjoya and Dr. Jane </w:t>
-      </w:r>
-      <w:proofErr w:type="spellStart"/>
-      <w:r>
-        <w:rPr>
-          <w:rFonts w:ascii="Times New Roman" w:hAnsi="Times New Roman" w:cs="Times New Roman"/>
-        </w:rPr>
-        <w:t>Aduda</w:t>
-      </w:r>
-      <w:proofErr w:type="spellEnd"/>
-      <w:r>
-        <w:rPr>
-          <w:rFonts w:ascii="Times New Roman" w:hAnsi="Times New Roman" w:cs="Times New Roman"/>
-        </w:rPr>
-        <w:t xml:space="preserve"> for their guidance and relentless criticism on this work. Their continuous support, insightful comments, and demand for excellence have played a crucial role in this work. I am particularly grateful to my father whose moral support has been instrumental in my studies. My friends and family have also helped during the course of my studies by reminding me of the need to focus and complete my studies, which is the reason I got this far. Their words of positive affirmation gave me a shoulder to lean on when the going got difficult. I would also like to thank members of the department of statistics and actuarial sciences from the Jomo Kenyatta University of Agriculture and Technology for their support in my studies. Most importantly I would like to thank the almighty God </w:t>
+        <w:t xml:space="preserve">Special regards to my supervisors Dr. Anthony Kibira Wanjoya and Dr. Jane Aduda for their guidance and relentless criticism on this work. Their continuous support, insightful comments, and demand for excellence have played a crucial role in this work. I am particularly grateful to my father whose moral support has been instrumental in my studies. My friends and family have also helped during the course of my studies by reminding me of the need to focus and complete my studies, which is the reason I got this far. Their words of positive affirmation gave me a shoulder to lean on when the going got difficult. I would also like to thank members of the department of statistics and actuarial sciences from the Jomo Kenyatta University of Agriculture and Technology for their support in my studies. Most importantly I would like to thank the almighty God </w:t>
       </w:r>
       <w:r>
         <w:rPr>
@@ -974,21 +924,7 @@
         <w:rPr>
           <w:rFonts w:ascii="Times New Roman" w:hAnsi="Times New Roman" w:cs="Times New Roman"/>
         </w:rPr>
-        <w:t xml:space="preserve">conduct a case study at </w:t>
-      </w:r>
-      <w:proofErr w:type="spellStart"/>
-      <w:r>
-        <w:rPr>
-          <w:rFonts w:ascii="Times New Roman" w:hAnsi="Times New Roman" w:cs="Times New Roman"/>
-        </w:rPr>
-        <w:t>Samasource</w:t>
-      </w:r>
-      <w:proofErr w:type="spellEnd"/>
-      <w:r>
-        <w:rPr>
-          <w:rFonts w:ascii="Times New Roman" w:hAnsi="Times New Roman" w:cs="Times New Roman"/>
-        </w:rPr>
-        <w:t xml:space="preserve"> Kenya Limited using </w:t>
+        <w:t xml:space="preserve">conduct a case study at Samasource Kenya Limited using </w:t>
       </w:r>
       <w:r>
         <w:rPr>
@@ -5757,14 +5693,7 @@
         <w:rPr>
           <w:rFonts w:ascii="Times New Roman" w:hAnsi="Times New Roman" w:cs="Times New Roman"/>
         </w:rPr>
-        <w:t>……………………………</w:t>
-      </w:r>
-      <w:proofErr w:type="gramStart"/>
-      <w:r>
-        <w:rPr>
-          <w:rFonts w:ascii="Times New Roman" w:hAnsi="Times New Roman" w:cs="Times New Roman"/>
-        </w:rPr>
-        <w:t>…</w:t>
+        <w:t>………………………………</w:t>
       </w:r>
       <w:r>
         <w:rPr>
@@ -5772,7 +5701,6 @@
         </w:rPr>
         <w:t>..</w:t>
       </w:r>
-      <w:proofErr w:type="gramEnd"/>
       <w:r>
         <w:rPr>
           <w:rFonts w:ascii="Times New Roman" w:hAnsi="Times New Roman" w:cs="Times New Roman"/>
@@ -5810,14 +5738,12 @@
         </w:rPr>
         <w:t>……………………………</w:t>
       </w:r>
-      <w:proofErr w:type="gramStart"/>
       <w:r>
         <w:rPr>
           <w:rFonts w:ascii="Times New Roman" w:hAnsi="Times New Roman" w:cs="Times New Roman"/>
         </w:rPr>
         <w:t>…..</w:t>
       </w:r>
-      <w:proofErr w:type="gramEnd"/>
       <w:r>
         <w:rPr>
           <w:rFonts w:ascii="Times New Roman" w:hAnsi="Times New Roman" w:cs="Times New Roman"/>
@@ -6198,21 +6124,7 @@
         </w:rPr>
         <w:lastRenderedPageBreak/>
         <w:tab/>
-        <w:t xml:space="preserve">Indeed, huge technology companies such as Google and Apple have developed world class applications that have enabled them to enjoy a competitive advantage over other companies.  These data science applications (from Google and Apple) have been made possible by techniques such as support vector machines, random forests, decision trees, and neural networks. The term neural network refers to a connection of layers composed of units called </w:t>
-      </w:r>
-      <w:proofErr w:type="spellStart"/>
-      <w:r>
-        <w:rPr>
-          <w:rFonts w:ascii="Times New Roman" w:hAnsi="Times New Roman" w:cs="Times New Roman"/>
-        </w:rPr>
-        <w:t>perceptrons</w:t>
-      </w:r>
-      <w:proofErr w:type="spellEnd"/>
-      <w:r>
-        <w:rPr>
-          <w:rFonts w:ascii="Times New Roman" w:hAnsi="Times New Roman" w:cs="Times New Roman"/>
-        </w:rPr>
-        <w:t xml:space="preserve">, which is made up of an input layer (the predictor variables), a processing unit, and an output layer (the response variable). The processing unit could comprise one or more hidden layers. That said, deep learning occurs when a neural network is created with more than one hidden layer. Having defined deep learning, it is imperative to highlight that decision trees and support vector machines were more famous than neural networks. However, the neural networks were brought to fame when Geoffrey Hinton et al (2006) developed a neural network that predicted handwritten digits with an accuracy of 98%. </w:t>
+        <w:t xml:space="preserve">Indeed, huge technology companies such as Google and Apple have developed world class applications that have enabled them to enjoy a competitive advantage over other companies.  These data science applications (from Google and Apple) have been made possible by techniques such as support vector machines, random forests, decision trees, and neural networks. The term neural network refers to a connection of layers composed of units called perceptrons, which is made up of an input layer (the predictor variables), a processing unit, and an output layer (the response variable). The processing unit could comprise one or more hidden layers. That said, deep learning occurs when a neural network is created with more than one hidden layer. Having defined deep learning, it is imperative to highlight that decision trees and support vector machines were more famous than neural networks. However, the neural networks were brought to fame when Geoffrey Hinton et al (2006) developed a neural network that predicted handwritten digits with an accuracy of 98%. </w:t>
       </w:r>
     </w:p>
     <w:p>
@@ -6257,49 +6169,7 @@
           <w:rFonts w:ascii="Times New Roman" w:hAnsi="Times New Roman" w:cs="Times New Roman"/>
         </w:rPr>
         <w:tab/>
-        <w:t xml:space="preserve">Researchers in facial recognition have developed solutions such as </w:t>
-      </w:r>
-      <w:proofErr w:type="spellStart"/>
-      <w:r>
-        <w:rPr>
-          <w:rFonts w:ascii="Times New Roman" w:hAnsi="Times New Roman" w:cs="Times New Roman"/>
-        </w:rPr>
-        <w:t>FaceNet</w:t>
-      </w:r>
-      <w:proofErr w:type="spellEnd"/>
-      <w:r>
-        <w:rPr>
-          <w:rFonts w:ascii="Times New Roman" w:hAnsi="Times New Roman" w:cs="Times New Roman"/>
-        </w:rPr>
-        <w:t xml:space="preserve">, VGGFACE, VGG16, VGG19, </w:t>
-      </w:r>
-      <w:proofErr w:type="spellStart"/>
-      <w:r>
-        <w:rPr>
-          <w:rFonts w:ascii="Times New Roman" w:hAnsi="Times New Roman" w:cs="Times New Roman"/>
-        </w:rPr>
-        <w:t>OpenFace</w:t>
-      </w:r>
-      <w:proofErr w:type="spellEnd"/>
-      <w:r>
-        <w:rPr>
-          <w:rFonts w:ascii="Times New Roman" w:hAnsi="Times New Roman" w:cs="Times New Roman"/>
-        </w:rPr>
-        <w:t xml:space="preserve">, and </w:t>
-      </w:r>
-      <w:proofErr w:type="spellStart"/>
-      <w:r>
-        <w:rPr>
-          <w:rFonts w:ascii="Times New Roman" w:hAnsi="Times New Roman" w:cs="Times New Roman"/>
-        </w:rPr>
-        <w:t>DeepFace</w:t>
-      </w:r>
-      <w:proofErr w:type="spellEnd"/>
-      <w:r>
-        <w:rPr>
-          <w:rFonts w:ascii="Times New Roman" w:hAnsi="Times New Roman" w:cs="Times New Roman"/>
-        </w:rPr>
-        <w:t xml:space="preserve">. Even though existing solutions on facial recognition </w:t>
+        <w:t xml:space="preserve">Researchers in facial recognition have developed solutions such as FaceNet, VGGFACE, VGG16, VGG19, OpenFace, and DeepFace. Even though existing solutions on facial recognition </w:t>
       </w:r>
       <w:r>
         <w:rPr>
@@ -6336,16 +6206,8 @@
         <w:rPr>
           <w:rFonts w:ascii="Times New Roman" w:hAnsi="Times New Roman" w:cs="Times New Roman"/>
         </w:rPr>
-        <w:t xml:space="preserve">at </w:t>
-      </w:r>
-      <w:proofErr w:type="spellStart"/>
-      <w:r>
-        <w:rPr>
-          <w:rFonts w:ascii="Times New Roman" w:hAnsi="Times New Roman" w:cs="Times New Roman"/>
-        </w:rPr>
-        <w:t>Samasource</w:t>
-      </w:r>
-      <w:proofErr w:type="spellEnd"/>
+        <w:t>at Samasource</w:t>
+      </w:r>
       <w:r>
         <w:rPr>
           <w:rFonts w:ascii="Times New Roman" w:hAnsi="Times New Roman" w:cs="Times New Roman"/>
@@ -6746,35 +6608,7 @@
         <w:rPr>
           <w:rFonts w:ascii="Times New Roman" w:hAnsi="Times New Roman" w:cs="Times New Roman"/>
         </w:rPr>
-        <w:t xml:space="preserve">2002). It is important to highlight that there are several methods that could be used for detecting faces from images. These methods include </w:t>
-      </w:r>
-      <w:proofErr w:type="gramStart"/>
-      <w:r>
-        <w:rPr>
-          <w:rFonts w:ascii="Times New Roman" w:hAnsi="Times New Roman" w:cs="Times New Roman"/>
-        </w:rPr>
-        <w:t>knowledge based</w:t>
-      </w:r>
-      <w:proofErr w:type="gramEnd"/>
-      <w:r>
-        <w:rPr>
-          <w:rFonts w:ascii="Times New Roman" w:hAnsi="Times New Roman" w:cs="Times New Roman"/>
-        </w:rPr>
-        <w:t xml:space="preserve"> methods, feature invariant approaches, template matching methods, and </w:t>
-      </w:r>
-      <w:proofErr w:type="gramStart"/>
-      <w:r>
-        <w:rPr>
-          <w:rFonts w:ascii="Times New Roman" w:hAnsi="Times New Roman" w:cs="Times New Roman"/>
-        </w:rPr>
-        <w:t>appearance based</w:t>
-      </w:r>
-      <w:proofErr w:type="gramEnd"/>
-      <w:r>
-        <w:rPr>
-          <w:rFonts w:ascii="Times New Roman" w:hAnsi="Times New Roman" w:cs="Times New Roman"/>
-        </w:rPr>
-        <w:t xml:space="preserve"> methods. Indeed, the mentioned methods are important when detecting faces from images, but all these methods are accompanied by several challenges. This owes to the reality that Yang </w:t>
+        <w:t xml:space="preserve">2002). It is important to highlight that there are several methods that could be used for detecting faces from images. These methods include knowledge based methods, feature invariant approaches, template matching methods, and appearance based methods. Indeed, the mentioned methods are important when detecting faces from images, but all these methods are accompanied by several challenges. This owes to the reality that Yang </w:t>
       </w:r>
       <w:r>
         <w:rPr>
@@ -6911,21 +6745,7 @@
         <w:rPr>
           <w:rFonts w:ascii="Times New Roman" w:hAnsi="Times New Roman" w:cs="Times New Roman"/>
         </w:rPr>
-        <w:t xml:space="preserve">A huge chunk of solutions in computer vision make the assumption that there is a single illuminant lighting in an image. Regardless, that is not always the case. As evidenced, Finlayson and </w:t>
-      </w:r>
-      <w:proofErr w:type="spellStart"/>
-      <w:r>
-        <w:rPr>
-          <w:rFonts w:ascii="Times New Roman" w:hAnsi="Times New Roman" w:cs="Times New Roman"/>
-        </w:rPr>
-        <w:t>Fredembach</w:t>
-      </w:r>
-      <w:proofErr w:type="spellEnd"/>
-      <w:r>
-        <w:rPr>
-          <w:rFonts w:ascii="Times New Roman" w:hAnsi="Times New Roman" w:cs="Times New Roman"/>
-        </w:rPr>
-        <w:t xml:space="preserve"> (2007) reveal that images always contain shadows depending on the positions from different lights that affect an image. Important to the debate is the truth that Finlayson (2018) proposes a solution to the problems arising from illumination in computer vision.</w:t>
+        <w:t>A huge chunk of solutions in computer vision make the assumption that there is a single illuminant lighting in an image. Regardless, that is not always the case. As evidenced, Finlayson and Fredembach (2007) reveal that images always contain shadows depending on the positions from different lights that affect an image. Important to the debate is the truth that Finlayson (2018) proposes a solution to the problems arising from illumination in computer vision.</w:t>
       </w:r>
     </w:p>
     <w:p>
@@ -6966,21 +6786,7 @@
           <w:rFonts w:ascii="Times New Roman" w:hAnsi="Times New Roman" w:cs="Times New Roman"/>
         </w:rPr>
         <w:tab/>
-        <w:t xml:space="preserve">This method relies on a set of rules to detect whether there is a human face in an image. The method captures the human knowledge of faces and interprets the knowledge into a set of rules. For instance, the face has two symmetric eyes; the eye areas are darker than the cheeks, the distance between eyes, and the difference in colors between the eyes and cheeks. It is notable that using the knowledge base method for face detection could be difficult because it is difficult to develop a set of rules that can correctly identify a human face. This owes to the fact that there could be very many false positives if the rules are too general. Likewise, there could be many false negatives if the rules are too strict. This drawback has hampered researchers from using this technique. However, Chen et al., (2001) used the </w:t>
-      </w:r>
-      <w:proofErr w:type="gramStart"/>
-      <w:r>
-        <w:rPr>
-          <w:rFonts w:ascii="Times New Roman" w:hAnsi="Times New Roman" w:cs="Times New Roman"/>
-        </w:rPr>
-        <w:t>knowledge based</w:t>
-      </w:r>
-      <w:proofErr w:type="gramEnd"/>
-      <w:r>
-        <w:rPr>
-          <w:rFonts w:ascii="Times New Roman" w:hAnsi="Times New Roman" w:cs="Times New Roman"/>
-        </w:rPr>
-        <w:t xml:space="preserve"> method to detect faces in an image with an accuracy of 94%. One disadvantage with this method is that it is not efficient.</w:t>
+        <w:t>This method relies on a set of rules to detect whether there is a human face in an image. The method captures the human knowledge of faces and interprets the knowledge into a set of rules. For instance, the face has two symmetric eyes; the eye areas are darker than the cheeks, the distance between eyes, and the difference in colors between the eyes and cheeks. It is notable that using the knowledge base method for face detection could be difficult because it is difficult to develop a set of rules that can correctly identify a human face. This owes to the fact that there could be very many false positives if the rules are too general. Likewise, there could be many false negatives if the rules are too strict. This drawback has hampered researchers from using this technique. However, Chen et al., (2001) used the knowledge based method to detect faces in an image with an accuracy of 94%. One disadvantage with this method is that it is not efficient.</w:t>
       </w:r>
     </w:p>
     <w:p>
@@ -7009,30 +6815,8 @@
           <w:rFonts w:ascii="Times New Roman" w:hAnsi="Times New Roman" w:cs="Times New Roman"/>
         </w:rPr>
         <w:tab/>
-        <w:t xml:space="preserve">The feature invariant method of face detection is a little bit different from the </w:t>
-      </w:r>
-      <w:proofErr w:type="spellStart"/>
-      <w:r>
-        <w:rPr>
-          <w:rFonts w:ascii="Times New Roman" w:hAnsi="Times New Roman" w:cs="Times New Roman"/>
-        </w:rPr>
-        <w:t>knowedge</w:t>
-      </w:r>
-      <w:proofErr w:type="spellEnd"/>
-      <w:r>
-        <w:rPr>
-          <w:rFonts w:ascii="Times New Roman" w:hAnsi="Times New Roman" w:cs="Times New Roman"/>
-        </w:rPr>
-        <w:t xml:space="preserve"> based method because it uses statistical methods on facial landmarks. </w:t>
-      </w:r>
-      <w:proofErr w:type="spellStart"/>
-      <w:r>
-        <w:rPr>
-          <w:rFonts w:ascii="Times New Roman" w:hAnsi="Times New Roman" w:cs="Times New Roman"/>
-        </w:rPr>
-        <w:t>Celiktutan</w:t>
-      </w:r>
-      <w:proofErr w:type="spellEnd"/>
+        <w:t>The feature invariant method of face detection is a little bit different from the knowedge based method because it uses statistical methods on facial landmarks. Celiktutan</w:t>
+      </w:r>
       <w:r>
         <w:rPr>
           <w:rFonts w:ascii="Times New Roman" w:hAnsi="Times New Roman" w:cs="Times New Roman"/>
@@ -7043,35 +6827,7 @@
         <w:rPr>
           <w:rFonts w:ascii="Times New Roman" w:hAnsi="Times New Roman" w:cs="Times New Roman"/>
         </w:rPr>
-        <w:t xml:space="preserve"> (2013) define a face landmark as a prominent feature that can play a discriminative role or can serve as anchor points in face detection. Examples of such landmarks include the eye corners, the nose tip, nostril corners, mouth corners, end points of eyebrow arcs, ear lobes, and the chin. This approach works by detecting facial landmarks, texture and skin color before using a statistical model to identify the presence of a face in an image. Critical to the discussion is the reality that different authors have used the feature invariant approach for face detection. For instance, Kapil and Jain (2013) compared texture based to the structure and </w:t>
-      </w:r>
-      <w:proofErr w:type="gramStart"/>
-      <w:r>
-        <w:rPr>
-          <w:rFonts w:ascii="Times New Roman" w:hAnsi="Times New Roman" w:cs="Times New Roman"/>
-        </w:rPr>
-        <w:t>shape based</w:t>
-      </w:r>
-      <w:proofErr w:type="gramEnd"/>
-      <w:r>
-        <w:rPr>
-          <w:rFonts w:ascii="Times New Roman" w:hAnsi="Times New Roman" w:cs="Times New Roman"/>
-        </w:rPr>
-        <w:t xml:space="preserve"> feature invariant based methods and concluded that the </w:t>
-      </w:r>
-      <w:proofErr w:type="gramStart"/>
-      <w:r>
-        <w:rPr>
-          <w:rFonts w:ascii="Times New Roman" w:hAnsi="Times New Roman" w:cs="Times New Roman"/>
-        </w:rPr>
-        <w:t>texture based</w:t>
-      </w:r>
-      <w:proofErr w:type="gramEnd"/>
-      <w:r>
-        <w:rPr>
-          <w:rFonts w:ascii="Times New Roman" w:hAnsi="Times New Roman" w:cs="Times New Roman"/>
-        </w:rPr>
-        <w:t xml:space="preserve"> method is more accurate. However, the authors argue that feature invariant based methods are computationally expensive.</w:t>
+        <w:t xml:space="preserve"> (2013) define a face landmark as a prominent feature that can play a discriminative role or can serve as anchor points in face detection. Examples of such landmarks include the eye corners, the nose tip, nostril corners, mouth corners, end points of eyebrow arcs, ear lobes, and the chin. This approach works by detecting facial landmarks, texture and skin color before using a statistical model to identify the presence of a face in an image. Critical to the discussion is the reality that different authors have used the feature invariant approach for face detection. For instance, Kapil and Jain (2013) compared texture based to the structure and shape based feature invariant based methods and concluded that the texture based method is more accurate. However, the authors argue that feature invariant based methods are computationally expensive.</w:t>
       </w:r>
     </w:p>
     <w:p>
@@ -7102,35 +6858,7 @@
           <w:rFonts w:ascii="Times New Roman" w:hAnsi="Times New Roman" w:cs="Times New Roman"/>
         </w:rPr>
         <w:tab/>
-        <w:t xml:space="preserve">This method functions to extract facial image features to gain the Euclidean distance value served as input face comparison value of the users’ faces stored in the database (Hidayat, Wibowo, Satria, </w:t>
-      </w:r>
-      <w:proofErr w:type="spellStart"/>
-      <w:r>
-        <w:rPr>
-          <w:rFonts w:ascii="Times New Roman" w:hAnsi="Times New Roman" w:cs="Times New Roman"/>
-        </w:rPr>
-        <w:t>Winursito</w:t>
-      </w:r>
-      <w:proofErr w:type="spellEnd"/>
-      <w:r>
-        <w:rPr>
-          <w:rFonts w:ascii="Times New Roman" w:hAnsi="Times New Roman" w:cs="Times New Roman"/>
-        </w:rPr>
-        <w:t xml:space="preserve">, 2021). Simply put, the </w:t>
-      </w:r>
-      <w:proofErr w:type="gramStart"/>
-      <w:r>
-        <w:rPr>
-          <w:rFonts w:ascii="Times New Roman" w:hAnsi="Times New Roman" w:cs="Times New Roman"/>
-        </w:rPr>
-        <w:t>template based</w:t>
-      </w:r>
-      <w:proofErr w:type="gramEnd"/>
-      <w:r>
-        <w:rPr>
-          <w:rFonts w:ascii="Times New Roman" w:hAnsi="Times New Roman" w:cs="Times New Roman"/>
-        </w:rPr>
-        <w:t xml:space="preserve"> approach transforms an image into geometric primitives like curves and points. This is done by identifying distinctive features like the eye, the nose, the chin, and the mouth before measuring their relative positions, widths and other parameters of the distinctive features. Features extracted from an image are then compared to known features of a human face to check whether an image is that of a human face. For further elucidation the eye, nose, mouth and the chin are compared to that of a human face. If the features obtained from the image match those of a human face, then the object in question is declared to be a human face. It is vital to note that Hidayat, et al., (2021) assert that the template approach of facial recognition is known to have a lighter computational load than other methods because it does not require features from the entire face. </w:t>
+        <w:t xml:space="preserve">This method functions to extract facial image features to gain the Euclidean distance value served as input face comparison value of the users’ faces stored in the database (Hidayat, Wibowo, Satria, Winursito, 2021). Simply put, the template based approach transforms an image into geometric primitives like curves and points. This is done by identifying distinctive features like the eye, the nose, the chin, and the mouth before measuring their relative positions, widths and other parameters of the distinctive features. Features extracted from an image are then compared to known features of a human face to check whether an image is that of a human face. For further elucidation the eye, nose, mouth and the chin are compared to that of a human face. If the features obtained from the image match those of a human face, then the object in question is declared to be a human face. It is vital to note that Hidayat, et al., (2021) assert that the template approach of facial recognition is known to have a lighter computational load than other methods because it does not require features from the entire face. </w:t>
       </w:r>
     </w:p>
     <w:p>
@@ -7159,56 +6887,7 @@
         </w:rPr>
         <w:lastRenderedPageBreak/>
         <w:tab/>
-        <w:t xml:space="preserve">The idea behind using Appearance methods for face detection relies on the linear algebra concept of subspaces. This approach of facial detection relies on the entire face, which is taken in as an input image data. The data collected from the input image is processed into a </w:t>
-      </w:r>
-      <w:proofErr w:type="gramStart"/>
-      <w:r>
-        <w:rPr>
-          <w:rFonts w:ascii="Times New Roman" w:hAnsi="Times New Roman" w:cs="Times New Roman"/>
-        </w:rPr>
-        <w:t>two dimensional</w:t>
-      </w:r>
-      <w:proofErr w:type="gramEnd"/>
-      <w:r>
-        <w:rPr>
-          <w:rFonts w:ascii="Times New Roman" w:hAnsi="Times New Roman" w:cs="Times New Roman"/>
-        </w:rPr>
-        <w:t xml:space="preserve"> pattern that is later used to decide whether there is a human face in an image. Critical to the discussion is the fact that this technique finds the best facial features because it rejects redundant information and keeps important information. Vital to the discussion is the fact that different authors have used the </w:t>
-      </w:r>
-      <w:proofErr w:type="gramStart"/>
-      <w:r>
-        <w:rPr>
-          <w:rFonts w:ascii="Times New Roman" w:hAnsi="Times New Roman" w:cs="Times New Roman"/>
-        </w:rPr>
-        <w:t>appearance based</w:t>
-      </w:r>
-      <w:proofErr w:type="gramEnd"/>
-      <w:r>
-        <w:rPr>
-          <w:rFonts w:ascii="Times New Roman" w:hAnsi="Times New Roman" w:cs="Times New Roman"/>
-        </w:rPr>
-        <w:t xml:space="preserve"> technique successfully. For example, Rusia and Singh (2023) used the </w:t>
-      </w:r>
-      <w:proofErr w:type="gramStart"/>
-      <w:r>
-        <w:rPr>
-          <w:rFonts w:ascii="Times New Roman" w:hAnsi="Times New Roman" w:cs="Times New Roman"/>
-        </w:rPr>
-        <w:t>appearance based</w:t>
-      </w:r>
-      <w:proofErr w:type="gramEnd"/>
-      <w:r>
-        <w:rPr>
-          <w:rFonts w:ascii="Times New Roman" w:hAnsi="Times New Roman" w:cs="Times New Roman"/>
-        </w:rPr>
-        <w:t xml:space="preserve"> technique of facial recognition and examined some of the face identity threats faced by this technique. Regardless, Yan et al., (2018) argues that </w:t>
-      </w:r>
-      <w:proofErr w:type="gramStart"/>
-      <w:r>
-        <w:rPr>
-          <w:rFonts w:ascii="Times New Roman" w:hAnsi="Times New Roman" w:cs="Times New Roman"/>
-        </w:rPr>
-        <w:t>appearance</w:t>
+        <w:t>The idea behind using Appearance methods for face detection relies on the linear algebra concept of subspaces. This approach of facial detection relies on the entire face, which is taken in as an input image data. The data collected from the input image is processed into a two dimensional pattern that is later used to decide whether there is a human face in an image. Critical to the discussion is the fact that this technique finds the best facial features because it rejects redundant information and keeps important information. Vital to the discussion is the fact that different authors have used the appearance based technique successfully. For example, Rusia and Singh (2023) used the appearance based technique of facial recognition and examined some of the face identity threats faced by this technique. Regardless, Yan et al., (2018) argues that appearance</w:t>
       </w:r>
       <w:r>
         <w:rPr>
@@ -7220,14 +6899,7 @@
         <w:rPr>
           <w:rFonts w:ascii="Times New Roman" w:hAnsi="Times New Roman" w:cs="Times New Roman"/>
         </w:rPr>
-        <w:t>based</w:t>
-      </w:r>
-      <w:proofErr w:type="gramEnd"/>
-      <w:r>
-        <w:rPr>
-          <w:rFonts w:ascii="Times New Roman" w:hAnsi="Times New Roman" w:cs="Times New Roman"/>
-        </w:rPr>
-        <w:t xml:space="preserve"> methods are computationally expensive and have difficulty handling substantial amounts of facial variations. </w:t>
+        <w:t xml:space="preserve">based methods are computationally expensive and have difficulty handling substantial amounts of facial variations. </w:t>
       </w:r>
     </w:p>
     <w:p>
@@ -7253,49 +6925,7 @@
           <w:rFonts w:ascii="Times New Roman" w:hAnsi="Times New Roman" w:cs="Times New Roman"/>
         </w:rPr>
         <w:tab/>
-        <w:t xml:space="preserve">As already mentioned, facial recognition is a two-step process with the first face being the face detection and the second step being the face identification step. The face identification phase is where facial characteristics are extracted from a detected face and compared to a known face to confirm if the facial characteristics match those of the known face. Evidence from literature suggests that the template approach and the </w:t>
-      </w:r>
-      <w:proofErr w:type="gramStart"/>
-      <w:r>
-        <w:rPr>
-          <w:rFonts w:ascii="Times New Roman" w:hAnsi="Times New Roman" w:cs="Times New Roman"/>
-        </w:rPr>
-        <w:t>appearance based</w:t>
-      </w:r>
-      <w:proofErr w:type="gramEnd"/>
-      <w:r>
-        <w:rPr>
-          <w:rFonts w:ascii="Times New Roman" w:hAnsi="Times New Roman" w:cs="Times New Roman"/>
-        </w:rPr>
-        <w:t xml:space="preserve"> approaches are not only used in face detection but could also be used in face identification. As evidenced, Proyecto (2010) discusses template matching and the </w:t>
-      </w:r>
-      <w:proofErr w:type="gramStart"/>
-      <w:r>
-        <w:rPr>
-          <w:rFonts w:ascii="Times New Roman" w:hAnsi="Times New Roman" w:cs="Times New Roman"/>
-        </w:rPr>
-        <w:t>appearance based</w:t>
-      </w:r>
-      <w:proofErr w:type="gramEnd"/>
-      <w:r>
-        <w:rPr>
-          <w:rFonts w:ascii="Times New Roman" w:hAnsi="Times New Roman" w:cs="Times New Roman"/>
-        </w:rPr>
-        <w:t xml:space="preserve"> technique in both face detection and face identification. It is important to highlight that different publications on techniques that are used in face identification exist.  Apart from template matching and </w:t>
-      </w:r>
-      <w:proofErr w:type="gramStart"/>
-      <w:r>
-        <w:rPr>
-          <w:rFonts w:ascii="Times New Roman" w:hAnsi="Times New Roman" w:cs="Times New Roman"/>
-        </w:rPr>
-        <w:t>appearance based</w:t>
-      </w:r>
-      <w:proofErr w:type="gramEnd"/>
-      <w:r>
-        <w:rPr>
-          <w:rFonts w:ascii="Times New Roman" w:hAnsi="Times New Roman" w:cs="Times New Roman"/>
-        </w:rPr>
-        <w:t xml:space="preserve"> methods, statistical approaches are also used in face identification.</w:t>
+        <w:t>As already mentioned, facial recognition is a two-step process with the first face being the face detection and the second step being the face identification step. The face identification phase is where facial characteristics are extracted from a detected face and compared to a known face to confirm if the facial characteristics match those of the known face. Evidence from literature suggests that the template approach and the appearance based approaches are not only used in face detection but could also be used in face identification. As evidenced, Proyecto (2010) discusses template matching and the appearance based technique in both face detection and face identification. It is important to highlight that different publications on techniques that are used in face identification exist.  Apart from template matching and appearance based methods, statistical approaches are also used in face identification.</w:t>
       </w:r>
     </w:p>
     <w:p>
@@ -7526,105 +7156,7 @@
           <w:rFonts w:ascii="Times New Roman" w:hAnsi="Times New Roman" w:cs="Times New Roman"/>
         </w:rPr>
         <w:tab/>
-        <w:t xml:space="preserve">It is imperative to mention that several authors have investigated the </w:t>
-      </w:r>
-      <w:proofErr w:type="gramStart"/>
-      <w:r>
-        <w:rPr>
-          <w:rFonts w:ascii="Times New Roman" w:hAnsi="Times New Roman" w:cs="Times New Roman"/>
-        </w:rPr>
-        <w:t>appearance based</w:t>
-      </w:r>
-      <w:proofErr w:type="gramEnd"/>
-      <w:r>
-        <w:rPr>
-          <w:rFonts w:ascii="Times New Roman" w:hAnsi="Times New Roman" w:cs="Times New Roman"/>
-        </w:rPr>
-        <w:t xml:space="preserve"> method for facial recognition. For instance, </w:t>
-      </w:r>
-      <w:proofErr w:type="spellStart"/>
-      <w:r>
-        <w:rPr>
-          <w:rFonts w:ascii="Times New Roman" w:hAnsi="Times New Roman" w:cs="Times New Roman"/>
-        </w:rPr>
-        <w:t>Struc</w:t>
-      </w:r>
-      <w:proofErr w:type="spellEnd"/>
-      <w:r>
-        <w:rPr>
-          <w:rFonts w:ascii="Times New Roman" w:hAnsi="Times New Roman" w:cs="Times New Roman"/>
-        </w:rPr>
-        <w:t xml:space="preserve"> and </w:t>
-      </w:r>
-      <w:proofErr w:type="spellStart"/>
-      <w:r>
-        <w:rPr>
-          <w:rFonts w:ascii="Times New Roman" w:hAnsi="Times New Roman" w:cs="Times New Roman"/>
-        </w:rPr>
-        <w:t>Pavesic</w:t>
-      </w:r>
-      <w:proofErr w:type="spellEnd"/>
-      <w:r>
-        <w:rPr>
-          <w:rFonts w:ascii="Times New Roman" w:hAnsi="Times New Roman" w:cs="Times New Roman"/>
-        </w:rPr>
-        <w:t xml:space="preserve"> (2009) examine the performance of </w:t>
-      </w:r>
-      <w:proofErr w:type="gramStart"/>
-      <w:r>
-        <w:rPr>
-          <w:rFonts w:ascii="Times New Roman" w:hAnsi="Times New Roman" w:cs="Times New Roman"/>
-        </w:rPr>
-        <w:t>appearance based</w:t>
-      </w:r>
-      <w:proofErr w:type="gramEnd"/>
-      <w:r>
-        <w:rPr>
-          <w:rFonts w:ascii="Times New Roman" w:hAnsi="Times New Roman" w:cs="Times New Roman"/>
-        </w:rPr>
-        <w:t xml:space="preserve"> methods subject to different environmental factors and conclude that the linear discriminant analysis produces the best results across different environmental conditions. Wu et al., (2018) also debate </w:t>
-      </w:r>
-      <w:proofErr w:type="gramStart"/>
-      <w:r>
-        <w:rPr>
-          <w:rFonts w:ascii="Times New Roman" w:hAnsi="Times New Roman" w:cs="Times New Roman"/>
-        </w:rPr>
-        <w:t>appearance based</w:t>
-      </w:r>
-      <w:proofErr w:type="gramEnd"/>
-      <w:r>
-        <w:rPr>
-          <w:rFonts w:ascii="Times New Roman" w:hAnsi="Times New Roman" w:cs="Times New Roman"/>
-        </w:rPr>
-        <w:t xml:space="preserve"> methods of facial recognition by examining facial expressions using the technique in question. The authors controlled for lighting conditions using a histogram equalization technique and a brightness preserving technique and concluded that the brightness preserving technique performs better than the histogram equalization technique. </w:t>
-      </w:r>
-      <w:proofErr w:type="spellStart"/>
-      <w:r>
-        <w:rPr>
-          <w:rFonts w:ascii="Times New Roman" w:hAnsi="Times New Roman" w:cs="Times New Roman"/>
-        </w:rPr>
-        <w:t>Broti</w:t>
-      </w:r>
-      <w:proofErr w:type="spellEnd"/>
-      <w:r>
-        <w:rPr>
-          <w:rFonts w:ascii="Times New Roman" w:hAnsi="Times New Roman" w:cs="Times New Roman"/>
-        </w:rPr>
-        <w:t xml:space="preserve"> (2019) also examines </w:t>
-      </w:r>
-      <w:proofErr w:type="gramStart"/>
-      <w:r>
-        <w:rPr>
-          <w:rFonts w:ascii="Times New Roman" w:hAnsi="Times New Roman" w:cs="Times New Roman"/>
-        </w:rPr>
-        <w:t>appearance based</w:t>
-      </w:r>
-      <w:proofErr w:type="gramEnd"/>
-      <w:r>
-        <w:rPr>
-          <w:rFonts w:ascii="Times New Roman" w:hAnsi="Times New Roman" w:cs="Times New Roman"/>
-        </w:rPr>
-        <w:t xml:space="preserve"> methods of facial recognition by discussing the principal components analysis, independent component analysis, linear discriminant analysis methods used in facial recognition. A drawback for this method is that it is challenging to find an efficient combination of dimensionality reduction technique and classifier. </w:t>
+        <w:t xml:space="preserve">It is imperative to mention that several authors have investigated the appearance based method for facial recognition. For instance, Struc and Pavesic (2009) examine the performance of appearance based methods subject to different environmental factors and conclude that the linear discriminant analysis produces the best results across different environmental conditions. Wu et al., (2018) also debate appearance based methods of facial recognition by examining facial expressions using the technique in question. The authors controlled for lighting conditions using a histogram equalization technique and a brightness preserving technique and concluded that the brightness preserving technique performs better than the histogram equalization technique. Broti (2019) also examines appearance based methods of facial recognition by discussing the principal components analysis, independent component analysis, linear discriminant analysis methods used in facial recognition. A drawback for this method is that it is challenging to find an efficient combination of dimensionality reduction technique and classifier. </w:t>
       </w:r>
       <w:bookmarkStart w:id="27" w:name="_heading=h.ljdder1spgws"/>
       <w:bookmarkEnd w:id="27"/>
@@ -7738,21 +7270,7 @@
         <w:rPr>
           <w:rFonts w:ascii="Times New Roman" w:hAnsi="Times New Roman" w:cs="Times New Roman"/>
         </w:rPr>
-        <w:t xml:space="preserve"> the authors involved a methodology that used imaging technology to detect and extract the biological attributes of the image. In a different publication, Wang et al., (2021) conducted a study with an aim to examine the problem of identifying human faces given different and complex backgrounds. Specifically, the authors used neuron </w:t>
-      </w:r>
-      <w:proofErr w:type="spellStart"/>
-      <w:r>
-        <w:rPr>
-          <w:rFonts w:ascii="Times New Roman" w:hAnsi="Times New Roman" w:cs="Times New Roman"/>
-        </w:rPr>
-        <w:t>regenisis</w:t>
-      </w:r>
-      <w:proofErr w:type="spellEnd"/>
-      <w:r>
-        <w:rPr>
-          <w:rFonts w:ascii="Times New Roman" w:hAnsi="Times New Roman" w:cs="Times New Roman"/>
-        </w:rPr>
-        <w:t xml:space="preserve"> mechanism and the synapse mechanism to identify facial images from complex backgrounds. The scholars in question developed a model called Where-What Networks that is able to learn type, location and size, which is able to identify human faces from complex backgrounds. This is a clear indicator that researchers are using artificial neural networks for facial recognition and that much is yet to be seen on facial recognition.</w:t>
+        <w:t xml:space="preserve"> the authors involved a methodology that used imaging technology to detect and extract the biological attributes of the image. In a different publication, Wang et al., (2021) conducted a study with an aim to examine the problem of identifying human faces given different and complex backgrounds. Specifically, the authors used neuron regenisis mechanism and the synapse mechanism to identify facial images from complex backgrounds. The scholars in question developed a model called Where-What Networks that is able to learn type, location and size, which is able to identify human faces from complex backgrounds. This is a clear indicator that researchers are using artificial neural networks for facial recognition and that much is yet to be seen on facial recognition.</w:t>
       </w:r>
     </w:p>
     <w:p>
@@ -7778,16 +7296,8 @@
         <w:rPr>
           <w:rFonts w:ascii="Times New Roman" w:hAnsi="Times New Roman" w:cs="Times New Roman"/>
         </w:rPr>
-        <w:t xml:space="preserve">(2011) assert that ANNs require a lot of time to train a model. The problem becomes even worse if the number of neurons and hidden layers required to train a model is high. This problem is controversial because neural networks are known to register a high accuracy when a high number of neurons and hidden layers are used. Every neuron in each layer can make calculations independent of other neurons implying that graphics processing units could help solve the time problem required to train an ANN model. Another problem associated with ANNs is the vanishing gradient problem. </w:t>
-      </w:r>
-      <w:proofErr w:type="spellStart"/>
-      <w:r>
-        <w:rPr>
-          <w:rFonts w:ascii="Times New Roman" w:hAnsi="Times New Roman" w:cs="Times New Roman"/>
-        </w:rPr>
-        <w:t>Tarnate</w:t>
-      </w:r>
-      <w:proofErr w:type="spellEnd"/>
+        <w:t>(2011) assert that ANNs require a lot of time to train a model. The problem becomes even worse if the number of neurons and hidden layers required to train a model is high. This problem is controversial because neural networks are known to register a high accuracy when a high number of neurons and hidden layers are used. Every neuron in each layer can make calculations independent of other neurons implying that graphics processing units could help solve the time problem required to train an ANN model. Another problem associated with ANNs is the vanishing gradient problem. Tarnate</w:t>
+      </w:r>
       <w:r>
         <w:rPr>
           <w:rFonts w:ascii="Times New Roman" w:hAnsi="Times New Roman" w:cs="Times New Roman"/>
@@ -7871,13 +7381,8 @@
         <w:tab/>
         <w:t xml:space="preserve">Like artificial neural networks, convolution neural networks have been used for facial recognition widely. For example, Xiaobo et al., (2023) recognize that facial recognition is hampered by factors such as posture, light and the background of the image. As a result, the authors proposed the addition of an attention mechanism to convolution neural networks in a bid to reduce the effects of factors that affect facial recognition. In a different paper, He et al., (2023) recognize that the existing methods on facial recognition ignore the effect of spatial relationships between predictors. Consequently, the authors introduced the use of a Group Depth-Wise Transpose Attention (GDTA) block, which is designed to establish long range dependencies in different facial features. This led to the development of a lightweight face recognition model, which the authors call </w:t>
       </w:r>
-      <w:proofErr w:type="spellStart"/>
-      <w:r>
-        <w:t>CFormerFaceNet</w:t>
-      </w:r>
-      <w:proofErr w:type="spellEnd"/>
-      <w:r>
-        <w:t>.</w:t>
+      <w:r>
+        <w:t>CFormerFaceNet.</w:t>
       </w:r>
       <w:r>
         <w:rPr>
@@ -9619,21 +9124,7 @@
           <w:color w:val="000000"/>
         </w:rPr>
         <w:tab/>
-        <w:t xml:space="preserve">An array of studies </w:t>
-      </w:r>
-      <w:proofErr w:type="gramStart"/>
-      <w:r>
-        <w:rPr>
-          <w:color w:val="000000"/>
-        </w:rPr>
-        <w:t>have</w:t>
-      </w:r>
-      <w:proofErr w:type="gramEnd"/>
-      <w:r>
-        <w:rPr>
-          <w:color w:val="000000"/>
-        </w:rPr>
-        <w:t xml:space="preserve"> been published either introducing new padding strategies or applying the already existing padding techniques on different problems. For </w:t>
+        <w:t xml:space="preserve">An array of studies have been published either introducing new padding strategies or applying the already existing padding techniques on different problems. For </w:t>
       </w:r>
       <w:r>
         <w:rPr>
@@ -9722,27 +9213,13 @@
           <w:color w:val="000000"/>
         </w:rPr>
         <w:lastRenderedPageBreak/>
-        <w:t xml:space="preserve">effects of time series variations. Tang et al., (2019) also investigate the effect of invalid and same padding using </w:t>
-      </w:r>
-      <w:proofErr w:type="gramStart"/>
+        <w:t>effects of time series variations. Tang et al., (2019) also investigate the effect of invalid and same padding using Pre-</w:t>
+      </w:r>
       <w:r>
         <w:rPr>
           <w:color w:val="000000"/>
         </w:rPr>
-        <w:t>Pre-</w:t>
-      </w:r>
-      <w:r>
-        <w:rPr>
-          <w:color w:val="000000"/>
-        </w:rPr>
-        <w:t>trained</w:t>
-      </w:r>
-      <w:proofErr w:type="gramEnd"/>
-      <w:r>
-        <w:rPr>
-          <w:color w:val="000000"/>
-        </w:rPr>
-        <w:t xml:space="preserve"> CNNs</w:t>
+        <w:t>trained CNNs</w:t>
       </w:r>
       <w:r>
         <w:rPr>
@@ -9801,33 +9278,11 @@
         </w:rPr>
         <w:t xml:space="preserve">from </w:t>
       </w:r>
-      <w:proofErr w:type="spellStart"/>
       <w:r>
         <w:rPr>
           <w:color w:val="000000"/>
         </w:rPr>
-        <w:t>Alrasheedi</w:t>
-      </w:r>
-      <w:proofErr w:type="spellEnd"/>
-      <w:r>
-        <w:rPr>
-          <w:color w:val="000000"/>
-        </w:rPr>
-        <w:t xml:space="preserve"> et al., (2023). The authors acknowledge that padding has been investigated shallowly. It is then, that they propose a padding technique that learns from shifts in hyper parameters of a CNN before adjusting padding effectively. Finally, </w:t>
-      </w:r>
-      <w:proofErr w:type="spellStart"/>
-      <w:r>
-        <w:rPr>
-          <w:color w:val="000000"/>
-        </w:rPr>
-        <w:t>Alrasheedi</w:t>
-      </w:r>
-      <w:proofErr w:type="spellEnd"/>
-      <w:r>
-        <w:rPr>
-          <w:color w:val="000000"/>
-        </w:rPr>
-        <w:t xml:space="preserve"> et al., (2023) introduce a padding module providing evidence that it performs better 1.49% and 0.44% more better in classification accuracy than the zero padding when tested on the VGG16 and ResNet50. Clearly a considerable number of publications investigating how padding affects convolution neural networks have been made. Regardless, the number of publications that investigate how padding affects CNNs in computer vision still remain </w:t>
+        <w:t xml:space="preserve">Alrasheedi et al., (2023). The authors acknowledge that padding has been investigated shallowly. It is then, that they propose a padding technique that learns from shifts in hyper parameters of a CNN before adjusting padding effectively. Finally, Alrasheedi et al., (2023) introduce a padding module providing evidence that it performs better 1.49% and 0.44% more better in classification accuracy than the zero padding when tested on the VGG16 and ResNet50. Clearly a considerable number of publications investigating how padding affects convolution neural networks have been made. Regardless, the number of publications that investigate how padding affects CNNs in computer vision still remain </w:t>
       </w:r>
       <w:r>
         <w:rPr>
@@ -9946,15 +9401,7 @@
         <w:t xml:space="preserve"> was developed with an aim of creating facial recognition models that are resistant to disguises. This owes to the fact that Singh et al., (2018) acknowledge that humans could artificially alter their faces with an aim of fooling a f</w:t>
       </w:r>
       <w:r>
-        <w:t xml:space="preserve">acial recognition system. For instance, an individual could try and fool a system by wearing a wig, wearing at artificial beard or putting on heavy </w:t>
-      </w:r>
-      <w:proofErr w:type="spellStart"/>
-      <w:r>
-        <w:t>make up</w:t>
-      </w:r>
-      <w:proofErr w:type="spellEnd"/>
-      <w:r>
-        <w:t xml:space="preserve">. It is important to note that a different dataset called </w:t>
+        <w:t xml:space="preserve">acial recognition system. For instance, an individual could try and fool a system by wearing a wig, wearing at artificial beard or putting on heavy make up. It is important to note that a different dataset called </w:t>
       </w:r>
       <w:r>
         <w:t>Disguised Faces in the Wild 2019 Dataset</w:t>
@@ -10001,15 +9448,7 @@
         <w:t>. Critical to the discussion is the fact that this data set was examined by human annotators to eliminate images that could introduce noise into the dataset. It is important to hi</w:t>
       </w:r>
       <w:r>
-        <w:t xml:space="preserve">ghlight that this dataset has been used and cited by authors widely. For example, Ibrahem and </w:t>
-      </w:r>
-      <w:proofErr w:type="spellStart"/>
-      <w:r>
-        <w:t>Abdulameer</w:t>
-      </w:r>
-      <w:proofErr w:type="spellEnd"/>
-      <w:r>
-        <w:t xml:space="preserve"> (2023) examine a pretrained model that was created from this dataset to </w:t>
+        <w:t xml:space="preserve">ghlight that this dataset has been used and cited by authors widely. For example, Ibrahem and Abdulameer (2023) examine a pretrained model that was created from this dataset to </w:t>
       </w:r>
       <w:r>
         <w:t>discuss</w:t>
@@ -10146,73 +9585,23 @@
         <w:t xml:space="preserve"> to match or a recognize a face belonging to a particular person. An example of an author that has conducted review on facial recognition architectures is sun and Redei (2022). </w:t>
       </w:r>
       <w:r>
-        <w:t xml:space="preserve">Specifically, the authors in question discuss architectures such as </w:t>
-      </w:r>
-      <w:proofErr w:type="spellStart"/>
-      <w:r>
-        <w:t>FaceNet</w:t>
-      </w:r>
-      <w:proofErr w:type="spellEnd"/>
-      <w:r>
-        <w:t xml:space="preserve">, </w:t>
-      </w:r>
-      <w:proofErr w:type="spellStart"/>
-      <w:r>
-        <w:t>DeepFace</w:t>
-      </w:r>
-      <w:proofErr w:type="spellEnd"/>
-      <w:r>
-        <w:t xml:space="preserve">, </w:t>
-      </w:r>
-      <w:proofErr w:type="spellStart"/>
-      <w:r>
-        <w:t>DeepID</w:t>
-      </w:r>
-      <w:proofErr w:type="spellEnd"/>
-      <w:r>
-        <w:t>-Net</w:t>
+        <w:t xml:space="preserve">Specifically, the authors in question discuss architectures such as FaceNet, DeepFace, </w:t>
+      </w:r>
+      <w:r>
+        <w:t>DeepID-Net</w:t>
       </w:r>
       <w:r>
         <w:t xml:space="preserve">, and Local binary patterns architectures. Gupta (2017) also reviewed some of the existing architectures in facial recognition. In particular, the author discusses architectures like </w:t>
       </w:r>
-      <w:proofErr w:type="spellStart"/>
       <w:r>
         <w:lastRenderedPageBreak/>
-        <w:t>WebFace</w:t>
-      </w:r>
-      <w:proofErr w:type="spellEnd"/>
-      <w:r>
-        <w:t xml:space="preserve">, </w:t>
-      </w:r>
-      <w:proofErr w:type="spellStart"/>
-      <w:r>
-        <w:t>DeepFace</w:t>
-      </w:r>
-      <w:proofErr w:type="spellEnd"/>
-      <w:r>
-        <w:t>,</w:t>
+        <w:t>WebFace, DeepFace,</w:t>
       </w:r>
       <w:r>
         <w:t xml:space="preserve"> </w:t>
       </w:r>
       <w:r>
-        <w:t xml:space="preserve">VGG Net, </w:t>
-      </w:r>
-      <w:proofErr w:type="spellStart"/>
-      <w:r>
-        <w:t>FaceNet</w:t>
-      </w:r>
-      <w:proofErr w:type="spellEnd"/>
-      <w:r>
-        <w:t xml:space="preserve">, and </w:t>
-      </w:r>
-      <w:proofErr w:type="spellStart"/>
-      <w:r>
-        <w:t>DeepId</w:t>
-      </w:r>
-      <w:proofErr w:type="spellEnd"/>
-      <w:r>
-        <w:t xml:space="preserve">. Critical to the discussion is that fact that the number of existing architectures could be more than 30 implying that discussing all these architectures would be daunting. It follows that </w:t>
+        <w:t xml:space="preserve">VGG Net, FaceNet, and DeepId. Critical to the discussion is that fact that the number of existing architectures could be more than 30 implying that discussing all these architectures would be daunting. It follows that </w:t>
       </w:r>
       <w:r>
         <w:t>this paper will only discuss selected architectures in order to stick to the scope of the paper.</w:t>
@@ -10226,7 +9615,6 @@
       <w:r>
         <w:t>Google </w:t>
       </w:r>
-      <w:proofErr w:type="spellStart"/>
       <w:r>
         <w:t>F</w:t>
       </w:r>
@@ -10240,7 +9628,6 @@
         <w:t>et</w:t>
       </w:r>
       <w:bookmarkEnd w:id="49"/>
-      <w:proofErr w:type="spellEnd"/>
     </w:p>
     <w:p>
       <w:pPr>
@@ -10251,23 +9638,7 @@
         <w:tab/>
       </w:r>
       <w:r>
-        <w:t xml:space="preserve">Google </w:t>
-      </w:r>
-      <w:proofErr w:type="spellStart"/>
-      <w:r>
-        <w:t>FaceNet</w:t>
-      </w:r>
-      <w:proofErr w:type="spellEnd"/>
-      <w:r>
-        <w:t xml:space="preserve">, or popularly known as </w:t>
-      </w:r>
-      <w:proofErr w:type="spellStart"/>
-      <w:r>
-        <w:t>FaceNet</w:t>
-      </w:r>
-      <w:proofErr w:type="spellEnd"/>
-      <w:r>
-        <w:t xml:space="preserve">, is a facial recognition architecture that was developed by researchers at Google. This architecture relies on an earlier architecture </w:t>
+        <w:t xml:space="preserve">Google FaceNet, or popularly known as FaceNet, is a facial recognition architecture that was developed by researchers at Google. This architecture relies on an earlier architecture </w:t>
       </w:r>
       <w:r>
         <w:t xml:space="preserve">called Inception </w:t>
@@ -10300,15 +9671,7 @@
         <w:t>%</w:t>
       </w:r>
       <w:r>
-        <w:t xml:space="preserve"> on the Labelled Faces in the Wild dataset (Sun and Redei, 2022). It should be noted however that </w:t>
-      </w:r>
-      <w:proofErr w:type="spellStart"/>
-      <w:r>
-        <w:t>FaceNet</w:t>
-      </w:r>
-      <w:proofErr w:type="spellEnd"/>
-      <w:r>
-        <w:t xml:space="preserve"> requires high performing computers in order to train the architecture on a new dataset.</w:t>
+        <w:t xml:space="preserve"> on the Labelled Faces in the Wild dataset (Sun and Redei, 2022). It should be noted however that FaceNet requires high performing computers in order to train the architecture on a new dataset.</w:t>
       </w:r>
     </w:p>
     <w:p>
@@ -10316,12 +9679,10 @@
         <w:pStyle w:val="Heading3"/>
       </w:pPr>
       <w:bookmarkStart w:id="50" w:name="_Toc178527562"/>
-      <w:proofErr w:type="spellStart"/>
       <w:r>
         <w:t>DeepFace</w:t>
       </w:r>
       <w:bookmarkEnd w:id="50"/>
-      <w:proofErr w:type="spellEnd"/>
     </w:p>
     <w:p>
       <w:pPr>
@@ -10331,81 +9692,54 @@
       <w:r>
         <w:tab/>
       </w:r>
-      <w:proofErr w:type="spellStart"/>
-      <w:r>
-        <w:t>DeepFace</w:t>
-      </w:r>
-      <w:proofErr w:type="spellEnd"/>
-      <w:r>
-        <w:t xml:space="preserve"> was also produced by a giant company in technology. Specifically, Meta. Critical to the discussion is the fact </w:t>
-      </w:r>
-      <w:proofErr w:type="spellStart"/>
+      <w:r>
+        <w:t xml:space="preserve">DeepFace was also produced by a giant company in technology. Specifically, Meta. Critical to the discussion is the fact </w:t>
+      </w:r>
       <w:r>
         <w:t>Taigman</w:t>
       </w:r>
-      <w:proofErr w:type="spellEnd"/>
       <w:r>
         <w:t xml:space="preserve"> et al., (2014) published</w:t>
       </w:r>
       <w:r>
-        <w:t xml:space="preserve"> the results from the study that produced </w:t>
-      </w:r>
-      <w:proofErr w:type="spellStart"/>
-      <w:r>
-        <w:t>DeepFace</w:t>
-      </w:r>
-      <w:proofErr w:type="spellEnd"/>
+        <w:t xml:space="preserve"> the results from the study that produced DeepFace. </w:t>
+      </w:r>
+      <w:r>
+        <w:t>It is important to note that the researchers introduced an idea of</w:t>
+      </w:r>
+      <w:r>
+        <w:t xml:space="preserve"> 3D modelling based on face fiducial points, which in turn is used to align faces. Simply put, the facial alignment methodology proposed by </w:t>
+      </w:r>
+      <w:r>
+        <w:t>Taigman</w:t>
+      </w:r>
+      <w:r>
+        <w:t xml:space="preserve"> et al., (2014) can transform an image shown in </w:t>
+      </w:r>
+      <w:r>
+        <w:t>figure 2.6 (a) to an image shown in figure 2.6</w:t>
+      </w:r>
+      <w:r>
+        <w:t xml:space="preserve"> </w:t>
+      </w:r>
+      <w:r>
+        <w:t>(b)</w:t>
+      </w:r>
       <w:r>
         <w:t xml:space="preserve">. </w:t>
       </w:r>
       <w:r>
-        <w:t>It is important to note that the researchers introduced an idea of</w:t>
-      </w:r>
-      <w:r>
-        <w:t xml:space="preserve"> 3D modelling based on face fiducial points, which in turn is used to align faces. Simply put, the facial alignment methodology proposed by </w:t>
-      </w:r>
-      <w:proofErr w:type="spellStart"/>
+        <w:t xml:space="preserve">Resulting images from facial alignment are then subjected to a deep convolution neural network architecture that is thoroughly documented by </w:t>
+      </w:r>
       <w:r>
         <w:t>Taigman</w:t>
       </w:r>
-      <w:proofErr w:type="spellEnd"/>
-      <w:r>
-        <w:t xml:space="preserve"> et al., (2014) can transform an image shown in </w:t>
-      </w:r>
-      <w:r>
-        <w:t>figure 2.6 (a) to an image shown in figure 2.6</w:t>
-      </w:r>
-      <w:r>
-        <w:t xml:space="preserve"> </w:t>
-      </w:r>
-      <w:r>
-        <w:t>(b)</w:t>
-      </w:r>
-      <w:r>
-        <w:t xml:space="preserve">. </w:t>
-      </w:r>
-      <w:r>
-        <w:t xml:space="preserve">Resulting images from facial alignment are then subjected to a deep convolution neural network architecture that is thoroughly documented by </w:t>
-      </w:r>
-      <w:proofErr w:type="spellStart"/>
-      <w:r>
-        <w:t>Taigman</w:t>
-      </w:r>
-      <w:proofErr w:type="spellEnd"/>
       <w:r>
         <w:t xml:space="preserve"> et al., (2014). Vital to the </w:t>
       </w:r>
       <w:r>
         <w:lastRenderedPageBreak/>
-        <w:t xml:space="preserve">discussion is the fact that the </w:t>
-      </w:r>
-      <w:proofErr w:type="spellStart"/>
-      <w:r>
-        <w:t>DeepFace</w:t>
-      </w:r>
-      <w:proofErr w:type="spellEnd"/>
-      <w:r>
-        <w:t xml:space="preserve"> architecture was tested on </w:t>
+        <w:t xml:space="preserve">discussion is the fact that the DeepFace architecture was tested on </w:t>
       </w:r>
       <w:r>
         <w:t>the Labelled Faces in the Wild dataset, and the YouTube Faces dataset. It follows that this architecture achieved an accuracy of 97.5% in the Labelled Faces in the Wild dataset and a 91.4% accuracy on the YouTube Faces dataset.</w:t>
@@ -10584,42 +9918,10 @@
         <w:t xml:space="preserve"> Specifically, it is made up of 16 layers where the first thirteen layers are convolution layers while the last three layers are fully connected layers. </w:t>
       </w:r>
       <w:r>
-        <w:t xml:space="preserve">Critical to the discussion is the fact that the input image must have a dimension of 224 by 224 by 3. The sixteen layers used by this facial architecture can be divided into five major groups. Each of these groups contains convolution layers, a </w:t>
-      </w:r>
-      <w:proofErr w:type="spellStart"/>
-      <w:r>
-        <w:t>relu</w:t>
-      </w:r>
-      <w:proofErr w:type="spellEnd"/>
-      <w:r>
-        <w:t xml:space="preserve"> activation function, </w:t>
-      </w:r>
-      <w:proofErr w:type="spellStart"/>
-      <w:r>
-        <w:t>maxpooling</w:t>
-      </w:r>
-      <w:proofErr w:type="spellEnd"/>
-      <w:r>
-        <w:t xml:space="preserve">, kernel filters, strides and padding. A thorough explanation of this facial recognition architecture has been published by Koo et al., (2018). </w:t>
-      </w:r>
-      <w:r>
-        <w:t xml:space="preserve">It is important to mention that like Google </w:t>
-      </w:r>
-      <w:proofErr w:type="spellStart"/>
-      <w:r>
-        <w:t>Facenet</w:t>
-      </w:r>
-      <w:proofErr w:type="spellEnd"/>
-      <w:r>
-        <w:t xml:space="preserve"> and </w:t>
-      </w:r>
-      <w:proofErr w:type="spellStart"/>
-      <w:r>
-        <w:t>DeepFace</w:t>
-      </w:r>
-      <w:proofErr w:type="spellEnd"/>
-      <w:r>
-        <w:t xml:space="preserve">, VGGFACE-16 was also tested on famous datasets such as the </w:t>
+        <w:t xml:space="preserve">Critical to the discussion is the fact that the input image must have a dimension of 224 by 224 by 3. The sixteen layers used by this facial architecture can be divided into five major groups. Each of these groups contains convolution layers, a relu activation function, maxpooling, kernel filters, strides and padding. A thorough explanation of this facial recognition architecture has been published by Koo et al., (2018). </w:t>
+      </w:r>
+      <w:r>
+        <w:t xml:space="preserve">It is important to mention that like Google Facenet and DeepFace, VGGFACE-16 was also tested on famous datasets such as the </w:t>
       </w:r>
       <w:r>
         <w:t>Labeled Faces in the Wild dataset</w:t>
@@ -12198,14 +11500,7 @@
         <w:rPr>
           <w:rFonts w:ascii="Times New Roman" w:hAnsi="Times New Roman" w:cs="Times New Roman"/>
         </w:rPr>
-        <w:t xml:space="preserve"> be the weight matrices denoting the value of the synaptic weight that connects the </w:t>
-      </w:r>
-      <w:proofErr w:type="spellStart"/>
-      <w:r>
-        <w:rPr>
-          <w:rFonts w:ascii="Times New Roman" w:hAnsi="Times New Roman" w:cs="Times New Roman"/>
-        </w:rPr>
-        <w:t>j</w:t>
+        <w:t xml:space="preserve"> be the weight matrices denoting the value of the synaptic weight that connects the j</w:t>
       </w:r>
       <w:r>
         <w:rPr>
@@ -12214,19 +11509,11 @@
         </w:rPr>
         <w:t>th</w:t>
       </w:r>
-      <w:proofErr w:type="spellEnd"/>
-      <w:r>
-        <w:rPr>
-          <w:rFonts w:ascii="Times New Roman" w:hAnsi="Times New Roman" w:cs="Times New Roman"/>
-        </w:rPr>
-        <w:t xml:space="preserve"> neuron of layer (L) to the </w:t>
-      </w:r>
-      <w:proofErr w:type="spellStart"/>
-      <w:r>
-        <w:rPr>
-          <w:rFonts w:ascii="Times New Roman" w:hAnsi="Times New Roman" w:cs="Times New Roman"/>
-        </w:rPr>
-        <w:t>i</w:t>
+      <w:r>
+        <w:rPr>
+          <w:rFonts w:ascii="Times New Roman" w:hAnsi="Times New Roman" w:cs="Times New Roman"/>
+        </w:rPr>
+        <w:t xml:space="preserve"> neuron of layer (L) to the i</w:t>
       </w:r>
       <w:r>
         <w:rPr>
@@ -12235,7 +11522,6 @@
         </w:rPr>
         <w:t>th</w:t>
       </w:r>
-      <w:proofErr w:type="spellEnd"/>
       <w:r>
         <w:rPr>
           <w:rFonts w:ascii="Times New Roman" w:hAnsi="Times New Roman" w:cs="Times New Roman"/>
@@ -12303,14 +11589,7 @@
         <w:rPr>
           <w:rFonts w:ascii="Times New Roman" w:hAnsi="Times New Roman" w:cs="Times New Roman"/>
         </w:rPr>
-        <w:t xml:space="preserve"> Is the synaptic weight connecting the </w:t>
-      </w:r>
-      <w:proofErr w:type="spellStart"/>
-      <w:r>
-        <w:rPr>
-          <w:rFonts w:ascii="Times New Roman" w:hAnsi="Times New Roman" w:cs="Times New Roman"/>
-        </w:rPr>
-        <w:t>j</w:t>
+        <w:t xml:space="preserve"> Is the synaptic weight connecting the j</w:t>
       </w:r>
       <w:r>
         <w:rPr>
@@ -12319,19 +11598,11 @@
         </w:rPr>
         <w:t>th</w:t>
       </w:r>
-      <w:proofErr w:type="spellEnd"/>
-      <w:r>
-        <w:rPr>
-          <w:rFonts w:ascii="Times New Roman" w:hAnsi="Times New Roman" w:cs="Times New Roman"/>
-        </w:rPr>
-        <w:t xml:space="preserve"> neuron of output layer to the </w:t>
-      </w:r>
-      <w:proofErr w:type="spellStart"/>
-      <w:r>
-        <w:rPr>
-          <w:rFonts w:ascii="Times New Roman" w:hAnsi="Times New Roman" w:cs="Times New Roman"/>
-        </w:rPr>
-        <w:t>i</w:t>
+      <w:r>
+        <w:rPr>
+          <w:rFonts w:ascii="Times New Roman" w:hAnsi="Times New Roman" w:cs="Times New Roman"/>
+        </w:rPr>
+        <w:t xml:space="preserve"> neuron of output layer to the i</w:t>
       </w:r>
       <w:r>
         <w:rPr>
@@ -12340,7 +11611,6 @@
         </w:rPr>
         <w:t>th</w:t>
       </w:r>
-      <w:proofErr w:type="spellEnd"/>
       <w:r>
         <w:rPr>
           <w:rFonts w:ascii="Times New Roman" w:hAnsi="Times New Roman" w:cs="Times New Roman"/>
@@ -12408,14 +11678,7 @@
         <w:rPr>
           <w:rFonts w:ascii="Times New Roman" w:hAnsi="Times New Roman" w:cs="Times New Roman"/>
         </w:rPr>
-        <w:t xml:space="preserve"> Is the synaptic weight connecting the </w:t>
-      </w:r>
-      <w:proofErr w:type="spellStart"/>
-      <w:r>
-        <w:rPr>
-          <w:rFonts w:ascii="Times New Roman" w:hAnsi="Times New Roman" w:cs="Times New Roman"/>
-        </w:rPr>
-        <w:t>j</w:t>
+        <w:t xml:space="preserve"> Is the synaptic weight connecting the j</w:t>
       </w:r>
       <w:r>
         <w:rPr>
@@ -12424,19 +11687,11 @@
         </w:rPr>
         <w:t>th</w:t>
       </w:r>
-      <w:proofErr w:type="spellEnd"/>
-      <w:r>
-        <w:rPr>
-          <w:rFonts w:ascii="Times New Roman" w:hAnsi="Times New Roman" w:cs="Times New Roman"/>
-        </w:rPr>
-        <w:t xml:space="preserve"> neuron of hidden layer 2 to the </w:t>
-      </w:r>
-      <w:proofErr w:type="spellStart"/>
-      <w:r>
-        <w:rPr>
-          <w:rFonts w:ascii="Times New Roman" w:hAnsi="Times New Roman" w:cs="Times New Roman"/>
-        </w:rPr>
-        <w:t>i</w:t>
+      <w:r>
+        <w:rPr>
+          <w:rFonts w:ascii="Times New Roman" w:hAnsi="Times New Roman" w:cs="Times New Roman"/>
+        </w:rPr>
+        <w:t xml:space="preserve"> neuron of hidden layer 2 to the i</w:t>
       </w:r>
       <w:r>
         <w:rPr>
@@ -12445,7 +11700,6 @@
         </w:rPr>
         <w:t>th</w:t>
       </w:r>
-      <w:proofErr w:type="spellEnd"/>
       <w:r>
         <w:rPr>
           <w:rFonts w:ascii="Times New Roman" w:hAnsi="Times New Roman" w:cs="Times New Roman"/>
@@ -12513,14 +11767,7 @@
         <w:rPr>
           <w:rFonts w:ascii="Times New Roman" w:hAnsi="Times New Roman" w:cs="Times New Roman"/>
         </w:rPr>
-        <w:t xml:space="preserve"> Is the synaptic weight connecting the </w:t>
-      </w:r>
-      <w:proofErr w:type="spellStart"/>
-      <w:r>
-        <w:rPr>
-          <w:rFonts w:ascii="Times New Roman" w:hAnsi="Times New Roman" w:cs="Times New Roman"/>
-        </w:rPr>
-        <w:t>j</w:t>
+        <w:t xml:space="preserve"> Is the synaptic weight connecting the j</w:t>
       </w:r>
       <w:r>
         <w:rPr>
@@ -12529,19 +11776,11 @@
         </w:rPr>
         <w:t>th</w:t>
       </w:r>
-      <w:proofErr w:type="spellEnd"/>
-      <w:r>
-        <w:rPr>
-          <w:rFonts w:ascii="Times New Roman" w:hAnsi="Times New Roman" w:cs="Times New Roman"/>
-        </w:rPr>
-        <w:t xml:space="preserve"> neuron of hidden layer 1 to the </w:t>
-      </w:r>
-      <w:proofErr w:type="spellStart"/>
-      <w:r>
-        <w:rPr>
-          <w:rFonts w:ascii="Times New Roman" w:hAnsi="Times New Roman" w:cs="Times New Roman"/>
-        </w:rPr>
-        <w:t>i</w:t>
+      <w:r>
+        <w:rPr>
+          <w:rFonts w:ascii="Times New Roman" w:hAnsi="Times New Roman" w:cs="Times New Roman"/>
+        </w:rPr>
+        <w:t xml:space="preserve"> neuron of hidden layer 1 to the i</w:t>
       </w:r>
       <w:r>
         <w:rPr>
@@ -12550,7 +11789,6 @@
         </w:rPr>
         <w:t>th</w:t>
       </w:r>
-      <w:proofErr w:type="spellEnd"/>
       <w:r>
         <w:rPr>
           <w:rFonts w:ascii="Times New Roman" w:hAnsi="Times New Roman" w:cs="Times New Roman"/>
@@ -12714,11 +11952,7 @@
         </m:sSubSup>
       </m:oMath>
       <w:r>
-        <w:t xml:space="preserve"> be vectors whose elements denote the weighted inputs of the </w:t>
-      </w:r>
-      <w:proofErr w:type="spellStart"/>
-      <w:r>
-        <w:t>j</w:t>
+        <w:t xml:space="preserve"> be vectors whose elements denote the weighted inputs of the j</w:t>
       </w:r>
       <w:r>
         <w:rPr>
@@ -12726,7 +11960,6 @@
         </w:rPr>
         <w:t>th</w:t>
       </w:r>
-      <w:proofErr w:type="spellEnd"/>
       <w:r>
         <w:t xml:space="preserve"> neuron of layer L and are defined as the following.</w:t>
       </w:r>
@@ -17059,17 +16292,8 @@
           <w:i w:val="0"/>
           <w:iCs w:val="0"/>
         </w:rPr>
-        <w:t xml:space="preserve">   </w:t>
-      </w:r>
-      <w:proofErr w:type="gramStart"/>
-      <w:r>
-        <w:rPr>
-          <w:i w:val="0"/>
-          <w:iCs w:val="0"/>
-        </w:rPr>
-        <w:t xml:space="preserve">   (</w:t>
-      </w:r>
-      <w:proofErr w:type="gramEnd"/>
+        <w:t xml:space="preserve">      (</w:t>
+      </w:r>
       <w:r>
         <w:rPr>
           <w:i w:val="0"/>
@@ -17346,17 +16570,8 @@
           <w:i w:val="0"/>
           <w:iCs w:val="0"/>
         </w:rPr>
-        <w:t xml:space="preserve">   </w:t>
-      </w:r>
-      <w:proofErr w:type="gramStart"/>
-      <w:r>
-        <w:rPr>
-          <w:i w:val="0"/>
-          <w:iCs w:val="0"/>
-        </w:rPr>
-        <w:t xml:space="preserve">   (</w:t>
-      </w:r>
-      <w:proofErr w:type="gramEnd"/>
+        <w:t xml:space="preserve">      (</w:t>
+      </w:r>
       <w:r>
         <w:rPr>
           <w:i w:val="0"/>
@@ -19767,17 +18982,8 @@
           <w:i w:val="0"/>
           <w:iCs w:val="0"/>
         </w:rPr>
-        <w:t xml:space="preserve">   </w:t>
-      </w:r>
-      <w:proofErr w:type="gramStart"/>
-      <w:r>
-        <w:rPr>
-          <w:i w:val="0"/>
-          <w:iCs w:val="0"/>
-        </w:rPr>
-        <w:t xml:space="preserve">   (</w:t>
-      </w:r>
-      <w:proofErr w:type="gramEnd"/>
+        <w:t xml:space="preserve">      (</w:t>
+      </w:r>
       <w:r>
         <w:rPr>
           <w:i w:val="0"/>
@@ -20084,11 +19290,7 @@
       </w:r>
       <w:r>
         <w:tab/>
-        <w:t xml:space="preserve">   </w:t>
-      </w:r>
-      <w:proofErr w:type="gramStart"/>
-      <w:r>
-        <w:t xml:space="preserve">   </w:t>
+        <w:t xml:space="preserve">      </w:t>
       </w:r>
       <w:r>
         <w:rPr>
@@ -20097,7 +19299,6 @@
         </w:rPr>
         <w:t>(</w:t>
       </w:r>
-      <w:proofErr w:type="gramEnd"/>
       <w:r>
         <w:rPr>
           <w:i w:val="0"/>
@@ -21455,15 +20656,7 @@
         </m:sSubSup>
       </m:oMath>
       <w:r>
-        <w:t xml:space="preserve"> have been adjusted in the previous step based on errors, which will be used to adjust weights in the second intermediate layer. Moving on to parcel (</w:t>
-      </w:r>
-      <w:proofErr w:type="spellStart"/>
-      <w:r>
-        <w:t>i</w:t>
-      </w:r>
-      <w:proofErr w:type="spellEnd"/>
-      <w:r>
-        <w:t xml:space="preserve">) in equation </w:t>
+        <w:t xml:space="preserve"> have been adjusted in the previous step based on errors, which will be used to adjust weights in the second intermediate layer. Moving on to parcel (i) in equation </w:t>
       </w:r>
       <w:r>
         <w:t>3.22</w:t>
@@ -22745,13 +21938,8 @@
       <w:pPr>
         <w:spacing w:line="480" w:lineRule="auto"/>
       </w:pPr>
-      <w:proofErr w:type="gramStart"/>
-      <w:r>
-        <w:t>Where</w:t>
-      </w:r>
-      <w:proofErr w:type="gramEnd"/>
-      <w:r>
-        <w:t xml:space="preserve"> </w:t>
+      <w:r>
+        <w:t xml:space="preserve">Where </w:t>
       </w:r>
     </w:p>
     <w:p>
@@ -24259,17 +23447,8 @@
           <w:i w:val="0"/>
           <w:iCs w:val="0"/>
         </w:rPr>
-        <w:t xml:space="preserve">   </w:t>
-      </w:r>
-      <w:proofErr w:type="gramStart"/>
-      <w:r>
-        <w:rPr>
-          <w:i w:val="0"/>
-          <w:iCs w:val="0"/>
-        </w:rPr>
-        <w:t xml:space="preserve">   (</w:t>
-      </w:r>
-      <w:proofErr w:type="gramEnd"/>
+        <w:t xml:space="preserve">      (</w:t>
+      </w:r>
       <w:r>
         <w:rPr>
           <w:i w:val="0"/>
@@ -24578,11 +23757,7 @@
       </w:r>
       <w:r>
         <w:tab/>
-        <w:t xml:space="preserve">   </w:t>
-      </w:r>
-      <w:proofErr w:type="gramStart"/>
-      <w:r>
-        <w:t xml:space="preserve">   </w:t>
+        <w:t xml:space="preserve">      </w:t>
       </w:r>
       <w:r>
         <w:rPr>
@@ -24591,7 +23766,6 @@
         </w:rPr>
         <w:t>(</w:t>
       </w:r>
-      <w:proofErr w:type="gramEnd"/>
       <w:r>
         <w:rPr>
           <w:i w:val="0"/>
@@ -27245,13 +26419,8 @@
       <w:pPr>
         <w:spacing w:line="480" w:lineRule="auto"/>
       </w:pPr>
-      <w:proofErr w:type="gramStart"/>
-      <w:r>
-        <w:t>Where</w:t>
-      </w:r>
-      <w:proofErr w:type="gramEnd"/>
-      <w:r>
-        <w:t xml:space="preserve"> </w:t>
+      <w:r>
+        <w:t xml:space="preserve">Where </w:t>
       </w:r>
     </w:p>
     <w:p>
@@ -29812,21 +28981,7 @@
         <w:rPr>
           <w:rFonts w:ascii="Times New Roman" w:hAnsi="Times New Roman" w:cs="Times New Roman"/>
         </w:rPr>
-        <w:t xml:space="preserve">examining the effect of padding on a modified VGGFACE-16 </w:t>
-      </w:r>
-      <w:proofErr w:type="spellStart"/>
-      <w:r>
-        <w:rPr>
-          <w:rFonts w:ascii="Times New Roman" w:hAnsi="Times New Roman" w:cs="Times New Roman"/>
-        </w:rPr>
-        <w:t>modeld</w:t>
-      </w:r>
-      <w:proofErr w:type="spellEnd"/>
-      <w:r>
-        <w:rPr>
-          <w:rFonts w:ascii="Times New Roman" w:hAnsi="Times New Roman" w:cs="Times New Roman"/>
-        </w:rPr>
-        <w:t>. The chapter ends with a discussion comparing the effect of padding on Cycks and the modified VGGFACE-16.</w:t>
+        <w:t>examining the effect of padding on a modified VGGFACE-16 modeld. The chapter ends with a discussion comparing the effect of padding on Cycks and the modified VGGFACE-16.</w:t>
       </w:r>
     </w:p>
     <w:p>
@@ -31201,7 +30356,19 @@
         <w:rPr>
           <w:lang w:eastAsia="en-US" w:bidi="ar-SA"/>
         </w:rPr>
-        <w:t>The Effect of Padding on a Modified VGG Model</w:t>
+        <w:t xml:space="preserve">The </w:t>
+      </w:r>
+      <w:r>
+        <w:rPr>
+          <w:lang w:eastAsia="en-US" w:bidi="ar-SA"/>
+        </w:rPr>
+        <w:t xml:space="preserve">Modified </w:t>
+      </w:r>
+      <w:r>
+        <w:rPr>
+          <w:lang w:eastAsia="en-US" w:bidi="ar-SA"/>
+        </w:rPr>
+        <w:t>VGG Model</w:t>
       </w:r>
     </w:p>
     <w:p>
@@ -31217,14 +30384,32 @@
         <w:rPr>
           <w:lang w:eastAsia="en-US" w:bidi="ar-SA"/>
         </w:rPr>
-        <w:t xml:space="preserve">While the architecture presented in this study draws inspiration from the standard VGG16 framework, a strategic reduction in depth was necessitated by the decision to exclude zero-padding. </w:t>
+        <w:t>Like in the Cycks models, the modified VGG models were built both with padding and without padding in order to investigate the effect of padding on the modified VGG models. T</w:t>
       </w:r>
       <w:r>
         <w:rPr>
           <w:lang w:eastAsia="en-US" w:bidi="ar-SA"/>
         </w:rPr>
+        <w:t xml:space="preserve">he </w:t>
+      </w:r>
+      <w:r>
+        <w:rPr>
+          <w:lang w:eastAsia="en-US" w:bidi="ar-SA"/>
+        </w:rPr>
         <w:lastRenderedPageBreak/>
-        <w:t xml:space="preserve">In a standard VGG16 implementation, the repetitive application of 3 </w:t>
+        <w:t>architecture presented in this study draws inspiration from the standard VGG16 framework</w:t>
+      </w:r>
+      <w:r>
+        <w:rPr>
+          <w:lang w:eastAsia="en-US" w:bidi="ar-SA"/>
+        </w:rPr>
+        <w:t xml:space="preserve"> However</w:t>
+      </w:r>
+      <w:r>
+        <w:rPr>
+          <w:lang w:eastAsia="en-US" w:bidi="ar-SA"/>
+        </w:rPr>
+        <w:t xml:space="preserve"> a strategic reduction in depth was necessitated by the decision to exclude zero-padding. In a standard VGG16 implementation, the repetitive application of 3 </w:t>
       </w:r>
       <w:r>
         <w:rPr>
@@ -31339,40 +30524,22 @@
           <w:iCs/>
           <w:lang w:eastAsia="en-US" w:bidi="ar-SA"/>
         </w:rPr>
-        <w:t xml:space="preserve">Where I </w:t>
-      </w:r>
-      <w:proofErr w:type="gramStart"/>
+        <w:t xml:space="preserve">Where I is input size, K is kernel size, P is padding, and </w:t>
+      </w:r>
       <w:r>
         <w:rPr>
           <w:i/>
           <w:iCs/>
           <w:lang w:eastAsia="en-US" w:bidi="ar-SA"/>
         </w:rPr>
-        <w:t>is</w:t>
-      </w:r>
-      <w:proofErr w:type="gramEnd"/>
+        <w:t>S</w:t>
+      </w:r>
       <w:r>
         <w:rPr>
           <w:i/>
           <w:iCs/>
           <w:lang w:eastAsia="en-US" w:bidi="ar-SA"/>
         </w:rPr>
-        <w:t xml:space="preserve"> input size, K is kernel size, P is padding, and </w:t>
-      </w:r>
-      <w:r>
-        <w:rPr>
-          <w:i/>
-          <w:iCs/>
-          <w:lang w:eastAsia="en-US" w:bidi="ar-SA"/>
-        </w:rPr>
-        <w:t>S</w:t>
-      </w:r>
-      <w:r>
-        <w:rPr>
-          <w:i/>
-          <w:iCs/>
-          <w:lang w:eastAsia="en-US" w:bidi="ar-SA"/>
-        </w:rPr>
         <w:t xml:space="preserve"> is stride.</w:t>
       </w:r>
     </w:p>
@@ -31389,19 +30556,61 @@
         <w:rPr>
           <w:lang w:eastAsia="en-US" w:bidi="ar-SA"/>
         </w:rPr>
-        <w:t xml:space="preserve">Under the experimental constraint of P = 0, the spatial resolution diminishes by 2 pixels per layer. Adhering to the full 16-layer depth of the original VGG16 would cause the feature map dimensions to reach a null or non-positive state (specifically 0 </w:t>
+        <w:t xml:space="preserve">Under the experimental constraint of P = 0, the spatial resolution diminishes by 2 pixels per layer. Adhering to the full 16-layer depth of the original VGG16 would cause the feature map dimensions to reach </w:t>
       </w:r>
       <w:r>
         <w:rPr>
           <w:lang w:eastAsia="en-US" w:bidi="ar-SA"/>
         </w:rPr>
+        <w:t>8*8*512</w:t>
+      </w:r>
+      <w:r>
+        <w:rPr>
+          <w:lang w:eastAsia="en-US" w:bidi="ar-SA"/>
+        </w:rPr>
+        <w:t xml:space="preserve"> dimension</w:t>
+      </w:r>
+      <w:r>
+        <w:rPr>
+          <w:lang w:eastAsia="en-US" w:bidi="ar-SA"/>
+        </w:rPr>
+        <w:t xml:space="preserve"> </w:t>
+      </w:r>
+      <w:r>
+        <w:rPr>
+          <w:lang w:eastAsia="en-US" w:bidi="ar-SA"/>
+        </w:rPr>
+        <w:t>by</w:t>
+      </w:r>
+      <w:r>
+        <w:rPr>
+          <w:lang w:eastAsia="en-US" w:bidi="ar-SA"/>
+        </w:rPr>
+        <w:t xml:space="preserve"> the final convolutional stage. </w:t>
+      </w:r>
+      <w:r>
+        <w:rPr>
+          <w:lang w:eastAsia="en-US" w:bidi="ar-SA"/>
+        </w:rPr>
+        <w:t xml:space="preserve">The researcher built a model on this dimension and noted that the model performed very poorly (perhaps due to fewer images in the KOMNET dataset that has 39, 600 images compared to the IMAGENET dataset that has 1.3 million images). </w:t>
+      </w:r>
+      <w:r>
+        <w:rPr>
+          <w:lang w:eastAsia="en-US" w:bidi="ar-SA"/>
+        </w:rPr>
+        <w:t xml:space="preserve">Consequently, the architecture was truncated to maintain a viable latent representation (61 </w:t>
+      </w:r>
+      <w:r>
+        <w:rPr>
+          <w:lang w:eastAsia="en-US" w:bidi="ar-SA"/>
+        </w:rPr>
         <w:t>*</w:t>
       </w:r>
       <w:r>
         <w:rPr>
           <w:lang w:eastAsia="en-US" w:bidi="ar-SA"/>
         </w:rPr>
-        <w:t xml:space="preserve"> 0) well before the final convolutional stage. Consequently, the architecture was truncated to maintain a viable latent representation (61 </w:t>
+        <w:t xml:space="preserve"> 61 </w:t>
       </w:r>
       <w:r>
         <w:rPr>
@@ -31413,32 +30622,30 @@
         <w:rPr>
           <w:lang w:eastAsia="en-US" w:bidi="ar-SA"/>
         </w:rPr>
-        <w:t xml:space="preserve"> 61 </w:t>
+        <w:t xml:space="preserve"> 128) prior to flattening, ensuring that the classification head received a mathematically valid and feature-rich input.</w:t>
       </w:r>
       <w:r>
         <w:rPr>
           <w:lang w:eastAsia="en-US" w:bidi="ar-SA"/>
         </w:rPr>
-        <w:t>*</w:t>
+        <w:t xml:space="preserve"> In simple terms, </w:t>
       </w:r>
       <w:r>
         <w:rPr>
           <w:lang w:eastAsia="en-US" w:bidi="ar-SA"/>
         </w:rPr>
-        <w:t xml:space="preserve"> 128) prior to flattening, ensuring that the classification head received a mathematically valid and feature-rich input.</w:t>
+        <w:t>a lot of</w:t>
       </w:r>
       <w:r>
         <w:rPr>
           <w:lang w:eastAsia="en-US" w:bidi="ar-SA"/>
         </w:rPr>
-        <w:t xml:space="preserve"> In simple terms, all data will be lost if we used 16 layers like in the original VGG16 model.</w:t>
-      </w:r>
-    </w:p>
-    <w:p>
-      <w:pPr>
-        <w:pStyle w:val="BodyText"/>
-        <w:spacing w:line="480" w:lineRule="auto"/>
-        <w:ind w:firstLine="720"/>
+        <w:t xml:space="preserve"> data will be lost if we used 16 layers like in the original VGG16 model.</w:t>
+      </w:r>
+    </w:p>
+    <w:p>
+      <w:pPr>
+        <w:pStyle w:val="Heading3"/>
         <w:rPr>
           <w:lang w:eastAsia="en-US" w:bidi="ar-SA"/>
         </w:rPr>
@@ -31447,45 +30654,37 @@
         <w:rPr>
           <w:lang w:eastAsia="en-US" w:bidi="ar-SA"/>
         </w:rPr>
-        <w:t xml:space="preserve">While extending the architecture to </w:t>
+        <w:t>Modified VGG Architecture</w:t>
       </w:r>
       <w:r>
         <w:rPr>
           <w:lang w:eastAsia="en-US" w:bidi="ar-SA"/>
         </w:rPr>
-        <w:t>include more layers like in the original VGG16 model</w:t>
+        <w:t xml:space="preserve"> (</w:t>
       </w:r>
       <w:r>
         <w:rPr>
           <w:lang w:eastAsia="en-US" w:bidi="ar-SA"/>
         </w:rPr>
-        <w:t xml:space="preserve"> would reduce parameter complexity, it would also result in an additional 9.8% reduction in spatial resolution</w:t>
+        <w:t>VGG</w:t>
       </w:r>
       <w:r>
         <w:rPr>
           <w:lang w:eastAsia="en-US" w:bidi="ar-SA"/>
         </w:rPr>
-        <w:t xml:space="preserve">. </w:t>
+        <w:t xml:space="preserve"> Without </w:t>
       </w:r>
       <w:r>
         <w:rPr>
           <w:lang w:eastAsia="en-US" w:bidi="ar-SA"/>
         </w:rPr>
-        <w:t>To prioritize the retention of fine-grained biometric textures essential for facial recognition, the architecture was truncated at Block 2, ensuring the classification head received the highest possible information density.</w:t>
-      </w:r>
-    </w:p>
-    <w:p>
-      <w:pPr>
-        <w:pStyle w:val="Heading3"/>
+        <w:t>Padding</w:t>
+      </w:r>
+      <w:r>
         <w:rPr>
           <w:lang w:eastAsia="en-US" w:bidi="ar-SA"/>
         </w:rPr>
-      </w:pPr>
-      <w:r>
-        <w:rPr>
-          <w:lang w:eastAsia="en-US" w:bidi="ar-SA"/>
-        </w:rPr>
-        <w:t>Modified VGG Architecture: VGG_No_Padding</w:t>
+        <w:t>)</w:t>
       </w:r>
     </w:p>
     <w:p>
@@ -31576,7 +30775,6 @@
           <w:kern w:val="0"/>
           <w:lang w:eastAsia="en-US" w:bidi="ar-SA"/>
         </w:rPr>
-        <w:lastRenderedPageBreak/>
         <w:t>The backbone of the model is organized into two primary convolutional blocks:</w:t>
       </w:r>
     </w:p>
@@ -31602,6 +30800,7 @@
           <w:kern w:val="0"/>
           <w:lang w:eastAsia="en-US" w:bidi="ar-SA"/>
         </w:rPr>
+        <w:lastRenderedPageBreak/>
         <w:t>Block 1:</w:t>
       </w:r>
       <w:r>
@@ -32000,6 +31199,17 @@
         </w:rPr>
         <w:t xml:space="preserve"> 1.82 GB for weights).</w:t>
       </w:r>
+    </w:p>
+    <w:p>
+      <w:pPr>
+        <w:suppressAutoHyphens w:val="0"/>
+        <w:spacing w:before="100" w:beforeAutospacing="1" w:after="100" w:afterAutospacing="1" w:line="480" w:lineRule="auto"/>
+        <w:rPr>
+          <w:rFonts w:ascii="Times New Roman" w:eastAsia="Times New Roman" w:hAnsi="Times New Roman" w:cs="Times New Roman"/>
+          <w:kern w:val="0"/>
+          <w:lang w:eastAsia="en-US" w:bidi="ar-SA"/>
+        </w:rPr>
+      </w:pPr>
     </w:p>
     <w:p>
       <w:pPr>
@@ -34461,13 +33671,8 @@
       <w:fldChar w:fldCharType="separate"/>
     </w:r>
     <w:r>
-      <w:t>vii</w:t>
+      <w:t>viii</w:t>
     </w:r>
-    <w:proofErr w:type="spellStart"/>
-    <w:r>
-      <w:t>i</w:t>
-    </w:r>
-    <w:proofErr w:type="spellEnd"/>
     <w:r>
       <w:fldChar w:fldCharType="end"/>
     </w:r>
@@ -37043,6 +36248,7 @@
   <w:style w:type="character" w:default="1" w:styleId="DefaultParagraphFont">
     <w:name w:val="Default Paragraph Font"/>
     <w:uiPriority w:val="1"/>
+    <w:semiHidden/>
     <w:unhideWhenUsed/>
   </w:style>
   <w:style w:type="table" w:default="1" w:styleId="TableNormal">

</xml_diff>

<commit_message>
Add changes in the discussion VGG_No_Padding
</commit_message>
<xml_diff>
--- a/mydocuments/Defence1/Sikolia_Thesis_Revision_5.docx
+++ b/mydocuments/Defence1/Sikolia_Thesis_Revision_5.docx
@@ -190,21 +190,7 @@
         <w:rPr>
           <w:rFonts w:ascii="Times New Roman" w:hAnsi="Times New Roman" w:cs="Times New Roman"/>
         </w:rPr>
-        <w:t xml:space="preserve">Wycliffe </w:t>
-      </w:r>
-      <w:proofErr w:type="spellStart"/>
-      <w:r>
-        <w:rPr>
-          <w:rFonts w:ascii="Times New Roman" w:hAnsi="Times New Roman" w:cs="Times New Roman"/>
-        </w:rPr>
-        <w:t>Atswenje</w:t>
-      </w:r>
-      <w:proofErr w:type="spellEnd"/>
-      <w:r>
-        <w:rPr>
-          <w:rFonts w:ascii="Times New Roman" w:hAnsi="Times New Roman" w:cs="Times New Roman"/>
-        </w:rPr>
-        <w:t xml:space="preserve"> Sikolia</w:t>
+        <w:t>Wycliffe Atswenje Sikolia</w:t>
       </w:r>
     </w:p>
     <w:p>
@@ -359,21 +345,7 @@
         <w:rPr>
           <w:rFonts w:ascii="Times New Roman" w:hAnsi="Times New Roman" w:cs="Times New Roman"/>
         </w:rPr>
-        <w:t xml:space="preserve">Wycliffe </w:t>
-      </w:r>
-      <w:proofErr w:type="spellStart"/>
-      <w:r>
-        <w:rPr>
-          <w:rFonts w:ascii="Times New Roman" w:hAnsi="Times New Roman" w:cs="Times New Roman"/>
-        </w:rPr>
-        <w:t>Atswenje</w:t>
-      </w:r>
-      <w:proofErr w:type="spellEnd"/>
-      <w:r>
-        <w:rPr>
-          <w:rFonts w:ascii="Times New Roman" w:hAnsi="Times New Roman" w:cs="Times New Roman"/>
-        </w:rPr>
-        <w:t xml:space="preserve"> Sikolia</w:t>
+        <w:t>Wycliffe Atswenje Sikolia</w:t>
       </w:r>
     </w:p>
     <w:p>
@@ -525,16 +497,8 @@
         <w:rPr>
           <w:rFonts w:ascii="Times New Roman" w:hAnsi="Times New Roman" w:cs="Times New Roman"/>
         </w:rPr>
-        <w:t xml:space="preserve">Dr. Jane </w:t>
-      </w:r>
-      <w:proofErr w:type="spellStart"/>
-      <w:r>
-        <w:rPr>
-          <w:rFonts w:ascii="Times New Roman" w:hAnsi="Times New Roman" w:cs="Times New Roman"/>
-        </w:rPr>
-        <w:t>Aduda</w:t>
-      </w:r>
-      <w:proofErr w:type="spellEnd"/>
+        <w:t>Dr. Jane Aduda</w:t>
+      </w:r>
     </w:p>
     <w:p>
       <w:pPr>
@@ -779,21 +743,7 @@
         <w:rPr>
           <w:rFonts w:ascii="Times New Roman" w:hAnsi="Times New Roman" w:cs="Times New Roman"/>
         </w:rPr>
-        <w:t xml:space="preserve">Special regards to my supervisors Dr. Anthony Kibira Wanjoya and Dr. Jane </w:t>
-      </w:r>
-      <w:proofErr w:type="spellStart"/>
-      <w:r>
-        <w:rPr>
-          <w:rFonts w:ascii="Times New Roman" w:hAnsi="Times New Roman" w:cs="Times New Roman"/>
-        </w:rPr>
-        <w:t>Aduda</w:t>
-      </w:r>
-      <w:proofErr w:type="spellEnd"/>
-      <w:r>
-        <w:rPr>
-          <w:rFonts w:ascii="Times New Roman" w:hAnsi="Times New Roman" w:cs="Times New Roman"/>
-        </w:rPr>
-        <w:t xml:space="preserve"> for their guidance and relentless criticism on this work. Their continuous support, insightful comments, and demand for excellence have played a crucial role in this work. I am particularly grateful to my father whose moral support has been instrumental in my studies. My friends and family have also helped during the course of my studies by reminding me of the need to focus and complete my studies, which is the reason I got this far. Their words of positive affirmation gave me a shoulder to lean on when the going got difficult. I would also like to thank members of the department of statistics and actuarial sciences from the Jomo Kenyatta University of Agriculture and Technology for their support in my studies. Most importantly I would like to thank the almighty God </w:t>
+        <w:t xml:space="preserve">Special regards to my supervisors Dr. Anthony Kibira Wanjoya and Dr. Jane Aduda for their guidance and relentless criticism on this work. Their continuous support, insightful comments, and demand for excellence have played a crucial role in this work. I am particularly grateful to my father whose moral support has been instrumental in my studies. My friends and family have also helped during the course of my studies by reminding me of the need to focus and complete my studies, which is the reason I got this far. Their words of positive affirmation gave me a shoulder to lean on when the going got difficult. I would also like to thank members of the department of statistics and actuarial sciences from the Jomo Kenyatta University of Agriculture and Technology for their support in my studies. Most importantly I would like to thank the almighty God </w:t>
       </w:r>
       <w:r>
         <w:rPr>
@@ -974,21 +924,7 @@
         <w:rPr>
           <w:rFonts w:ascii="Times New Roman" w:hAnsi="Times New Roman" w:cs="Times New Roman"/>
         </w:rPr>
-        <w:t xml:space="preserve">conduct a case study at </w:t>
-      </w:r>
-      <w:proofErr w:type="spellStart"/>
-      <w:r>
-        <w:rPr>
-          <w:rFonts w:ascii="Times New Roman" w:hAnsi="Times New Roman" w:cs="Times New Roman"/>
-        </w:rPr>
-        <w:t>Samasource</w:t>
-      </w:r>
-      <w:proofErr w:type="spellEnd"/>
-      <w:r>
-        <w:rPr>
-          <w:rFonts w:ascii="Times New Roman" w:hAnsi="Times New Roman" w:cs="Times New Roman"/>
-        </w:rPr>
-        <w:t xml:space="preserve"> Kenya Limited using </w:t>
+        <w:t xml:space="preserve">conduct a case study at Samasource Kenya Limited using </w:t>
       </w:r>
       <w:r>
         <w:rPr>
@@ -5757,14 +5693,7 @@
         <w:rPr>
           <w:rFonts w:ascii="Times New Roman" w:hAnsi="Times New Roman" w:cs="Times New Roman"/>
         </w:rPr>
-        <w:t>……………………………</w:t>
-      </w:r>
-      <w:proofErr w:type="gramStart"/>
-      <w:r>
-        <w:rPr>
-          <w:rFonts w:ascii="Times New Roman" w:hAnsi="Times New Roman" w:cs="Times New Roman"/>
-        </w:rPr>
-        <w:t>…</w:t>
+        <w:t>………………………………</w:t>
       </w:r>
       <w:r>
         <w:rPr>
@@ -5772,7 +5701,6 @@
         </w:rPr>
         <w:t>..</w:t>
       </w:r>
-      <w:proofErr w:type="gramEnd"/>
       <w:r>
         <w:rPr>
           <w:rFonts w:ascii="Times New Roman" w:hAnsi="Times New Roman" w:cs="Times New Roman"/>
@@ -5810,14 +5738,12 @@
         </w:rPr>
         <w:t>……………………………</w:t>
       </w:r>
-      <w:proofErr w:type="gramStart"/>
       <w:r>
         <w:rPr>
           <w:rFonts w:ascii="Times New Roman" w:hAnsi="Times New Roman" w:cs="Times New Roman"/>
         </w:rPr>
         <w:t>…..</w:t>
       </w:r>
-      <w:proofErr w:type="gramEnd"/>
       <w:r>
         <w:rPr>
           <w:rFonts w:ascii="Times New Roman" w:hAnsi="Times New Roman" w:cs="Times New Roman"/>
@@ -6198,21 +6124,7 @@
         </w:rPr>
         <w:lastRenderedPageBreak/>
         <w:tab/>
-        <w:t xml:space="preserve">Indeed, huge technology companies such as Google and Apple have developed world class applications that have enabled them to enjoy a competitive advantage over other companies.  These data science applications (from Google and Apple) have been made possible by techniques such as support vector machines, random forests, decision trees, and neural networks. The term neural network refers to a connection of layers composed of units called </w:t>
-      </w:r>
-      <w:proofErr w:type="spellStart"/>
-      <w:r>
-        <w:rPr>
-          <w:rFonts w:ascii="Times New Roman" w:hAnsi="Times New Roman" w:cs="Times New Roman"/>
-        </w:rPr>
-        <w:t>perceptrons</w:t>
-      </w:r>
-      <w:proofErr w:type="spellEnd"/>
-      <w:r>
-        <w:rPr>
-          <w:rFonts w:ascii="Times New Roman" w:hAnsi="Times New Roman" w:cs="Times New Roman"/>
-        </w:rPr>
-        <w:t xml:space="preserve">, which is made up of an input layer (the predictor variables), a processing unit, and an output layer (the response variable). The processing unit could comprise one or more hidden layers. That said, deep learning occurs when a neural network is created with more than one hidden layer. Having defined deep learning, it is imperative to highlight that decision trees and support vector machines were more famous than neural networks. However, the neural networks were brought to fame when Geoffrey Hinton et al (2006) developed a neural network that predicted handwritten digits with an accuracy of 98%. </w:t>
+        <w:t xml:space="preserve">Indeed, huge technology companies such as Google and Apple have developed world class applications that have enabled them to enjoy a competitive advantage over other companies.  These data science applications (from Google and Apple) have been made possible by techniques such as support vector machines, random forests, decision trees, and neural networks. The term neural network refers to a connection of layers composed of units called perceptrons, which is made up of an input layer (the predictor variables), a processing unit, and an output layer (the response variable). The processing unit could comprise one or more hidden layers. That said, deep learning occurs when a neural network is created with more than one hidden layer. Having defined deep learning, it is imperative to highlight that decision trees and support vector machines were more famous than neural networks. However, the neural networks were brought to fame when Geoffrey Hinton et al (2006) developed a neural network that predicted handwritten digits with an accuracy of 98%. </w:t>
       </w:r>
     </w:p>
     <w:p>
@@ -6257,49 +6169,7 @@
           <w:rFonts w:ascii="Times New Roman" w:hAnsi="Times New Roman" w:cs="Times New Roman"/>
         </w:rPr>
         <w:tab/>
-        <w:t xml:space="preserve">Researchers in facial recognition have developed solutions such as </w:t>
-      </w:r>
-      <w:proofErr w:type="spellStart"/>
-      <w:r>
-        <w:rPr>
-          <w:rFonts w:ascii="Times New Roman" w:hAnsi="Times New Roman" w:cs="Times New Roman"/>
-        </w:rPr>
-        <w:t>FaceNet</w:t>
-      </w:r>
-      <w:proofErr w:type="spellEnd"/>
-      <w:r>
-        <w:rPr>
-          <w:rFonts w:ascii="Times New Roman" w:hAnsi="Times New Roman" w:cs="Times New Roman"/>
-        </w:rPr>
-        <w:t xml:space="preserve">, VGGFACE, VGG16, VGG19, </w:t>
-      </w:r>
-      <w:proofErr w:type="spellStart"/>
-      <w:r>
-        <w:rPr>
-          <w:rFonts w:ascii="Times New Roman" w:hAnsi="Times New Roman" w:cs="Times New Roman"/>
-        </w:rPr>
-        <w:t>OpenFace</w:t>
-      </w:r>
-      <w:proofErr w:type="spellEnd"/>
-      <w:r>
-        <w:rPr>
-          <w:rFonts w:ascii="Times New Roman" w:hAnsi="Times New Roman" w:cs="Times New Roman"/>
-        </w:rPr>
-        <w:t xml:space="preserve">, and </w:t>
-      </w:r>
-      <w:proofErr w:type="spellStart"/>
-      <w:r>
-        <w:rPr>
-          <w:rFonts w:ascii="Times New Roman" w:hAnsi="Times New Roman" w:cs="Times New Roman"/>
-        </w:rPr>
-        <w:t>DeepFace</w:t>
-      </w:r>
-      <w:proofErr w:type="spellEnd"/>
-      <w:r>
-        <w:rPr>
-          <w:rFonts w:ascii="Times New Roman" w:hAnsi="Times New Roman" w:cs="Times New Roman"/>
-        </w:rPr>
-        <w:t xml:space="preserve">. Even though existing solutions on facial recognition </w:t>
+        <w:t xml:space="preserve">Researchers in facial recognition have developed solutions such as FaceNet, VGGFACE, VGG16, VGG19, OpenFace, and DeepFace. Even though existing solutions on facial recognition </w:t>
       </w:r>
       <w:r>
         <w:rPr>
@@ -6336,16 +6206,8 @@
         <w:rPr>
           <w:rFonts w:ascii="Times New Roman" w:hAnsi="Times New Roman" w:cs="Times New Roman"/>
         </w:rPr>
-        <w:t xml:space="preserve">at </w:t>
-      </w:r>
-      <w:proofErr w:type="spellStart"/>
-      <w:r>
-        <w:rPr>
-          <w:rFonts w:ascii="Times New Roman" w:hAnsi="Times New Roman" w:cs="Times New Roman"/>
-        </w:rPr>
-        <w:t>Samasource</w:t>
-      </w:r>
-      <w:proofErr w:type="spellEnd"/>
+        <w:t>at Samasource</w:t>
+      </w:r>
       <w:r>
         <w:rPr>
           <w:rFonts w:ascii="Times New Roman" w:hAnsi="Times New Roman" w:cs="Times New Roman"/>
@@ -6746,35 +6608,7 @@
         <w:rPr>
           <w:rFonts w:ascii="Times New Roman" w:hAnsi="Times New Roman" w:cs="Times New Roman"/>
         </w:rPr>
-        <w:t xml:space="preserve">2002). It is important to highlight that there are several methods that could be used for detecting faces from images. These methods include </w:t>
-      </w:r>
-      <w:proofErr w:type="gramStart"/>
-      <w:r>
-        <w:rPr>
-          <w:rFonts w:ascii="Times New Roman" w:hAnsi="Times New Roman" w:cs="Times New Roman"/>
-        </w:rPr>
-        <w:t>knowledge based</w:t>
-      </w:r>
-      <w:proofErr w:type="gramEnd"/>
-      <w:r>
-        <w:rPr>
-          <w:rFonts w:ascii="Times New Roman" w:hAnsi="Times New Roman" w:cs="Times New Roman"/>
-        </w:rPr>
-        <w:t xml:space="preserve"> methods, feature invariant approaches, template matching methods, and </w:t>
-      </w:r>
-      <w:proofErr w:type="gramStart"/>
-      <w:r>
-        <w:rPr>
-          <w:rFonts w:ascii="Times New Roman" w:hAnsi="Times New Roman" w:cs="Times New Roman"/>
-        </w:rPr>
-        <w:t>appearance based</w:t>
-      </w:r>
-      <w:proofErr w:type="gramEnd"/>
-      <w:r>
-        <w:rPr>
-          <w:rFonts w:ascii="Times New Roman" w:hAnsi="Times New Roman" w:cs="Times New Roman"/>
-        </w:rPr>
-        <w:t xml:space="preserve"> methods. Indeed, the mentioned methods are important when detecting faces from images, but all these methods are accompanied by several challenges. This owes to the reality that Yang </w:t>
+        <w:t xml:space="preserve">2002). It is important to highlight that there are several methods that could be used for detecting faces from images. These methods include knowledge based methods, feature invariant approaches, template matching methods, and appearance based methods. Indeed, the mentioned methods are important when detecting faces from images, but all these methods are accompanied by several challenges. This owes to the reality that Yang </w:t>
       </w:r>
       <w:r>
         <w:rPr>
@@ -6911,21 +6745,7 @@
         <w:rPr>
           <w:rFonts w:ascii="Times New Roman" w:hAnsi="Times New Roman" w:cs="Times New Roman"/>
         </w:rPr>
-        <w:t xml:space="preserve">A huge chunk of solutions in computer vision make the assumption that there is a single illuminant lighting in an image. Regardless, that is not always the case. As evidenced, Finlayson and </w:t>
-      </w:r>
-      <w:proofErr w:type="spellStart"/>
-      <w:r>
-        <w:rPr>
-          <w:rFonts w:ascii="Times New Roman" w:hAnsi="Times New Roman" w:cs="Times New Roman"/>
-        </w:rPr>
-        <w:t>Fredembach</w:t>
-      </w:r>
-      <w:proofErr w:type="spellEnd"/>
-      <w:r>
-        <w:rPr>
-          <w:rFonts w:ascii="Times New Roman" w:hAnsi="Times New Roman" w:cs="Times New Roman"/>
-        </w:rPr>
-        <w:t xml:space="preserve"> (2007) reveal that images always contain shadows depending on the positions from different lights that affect an image. Important to the debate is the truth that Finlayson (2018) proposes a solution to the problems arising from illumination in computer vision.</w:t>
+        <w:t>A huge chunk of solutions in computer vision make the assumption that there is a single illuminant lighting in an image. Regardless, that is not always the case. As evidenced, Finlayson and Fredembach (2007) reveal that images always contain shadows depending on the positions from different lights that affect an image. Important to the debate is the truth that Finlayson (2018) proposes a solution to the problems arising from illumination in computer vision.</w:t>
       </w:r>
     </w:p>
     <w:p>
@@ -6966,21 +6786,7 @@
           <w:rFonts w:ascii="Times New Roman" w:hAnsi="Times New Roman" w:cs="Times New Roman"/>
         </w:rPr>
         <w:tab/>
-        <w:t xml:space="preserve">This method relies on a set of rules to detect whether there is a human face in an image. The method captures the human knowledge of faces and interprets the knowledge into a set of rules. For instance, the face has two symmetric eyes; the eye areas are darker than the cheeks, the distance between eyes, and the difference in colors between the eyes and cheeks. It is notable that using the knowledge base method for face detection could be difficult because it is difficult to develop a set of rules that can correctly identify a human face. This owes to the fact that there could be very many false positives if the rules are too general. Likewise, there could be many false negatives if the rules are too strict. This drawback has hampered researchers from using this technique. However, Chen et al., (2001) used the </w:t>
-      </w:r>
-      <w:proofErr w:type="gramStart"/>
-      <w:r>
-        <w:rPr>
-          <w:rFonts w:ascii="Times New Roman" w:hAnsi="Times New Roman" w:cs="Times New Roman"/>
-        </w:rPr>
-        <w:t>knowledge based</w:t>
-      </w:r>
-      <w:proofErr w:type="gramEnd"/>
-      <w:r>
-        <w:rPr>
-          <w:rFonts w:ascii="Times New Roman" w:hAnsi="Times New Roman" w:cs="Times New Roman"/>
-        </w:rPr>
-        <w:t xml:space="preserve"> method to detect faces in an image with an accuracy of 94%. One disadvantage with this method is that it is not efficient.</w:t>
+        <w:t>This method relies on a set of rules to detect whether there is a human face in an image. The method captures the human knowledge of faces and interprets the knowledge into a set of rules. For instance, the face has two symmetric eyes; the eye areas are darker than the cheeks, the distance between eyes, and the difference in colors between the eyes and cheeks. It is notable that using the knowledge base method for face detection could be difficult because it is difficult to develop a set of rules that can correctly identify a human face. This owes to the fact that there could be very many false positives if the rules are too general. Likewise, there could be many false negatives if the rules are too strict. This drawback has hampered researchers from using this technique. However, Chen et al., (2001) used the knowledge based method to detect faces in an image with an accuracy of 94%. One disadvantage with this method is that it is not efficient.</w:t>
       </w:r>
     </w:p>
     <w:p>
@@ -7009,30 +6815,8 @@
           <w:rFonts w:ascii="Times New Roman" w:hAnsi="Times New Roman" w:cs="Times New Roman"/>
         </w:rPr>
         <w:tab/>
-        <w:t xml:space="preserve">The feature invariant method of face detection is a little bit different from the </w:t>
-      </w:r>
-      <w:proofErr w:type="spellStart"/>
-      <w:r>
-        <w:rPr>
-          <w:rFonts w:ascii="Times New Roman" w:hAnsi="Times New Roman" w:cs="Times New Roman"/>
-        </w:rPr>
-        <w:t>knowedge</w:t>
-      </w:r>
-      <w:proofErr w:type="spellEnd"/>
-      <w:r>
-        <w:rPr>
-          <w:rFonts w:ascii="Times New Roman" w:hAnsi="Times New Roman" w:cs="Times New Roman"/>
-        </w:rPr>
-        <w:t xml:space="preserve"> based method because it uses statistical methods on facial landmarks. </w:t>
-      </w:r>
-      <w:proofErr w:type="spellStart"/>
-      <w:r>
-        <w:rPr>
-          <w:rFonts w:ascii="Times New Roman" w:hAnsi="Times New Roman" w:cs="Times New Roman"/>
-        </w:rPr>
-        <w:t>Celiktutan</w:t>
-      </w:r>
-      <w:proofErr w:type="spellEnd"/>
+        <w:t>The feature invariant method of face detection is a little bit different from the knowedge based method because it uses statistical methods on facial landmarks. Celiktutan</w:t>
+      </w:r>
       <w:r>
         <w:rPr>
           <w:rFonts w:ascii="Times New Roman" w:hAnsi="Times New Roman" w:cs="Times New Roman"/>
@@ -7043,35 +6827,7 @@
         <w:rPr>
           <w:rFonts w:ascii="Times New Roman" w:hAnsi="Times New Roman" w:cs="Times New Roman"/>
         </w:rPr>
-        <w:t xml:space="preserve"> (2013) define a face landmark as a prominent feature that can play a discriminative role or can serve as anchor points in face detection. Examples of such landmarks include the eye corners, the nose tip, nostril corners, mouth corners, end points of eyebrow arcs, ear lobes, and the chin. This approach works by detecting facial landmarks, texture and skin color before using a statistical model to identify the presence of a face in an image. Critical to the discussion is the reality that different authors have used the feature invariant approach for face detection. For instance, Kapil and Jain (2013) compared texture based to the structure and </w:t>
-      </w:r>
-      <w:proofErr w:type="gramStart"/>
-      <w:r>
-        <w:rPr>
-          <w:rFonts w:ascii="Times New Roman" w:hAnsi="Times New Roman" w:cs="Times New Roman"/>
-        </w:rPr>
-        <w:t>shape based</w:t>
-      </w:r>
-      <w:proofErr w:type="gramEnd"/>
-      <w:r>
-        <w:rPr>
-          <w:rFonts w:ascii="Times New Roman" w:hAnsi="Times New Roman" w:cs="Times New Roman"/>
-        </w:rPr>
-        <w:t xml:space="preserve"> feature invariant based methods and concluded that the </w:t>
-      </w:r>
-      <w:proofErr w:type="gramStart"/>
-      <w:r>
-        <w:rPr>
-          <w:rFonts w:ascii="Times New Roman" w:hAnsi="Times New Roman" w:cs="Times New Roman"/>
-        </w:rPr>
-        <w:t>texture based</w:t>
-      </w:r>
-      <w:proofErr w:type="gramEnd"/>
-      <w:r>
-        <w:rPr>
-          <w:rFonts w:ascii="Times New Roman" w:hAnsi="Times New Roman" w:cs="Times New Roman"/>
-        </w:rPr>
-        <w:t xml:space="preserve"> method is more accurate. However, the authors argue that feature invariant based methods are computationally expensive.</w:t>
+        <w:t xml:space="preserve"> (2013) define a face landmark as a prominent feature that can play a discriminative role or can serve as anchor points in face detection. Examples of such landmarks include the eye corners, the nose tip, nostril corners, mouth corners, end points of eyebrow arcs, ear lobes, and the chin. This approach works by detecting facial landmarks, texture and skin color before using a statistical model to identify the presence of a face in an image. Critical to the discussion is the reality that different authors have used the feature invariant approach for face detection. For instance, Kapil and Jain (2013) compared texture based to the structure and shape based feature invariant based methods and concluded that the texture based method is more accurate. However, the authors argue that feature invariant based methods are computationally expensive.</w:t>
       </w:r>
     </w:p>
     <w:p>
@@ -7102,35 +6858,7 @@
           <w:rFonts w:ascii="Times New Roman" w:hAnsi="Times New Roman" w:cs="Times New Roman"/>
         </w:rPr>
         <w:tab/>
-        <w:t xml:space="preserve">This method functions to extract facial image features to gain the Euclidean distance value served as input face comparison value of the users’ faces stored in the database (Hidayat, Wibowo, Satria, </w:t>
-      </w:r>
-      <w:proofErr w:type="spellStart"/>
-      <w:r>
-        <w:rPr>
-          <w:rFonts w:ascii="Times New Roman" w:hAnsi="Times New Roman" w:cs="Times New Roman"/>
-        </w:rPr>
-        <w:t>Winursito</w:t>
-      </w:r>
-      <w:proofErr w:type="spellEnd"/>
-      <w:r>
-        <w:rPr>
-          <w:rFonts w:ascii="Times New Roman" w:hAnsi="Times New Roman" w:cs="Times New Roman"/>
-        </w:rPr>
-        <w:t xml:space="preserve">, 2021). Simply put, the </w:t>
-      </w:r>
-      <w:proofErr w:type="gramStart"/>
-      <w:r>
-        <w:rPr>
-          <w:rFonts w:ascii="Times New Roman" w:hAnsi="Times New Roman" w:cs="Times New Roman"/>
-        </w:rPr>
-        <w:t>template based</w:t>
-      </w:r>
-      <w:proofErr w:type="gramEnd"/>
-      <w:r>
-        <w:rPr>
-          <w:rFonts w:ascii="Times New Roman" w:hAnsi="Times New Roman" w:cs="Times New Roman"/>
-        </w:rPr>
-        <w:t xml:space="preserve"> approach transforms an image into geometric primitives like curves and points. This is done by identifying distinctive features like the eye, the nose, the chin, and the mouth before measuring their relative positions, widths and other parameters of the distinctive features. Features extracted from an image are then compared to known features of a human face to check whether an image is that of a human face. For further elucidation the eye, nose, mouth and the chin are compared to that of a human face. If the features obtained from the image match those of a human face, then the object in question is declared to be a human face. It is vital to note that Hidayat, et al., (2021) assert that the template approach of facial recognition is known to have a lighter computational load than other methods because it does not require features from the entire face. </w:t>
+        <w:t xml:space="preserve">This method functions to extract facial image features to gain the Euclidean distance value served as input face comparison value of the users’ faces stored in the database (Hidayat, Wibowo, Satria, Winursito, 2021). Simply put, the template based approach transforms an image into geometric primitives like curves and points. This is done by identifying distinctive features like the eye, the nose, the chin, and the mouth before measuring their relative positions, widths and other parameters of the distinctive features. Features extracted from an image are then compared to known features of a human face to check whether an image is that of a human face. For further elucidation the eye, nose, mouth and the chin are compared to that of a human face. If the features obtained from the image match those of a human face, then the object in question is declared to be a human face. It is vital to note that Hidayat, et al., (2021) assert that the template approach of facial recognition is known to have a lighter computational load than other methods because it does not require features from the entire face. </w:t>
       </w:r>
     </w:p>
     <w:p>
@@ -7159,56 +6887,7 @@
         </w:rPr>
         <w:lastRenderedPageBreak/>
         <w:tab/>
-        <w:t xml:space="preserve">The idea behind using Appearance methods for face detection relies on the linear algebra concept of subspaces. This approach of facial detection relies on the entire face, which is taken in as an input image data. The data collected from the input image is processed into a </w:t>
-      </w:r>
-      <w:proofErr w:type="gramStart"/>
-      <w:r>
-        <w:rPr>
-          <w:rFonts w:ascii="Times New Roman" w:hAnsi="Times New Roman" w:cs="Times New Roman"/>
-        </w:rPr>
-        <w:t>two dimensional</w:t>
-      </w:r>
-      <w:proofErr w:type="gramEnd"/>
-      <w:r>
-        <w:rPr>
-          <w:rFonts w:ascii="Times New Roman" w:hAnsi="Times New Roman" w:cs="Times New Roman"/>
-        </w:rPr>
-        <w:t xml:space="preserve"> pattern that is later used to decide whether there is a human face in an image. Critical to the discussion is the fact that this technique finds the best facial features because it rejects redundant information and keeps important information. Vital to the discussion is the fact that different authors have used the </w:t>
-      </w:r>
-      <w:proofErr w:type="gramStart"/>
-      <w:r>
-        <w:rPr>
-          <w:rFonts w:ascii="Times New Roman" w:hAnsi="Times New Roman" w:cs="Times New Roman"/>
-        </w:rPr>
-        <w:t>appearance based</w:t>
-      </w:r>
-      <w:proofErr w:type="gramEnd"/>
-      <w:r>
-        <w:rPr>
-          <w:rFonts w:ascii="Times New Roman" w:hAnsi="Times New Roman" w:cs="Times New Roman"/>
-        </w:rPr>
-        <w:t xml:space="preserve"> technique successfully. For example, Rusia and Singh (2023) used the </w:t>
-      </w:r>
-      <w:proofErr w:type="gramStart"/>
-      <w:r>
-        <w:rPr>
-          <w:rFonts w:ascii="Times New Roman" w:hAnsi="Times New Roman" w:cs="Times New Roman"/>
-        </w:rPr>
-        <w:t>appearance based</w:t>
-      </w:r>
-      <w:proofErr w:type="gramEnd"/>
-      <w:r>
-        <w:rPr>
-          <w:rFonts w:ascii="Times New Roman" w:hAnsi="Times New Roman" w:cs="Times New Roman"/>
-        </w:rPr>
-        <w:t xml:space="preserve"> technique of facial recognition and examined some of the face identity threats faced by this technique. Regardless, Yan et al., (2018) argues that </w:t>
-      </w:r>
-      <w:proofErr w:type="gramStart"/>
-      <w:r>
-        <w:rPr>
-          <w:rFonts w:ascii="Times New Roman" w:hAnsi="Times New Roman" w:cs="Times New Roman"/>
-        </w:rPr>
-        <w:t>appearance</w:t>
+        <w:t>The idea behind using Appearance methods for face detection relies on the linear algebra concept of subspaces. This approach of facial detection relies on the entire face, which is taken in as an input image data. The data collected from the input image is processed into a two dimensional pattern that is later used to decide whether there is a human face in an image. Critical to the discussion is the fact that this technique finds the best facial features because it rejects redundant information and keeps important information. Vital to the discussion is the fact that different authors have used the appearance based technique successfully. For example, Rusia and Singh (2023) used the appearance based technique of facial recognition and examined some of the face identity threats faced by this technique. Regardless, Yan et al., (2018) argues that appearance</w:t>
       </w:r>
       <w:r>
         <w:rPr>
@@ -7220,14 +6899,7 @@
         <w:rPr>
           <w:rFonts w:ascii="Times New Roman" w:hAnsi="Times New Roman" w:cs="Times New Roman"/>
         </w:rPr>
-        <w:t>based</w:t>
-      </w:r>
-      <w:proofErr w:type="gramEnd"/>
-      <w:r>
-        <w:rPr>
-          <w:rFonts w:ascii="Times New Roman" w:hAnsi="Times New Roman" w:cs="Times New Roman"/>
-        </w:rPr>
-        <w:t xml:space="preserve"> methods are computationally expensive and have difficulty handling substantial amounts of facial variations. </w:t>
+        <w:t xml:space="preserve">based methods are computationally expensive and have difficulty handling substantial amounts of facial variations. </w:t>
       </w:r>
     </w:p>
     <w:p>
@@ -7253,49 +6925,7 @@
           <w:rFonts w:ascii="Times New Roman" w:hAnsi="Times New Roman" w:cs="Times New Roman"/>
         </w:rPr>
         <w:tab/>
-        <w:t xml:space="preserve">As already mentioned, facial recognition is a two-step process with the first face being the face detection and the second step being the face identification step. The face identification phase is where facial characteristics are extracted from a detected face and compared to a known face to confirm if the facial characteristics match those of the known face. Evidence from literature suggests that the template approach and the </w:t>
-      </w:r>
-      <w:proofErr w:type="gramStart"/>
-      <w:r>
-        <w:rPr>
-          <w:rFonts w:ascii="Times New Roman" w:hAnsi="Times New Roman" w:cs="Times New Roman"/>
-        </w:rPr>
-        <w:t>appearance based</w:t>
-      </w:r>
-      <w:proofErr w:type="gramEnd"/>
-      <w:r>
-        <w:rPr>
-          <w:rFonts w:ascii="Times New Roman" w:hAnsi="Times New Roman" w:cs="Times New Roman"/>
-        </w:rPr>
-        <w:t xml:space="preserve"> approaches are not only used in face detection but could also be used in face identification. As evidenced, Proyecto (2010) discusses template matching and the </w:t>
-      </w:r>
-      <w:proofErr w:type="gramStart"/>
-      <w:r>
-        <w:rPr>
-          <w:rFonts w:ascii="Times New Roman" w:hAnsi="Times New Roman" w:cs="Times New Roman"/>
-        </w:rPr>
-        <w:t>appearance based</w:t>
-      </w:r>
-      <w:proofErr w:type="gramEnd"/>
-      <w:r>
-        <w:rPr>
-          <w:rFonts w:ascii="Times New Roman" w:hAnsi="Times New Roman" w:cs="Times New Roman"/>
-        </w:rPr>
-        <w:t xml:space="preserve"> technique in both face detection and face identification. It is important to highlight that different publications on techniques that are used in face identification exist.  Apart from template matching and </w:t>
-      </w:r>
-      <w:proofErr w:type="gramStart"/>
-      <w:r>
-        <w:rPr>
-          <w:rFonts w:ascii="Times New Roman" w:hAnsi="Times New Roman" w:cs="Times New Roman"/>
-        </w:rPr>
-        <w:t>appearance based</w:t>
-      </w:r>
-      <w:proofErr w:type="gramEnd"/>
-      <w:r>
-        <w:rPr>
-          <w:rFonts w:ascii="Times New Roman" w:hAnsi="Times New Roman" w:cs="Times New Roman"/>
-        </w:rPr>
-        <w:t xml:space="preserve"> methods, statistical approaches are also used in face identification.</w:t>
+        <w:t>As already mentioned, facial recognition is a two-step process with the first face being the face detection and the second step being the face identification step. The face identification phase is where facial characteristics are extracted from a detected face and compared to a known face to confirm if the facial characteristics match those of the known face. Evidence from literature suggests that the template approach and the appearance based approaches are not only used in face detection but could also be used in face identification. As evidenced, Proyecto (2010) discusses template matching and the appearance based technique in both face detection and face identification. It is important to highlight that different publications on techniques that are used in face identification exist.  Apart from template matching and appearance based methods, statistical approaches are also used in face identification.</w:t>
       </w:r>
     </w:p>
     <w:p>
@@ -7526,105 +7156,7 @@
           <w:rFonts w:ascii="Times New Roman" w:hAnsi="Times New Roman" w:cs="Times New Roman"/>
         </w:rPr>
         <w:tab/>
-        <w:t xml:space="preserve">It is imperative to mention that several authors have investigated the </w:t>
-      </w:r>
-      <w:proofErr w:type="gramStart"/>
-      <w:r>
-        <w:rPr>
-          <w:rFonts w:ascii="Times New Roman" w:hAnsi="Times New Roman" w:cs="Times New Roman"/>
-        </w:rPr>
-        <w:t>appearance based</w:t>
-      </w:r>
-      <w:proofErr w:type="gramEnd"/>
-      <w:r>
-        <w:rPr>
-          <w:rFonts w:ascii="Times New Roman" w:hAnsi="Times New Roman" w:cs="Times New Roman"/>
-        </w:rPr>
-        <w:t xml:space="preserve"> method for facial recognition. For instance, </w:t>
-      </w:r>
-      <w:proofErr w:type="spellStart"/>
-      <w:r>
-        <w:rPr>
-          <w:rFonts w:ascii="Times New Roman" w:hAnsi="Times New Roman" w:cs="Times New Roman"/>
-        </w:rPr>
-        <w:t>Struc</w:t>
-      </w:r>
-      <w:proofErr w:type="spellEnd"/>
-      <w:r>
-        <w:rPr>
-          <w:rFonts w:ascii="Times New Roman" w:hAnsi="Times New Roman" w:cs="Times New Roman"/>
-        </w:rPr>
-        <w:t xml:space="preserve"> and </w:t>
-      </w:r>
-      <w:proofErr w:type="spellStart"/>
-      <w:r>
-        <w:rPr>
-          <w:rFonts w:ascii="Times New Roman" w:hAnsi="Times New Roman" w:cs="Times New Roman"/>
-        </w:rPr>
-        <w:t>Pavesic</w:t>
-      </w:r>
-      <w:proofErr w:type="spellEnd"/>
-      <w:r>
-        <w:rPr>
-          <w:rFonts w:ascii="Times New Roman" w:hAnsi="Times New Roman" w:cs="Times New Roman"/>
-        </w:rPr>
-        <w:t xml:space="preserve"> (2009) examine the performance of </w:t>
-      </w:r>
-      <w:proofErr w:type="gramStart"/>
-      <w:r>
-        <w:rPr>
-          <w:rFonts w:ascii="Times New Roman" w:hAnsi="Times New Roman" w:cs="Times New Roman"/>
-        </w:rPr>
-        <w:t>appearance based</w:t>
-      </w:r>
-      <w:proofErr w:type="gramEnd"/>
-      <w:r>
-        <w:rPr>
-          <w:rFonts w:ascii="Times New Roman" w:hAnsi="Times New Roman" w:cs="Times New Roman"/>
-        </w:rPr>
-        <w:t xml:space="preserve"> methods subject to different environmental factors and conclude that the linear discriminant analysis produces the best results across different environmental conditions. Wu et al., (2018) also debate </w:t>
-      </w:r>
-      <w:proofErr w:type="gramStart"/>
-      <w:r>
-        <w:rPr>
-          <w:rFonts w:ascii="Times New Roman" w:hAnsi="Times New Roman" w:cs="Times New Roman"/>
-        </w:rPr>
-        <w:t>appearance based</w:t>
-      </w:r>
-      <w:proofErr w:type="gramEnd"/>
-      <w:r>
-        <w:rPr>
-          <w:rFonts w:ascii="Times New Roman" w:hAnsi="Times New Roman" w:cs="Times New Roman"/>
-        </w:rPr>
-        <w:t xml:space="preserve"> methods of facial recognition by examining facial expressions using the technique in question. The authors controlled for lighting conditions using a histogram equalization technique and a brightness preserving technique and concluded that the brightness preserving technique performs better than the histogram equalization technique. </w:t>
-      </w:r>
-      <w:proofErr w:type="spellStart"/>
-      <w:r>
-        <w:rPr>
-          <w:rFonts w:ascii="Times New Roman" w:hAnsi="Times New Roman" w:cs="Times New Roman"/>
-        </w:rPr>
-        <w:t>Broti</w:t>
-      </w:r>
-      <w:proofErr w:type="spellEnd"/>
-      <w:r>
-        <w:rPr>
-          <w:rFonts w:ascii="Times New Roman" w:hAnsi="Times New Roman" w:cs="Times New Roman"/>
-        </w:rPr>
-        <w:t xml:space="preserve"> (2019) also examines </w:t>
-      </w:r>
-      <w:proofErr w:type="gramStart"/>
-      <w:r>
-        <w:rPr>
-          <w:rFonts w:ascii="Times New Roman" w:hAnsi="Times New Roman" w:cs="Times New Roman"/>
-        </w:rPr>
-        <w:t>appearance based</w:t>
-      </w:r>
-      <w:proofErr w:type="gramEnd"/>
-      <w:r>
-        <w:rPr>
-          <w:rFonts w:ascii="Times New Roman" w:hAnsi="Times New Roman" w:cs="Times New Roman"/>
-        </w:rPr>
-        <w:t xml:space="preserve"> methods of facial recognition by discussing the principal components analysis, independent component analysis, linear discriminant analysis methods used in facial recognition. A drawback for this method is that it is challenging to find an efficient combination of dimensionality reduction technique and classifier. </w:t>
+        <w:t xml:space="preserve">It is imperative to mention that several authors have investigated the appearance based method for facial recognition. For instance, Struc and Pavesic (2009) examine the performance of appearance based methods subject to different environmental factors and conclude that the linear discriminant analysis produces the best results across different environmental conditions. Wu et al., (2018) also debate appearance based methods of facial recognition by examining facial expressions using the technique in question. The authors controlled for lighting conditions using a histogram equalization technique and a brightness preserving technique and concluded that the brightness preserving technique performs better than the histogram equalization technique. Broti (2019) also examines appearance based methods of facial recognition by discussing the principal components analysis, independent component analysis, linear discriminant analysis methods used in facial recognition. A drawback for this method is that it is challenging to find an efficient combination of dimensionality reduction technique and classifier. </w:t>
       </w:r>
       <w:bookmarkStart w:id="27" w:name="_heading=h.ljdder1spgws"/>
       <w:bookmarkEnd w:id="27"/>
@@ -7738,21 +7270,7 @@
         <w:rPr>
           <w:rFonts w:ascii="Times New Roman" w:hAnsi="Times New Roman" w:cs="Times New Roman"/>
         </w:rPr>
-        <w:t xml:space="preserve"> the authors involved a methodology that used imaging technology to detect and extract the biological attributes of the image. In a different publication, Wang et al., (2021) conducted a study with an aim to examine the problem of identifying human faces given different and complex backgrounds. Specifically, the authors used neuron </w:t>
-      </w:r>
-      <w:proofErr w:type="spellStart"/>
-      <w:r>
-        <w:rPr>
-          <w:rFonts w:ascii="Times New Roman" w:hAnsi="Times New Roman" w:cs="Times New Roman"/>
-        </w:rPr>
-        <w:t>regenisis</w:t>
-      </w:r>
-      <w:proofErr w:type="spellEnd"/>
-      <w:r>
-        <w:rPr>
-          <w:rFonts w:ascii="Times New Roman" w:hAnsi="Times New Roman" w:cs="Times New Roman"/>
-        </w:rPr>
-        <w:t xml:space="preserve"> mechanism and the synapse mechanism to identify facial images from complex backgrounds. The scholars in question developed a model called Where-What Networks that is able to learn type, location and size, which is able to identify human faces from complex backgrounds. This is a clear indicator that researchers are using artificial neural networks for facial recognition and that much is yet to be seen on facial recognition.</w:t>
+        <w:t xml:space="preserve"> the authors involved a methodology that used imaging technology to detect and extract the biological attributes of the image. In a different publication, Wang et al., (2021) conducted a study with an aim to examine the problem of identifying human faces given different and complex backgrounds. Specifically, the authors used neuron regenisis mechanism and the synapse mechanism to identify facial images from complex backgrounds. The scholars in question developed a model called Where-What Networks that is able to learn type, location and size, which is able to identify human faces from complex backgrounds. This is a clear indicator that researchers are using artificial neural networks for facial recognition and that much is yet to be seen on facial recognition.</w:t>
       </w:r>
     </w:p>
     <w:p>
@@ -7778,16 +7296,8 @@
         <w:rPr>
           <w:rFonts w:ascii="Times New Roman" w:hAnsi="Times New Roman" w:cs="Times New Roman"/>
         </w:rPr>
-        <w:t xml:space="preserve">(2011) assert that ANNs require a lot of time to train a model. The problem becomes even worse if the number of neurons and hidden layers required to train a model is high. This problem is controversial because neural networks are known to register a high accuracy when a high number of neurons and hidden layers are used. Every neuron in each layer can make calculations independent of other neurons implying that graphics processing units could help solve the time problem required to train an ANN model. Another problem associated with ANNs is the vanishing gradient problem. </w:t>
-      </w:r>
-      <w:proofErr w:type="spellStart"/>
-      <w:r>
-        <w:rPr>
-          <w:rFonts w:ascii="Times New Roman" w:hAnsi="Times New Roman" w:cs="Times New Roman"/>
-        </w:rPr>
-        <w:t>Tarnate</w:t>
-      </w:r>
-      <w:proofErr w:type="spellEnd"/>
+        <w:t>(2011) assert that ANNs require a lot of time to train a model. The problem becomes even worse if the number of neurons and hidden layers required to train a model is high. This problem is controversial because neural networks are known to register a high accuracy when a high number of neurons and hidden layers are used. Every neuron in each layer can make calculations independent of other neurons implying that graphics processing units could help solve the time problem required to train an ANN model. Another problem associated with ANNs is the vanishing gradient problem. Tarnate</w:t>
+      </w:r>
       <w:r>
         <w:rPr>
           <w:rFonts w:ascii="Times New Roman" w:hAnsi="Times New Roman" w:cs="Times New Roman"/>
@@ -7871,13 +7381,8 @@
         <w:tab/>
         <w:t xml:space="preserve">Like artificial neural networks, convolution neural networks have been used for facial recognition widely. For example, Xiaobo et al., (2023) recognize that facial recognition is hampered by factors such as posture, light and the background of the image. As a result, the authors proposed the addition of an attention mechanism to convolution neural networks in a bid to reduce the effects of factors that affect facial recognition. In a different paper, He et al., (2023) recognize that the existing methods on facial recognition ignore the effect of spatial relationships between predictors. Consequently, the authors introduced the use of a Group Depth-Wise Transpose Attention (GDTA) block, which is designed to establish long range dependencies in different facial features. This led to the development of a lightweight face recognition model, which the authors call </w:t>
       </w:r>
-      <w:proofErr w:type="spellStart"/>
-      <w:r>
-        <w:t>CFormerFaceNet</w:t>
-      </w:r>
-      <w:proofErr w:type="spellEnd"/>
-      <w:r>
-        <w:t>.</w:t>
+      <w:r>
+        <w:t>CFormerFaceNet.</w:t>
       </w:r>
       <w:r>
         <w:rPr>
@@ -9619,21 +9124,7 @@
           <w:color w:val="000000"/>
         </w:rPr>
         <w:tab/>
-        <w:t xml:space="preserve">An array of studies </w:t>
-      </w:r>
-      <w:proofErr w:type="gramStart"/>
-      <w:r>
-        <w:rPr>
-          <w:color w:val="000000"/>
-        </w:rPr>
-        <w:t>have</w:t>
-      </w:r>
-      <w:proofErr w:type="gramEnd"/>
-      <w:r>
-        <w:rPr>
-          <w:color w:val="000000"/>
-        </w:rPr>
-        <w:t xml:space="preserve"> been published either introducing new padding strategies or applying the already existing padding techniques on different problems. For </w:t>
+        <w:t xml:space="preserve">An array of studies have been published either introducing new padding strategies or applying the already existing padding techniques on different problems. For </w:t>
       </w:r>
       <w:r>
         <w:rPr>
@@ -9722,27 +9213,13 @@
           <w:color w:val="000000"/>
         </w:rPr>
         <w:lastRenderedPageBreak/>
-        <w:t xml:space="preserve">effects of time series variations. Tang et al., (2019) also investigate the effect of invalid and same padding using </w:t>
-      </w:r>
-      <w:proofErr w:type="gramStart"/>
+        <w:t>effects of time series variations. Tang et al., (2019) also investigate the effect of invalid and same padding using Pre-</w:t>
+      </w:r>
       <w:r>
         <w:rPr>
           <w:color w:val="000000"/>
         </w:rPr>
-        <w:t>Pre-</w:t>
-      </w:r>
-      <w:r>
-        <w:rPr>
-          <w:color w:val="000000"/>
-        </w:rPr>
-        <w:t>trained</w:t>
-      </w:r>
-      <w:proofErr w:type="gramEnd"/>
-      <w:r>
-        <w:rPr>
-          <w:color w:val="000000"/>
-        </w:rPr>
-        <w:t xml:space="preserve"> CNNs</w:t>
+        <w:t>trained CNNs</w:t>
       </w:r>
       <w:r>
         <w:rPr>
@@ -9801,33 +9278,11 @@
         </w:rPr>
         <w:t xml:space="preserve">from </w:t>
       </w:r>
-      <w:proofErr w:type="spellStart"/>
       <w:r>
         <w:rPr>
           <w:color w:val="000000"/>
         </w:rPr>
-        <w:t>Alrasheedi</w:t>
-      </w:r>
-      <w:proofErr w:type="spellEnd"/>
-      <w:r>
-        <w:rPr>
-          <w:color w:val="000000"/>
-        </w:rPr>
-        <w:t xml:space="preserve"> et al., (2023). The authors acknowledge that padding has been investigated shallowly. It is then, that they propose a padding technique that learns from shifts in hyper parameters of a CNN before adjusting padding effectively. Finally, </w:t>
-      </w:r>
-      <w:proofErr w:type="spellStart"/>
-      <w:r>
-        <w:rPr>
-          <w:color w:val="000000"/>
-        </w:rPr>
-        <w:t>Alrasheedi</w:t>
-      </w:r>
-      <w:proofErr w:type="spellEnd"/>
-      <w:r>
-        <w:rPr>
-          <w:color w:val="000000"/>
-        </w:rPr>
-        <w:t xml:space="preserve"> et al., (2023) introduce a padding module providing evidence that it performs better 1.49% and 0.44% more better in classification accuracy than the zero padding when tested on the VGG16 and ResNet50. Clearly a considerable number of publications investigating how padding affects convolution neural networks have been made. Regardless, the number of publications that investigate how padding affects CNNs in computer vision still remain </w:t>
+        <w:t xml:space="preserve">Alrasheedi et al., (2023). The authors acknowledge that padding has been investigated shallowly. It is then, that they propose a padding technique that learns from shifts in hyper parameters of a CNN before adjusting padding effectively. Finally, Alrasheedi et al., (2023) introduce a padding module providing evidence that it performs better 1.49% and 0.44% more better in classification accuracy than the zero padding when tested on the VGG16 and ResNet50. Clearly a considerable number of publications investigating how padding affects convolution neural networks have been made. Regardless, the number of publications that investigate how padding affects CNNs in computer vision still remain </w:t>
       </w:r>
       <w:r>
         <w:rPr>
@@ -9946,15 +9401,7 @@
         <w:t xml:space="preserve"> was developed with an aim of creating facial recognition models that are resistant to disguises. This owes to the fact that Singh et al., (2018) acknowledge that humans could artificially alter their faces with an aim of fooling a f</w:t>
       </w:r>
       <w:r>
-        <w:t xml:space="preserve">acial recognition system. For instance, an individual could try and fool a system by wearing a wig, wearing at artificial beard or putting on heavy </w:t>
-      </w:r>
-      <w:proofErr w:type="spellStart"/>
-      <w:r>
-        <w:t>make up</w:t>
-      </w:r>
-      <w:proofErr w:type="spellEnd"/>
-      <w:r>
-        <w:t xml:space="preserve">. It is important to note that a different dataset called </w:t>
+        <w:t xml:space="preserve">acial recognition system. For instance, an individual could try and fool a system by wearing a wig, wearing at artificial beard or putting on heavy make up. It is important to note that a different dataset called </w:t>
       </w:r>
       <w:r>
         <w:t>Disguised Faces in the Wild 2019 Dataset</w:t>
@@ -10001,15 +9448,7 @@
         <w:t>. Critical to the discussion is the fact that this data set was examined by human annotators to eliminate images that could introduce noise into the dataset. It is important to hi</w:t>
       </w:r>
       <w:r>
-        <w:t xml:space="preserve">ghlight that this dataset has been used and cited by authors widely. For example, Ibrahem and </w:t>
-      </w:r>
-      <w:proofErr w:type="spellStart"/>
-      <w:r>
-        <w:t>Abdulameer</w:t>
-      </w:r>
-      <w:proofErr w:type="spellEnd"/>
-      <w:r>
-        <w:t xml:space="preserve"> (2023) examine a pretrained model that was created from this dataset to </w:t>
+        <w:t xml:space="preserve">ghlight that this dataset has been used and cited by authors widely. For example, Ibrahem and Abdulameer (2023) examine a pretrained model that was created from this dataset to </w:t>
       </w:r>
       <w:r>
         <w:t>discuss</w:t>
@@ -10146,73 +9585,23 @@
         <w:t xml:space="preserve"> to match or a recognize a face belonging to a particular person. An example of an author that has conducted review on facial recognition architectures is sun and Redei (2022). </w:t>
       </w:r>
       <w:r>
-        <w:t xml:space="preserve">Specifically, the authors in question discuss architectures such as </w:t>
-      </w:r>
-      <w:proofErr w:type="spellStart"/>
-      <w:r>
-        <w:t>FaceNet</w:t>
-      </w:r>
-      <w:proofErr w:type="spellEnd"/>
-      <w:r>
-        <w:t xml:space="preserve">, </w:t>
-      </w:r>
-      <w:proofErr w:type="spellStart"/>
-      <w:r>
-        <w:t>DeepFace</w:t>
-      </w:r>
-      <w:proofErr w:type="spellEnd"/>
-      <w:r>
-        <w:t xml:space="preserve">, </w:t>
-      </w:r>
-      <w:proofErr w:type="spellStart"/>
-      <w:r>
-        <w:t>DeepID</w:t>
-      </w:r>
-      <w:proofErr w:type="spellEnd"/>
-      <w:r>
-        <w:t>-Net</w:t>
+        <w:t xml:space="preserve">Specifically, the authors in question discuss architectures such as FaceNet, DeepFace, </w:t>
+      </w:r>
+      <w:r>
+        <w:t>DeepID-Net</w:t>
       </w:r>
       <w:r>
         <w:t xml:space="preserve">, and Local binary patterns architectures. Gupta (2017) also reviewed some of the existing architectures in facial recognition. In particular, the author discusses architectures like </w:t>
       </w:r>
-      <w:proofErr w:type="spellStart"/>
       <w:r>
         <w:lastRenderedPageBreak/>
-        <w:t>WebFace</w:t>
-      </w:r>
-      <w:proofErr w:type="spellEnd"/>
-      <w:r>
-        <w:t xml:space="preserve">, </w:t>
-      </w:r>
-      <w:proofErr w:type="spellStart"/>
-      <w:r>
-        <w:t>DeepFace</w:t>
-      </w:r>
-      <w:proofErr w:type="spellEnd"/>
-      <w:r>
-        <w:t>,</w:t>
+        <w:t>WebFace, DeepFace,</w:t>
       </w:r>
       <w:r>
         <w:t xml:space="preserve"> </w:t>
       </w:r>
       <w:r>
-        <w:t xml:space="preserve">VGG Net, </w:t>
-      </w:r>
-      <w:proofErr w:type="spellStart"/>
-      <w:r>
-        <w:t>FaceNet</w:t>
-      </w:r>
-      <w:proofErr w:type="spellEnd"/>
-      <w:r>
-        <w:t xml:space="preserve">, and </w:t>
-      </w:r>
-      <w:proofErr w:type="spellStart"/>
-      <w:r>
-        <w:t>DeepId</w:t>
-      </w:r>
-      <w:proofErr w:type="spellEnd"/>
-      <w:r>
-        <w:t xml:space="preserve">. Critical to the discussion is that fact that the number of existing architectures could be more than 30 implying that discussing all these architectures would be daunting. It follows that </w:t>
+        <w:t xml:space="preserve">VGG Net, FaceNet, and DeepId. Critical to the discussion is that fact that the number of existing architectures could be more than 30 implying that discussing all these architectures would be daunting. It follows that </w:t>
       </w:r>
       <w:r>
         <w:t>this paper will only discuss selected architectures in order to stick to the scope of the paper.</w:t>
@@ -10226,7 +9615,6 @@
       <w:r>
         <w:t>Google </w:t>
       </w:r>
-      <w:proofErr w:type="spellStart"/>
       <w:r>
         <w:t>F</w:t>
       </w:r>
@@ -10240,7 +9628,6 @@
         <w:t>et</w:t>
       </w:r>
       <w:bookmarkEnd w:id="49"/>
-      <w:proofErr w:type="spellEnd"/>
     </w:p>
     <w:p>
       <w:pPr>
@@ -10251,23 +9638,7 @@
         <w:tab/>
       </w:r>
       <w:r>
-        <w:t xml:space="preserve">Google </w:t>
-      </w:r>
-      <w:proofErr w:type="spellStart"/>
-      <w:r>
-        <w:t>FaceNet</w:t>
-      </w:r>
-      <w:proofErr w:type="spellEnd"/>
-      <w:r>
-        <w:t xml:space="preserve">, or popularly known as </w:t>
-      </w:r>
-      <w:proofErr w:type="spellStart"/>
-      <w:r>
-        <w:t>FaceNet</w:t>
-      </w:r>
-      <w:proofErr w:type="spellEnd"/>
-      <w:r>
-        <w:t xml:space="preserve">, is a facial recognition architecture that was developed by researchers at Google. This architecture relies on an earlier architecture </w:t>
+        <w:t xml:space="preserve">Google FaceNet, or popularly known as FaceNet, is a facial recognition architecture that was developed by researchers at Google. This architecture relies on an earlier architecture </w:t>
       </w:r>
       <w:r>
         <w:t xml:space="preserve">called Inception </w:t>
@@ -10300,15 +9671,7 @@
         <w:t>%</w:t>
       </w:r>
       <w:r>
-        <w:t xml:space="preserve"> on the Labelled Faces in the Wild dataset (Sun and Redei, 2022). It should be noted however that </w:t>
-      </w:r>
-      <w:proofErr w:type="spellStart"/>
-      <w:r>
-        <w:t>FaceNet</w:t>
-      </w:r>
-      <w:proofErr w:type="spellEnd"/>
-      <w:r>
-        <w:t xml:space="preserve"> requires high performing computers in order to train the architecture on a new dataset.</w:t>
+        <w:t xml:space="preserve"> on the Labelled Faces in the Wild dataset (Sun and Redei, 2022). It should be noted however that FaceNet requires high performing computers in order to train the architecture on a new dataset.</w:t>
       </w:r>
     </w:p>
     <w:p>
@@ -10316,12 +9679,10 @@
         <w:pStyle w:val="Heading3"/>
       </w:pPr>
       <w:bookmarkStart w:id="50" w:name="_Toc178527562"/>
-      <w:proofErr w:type="spellStart"/>
       <w:r>
         <w:t>DeepFace</w:t>
       </w:r>
       <w:bookmarkEnd w:id="50"/>
-      <w:proofErr w:type="spellEnd"/>
     </w:p>
     <w:p>
       <w:pPr>
@@ -10331,81 +9692,54 @@
       <w:r>
         <w:tab/>
       </w:r>
-      <w:proofErr w:type="spellStart"/>
-      <w:r>
-        <w:t>DeepFace</w:t>
-      </w:r>
-      <w:proofErr w:type="spellEnd"/>
-      <w:r>
-        <w:t xml:space="preserve"> was also produced by a giant company in technology. Specifically, Meta. Critical to the discussion is the fact </w:t>
-      </w:r>
-      <w:proofErr w:type="spellStart"/>
+      <w:r>
+        <w:t xml:space="preserve">DeepFace was also produced by a giant company in technology. Specifically, Meta. Critical to the discussion is the fact </w:t>
+      </w:r>
       <w:r>
         <w:t>Taigman</w:t>
       </w:r>
-      <w:proofErr w:type="spellEnd"/>
       <w:r>
         <w:t xml:space="preserve"> et al., (2014) published</w:t>
       </w:r>
       <w:r>
-        <w:t xml:space="preserve"> the results from the study that produced </w:t>
-      </w:r>
-      <w:proofErr w:type="spellStart"/>
-      <w:r>
-        <w:t>DeepFace</w:t>
-      </w:r>
-      <w:proofErr w:type="spellEnd"/>
+        <w:t xml:space="preserve"> the results from the study that produced DeepFace. </w:t>
+      </w:r>
+      <w:r>
+        <w:t>It is important to note that the researchers introduced an idea of</w:t>
+      </w:r>
+      <w:r>
+        <w:t xml:space="preserve"> 3D modelling based on face fiducial points, which in turn is used to align faces. Simply put, the facial alignment methodology proposed by </w:t>
+      </w:r>
+      <w:r>
+        <w:t>Taigman</w:t>
+      </w:r>
+      <w:r>
+        <w:t xml:space="preserve"> et al., (2014) can transform an image shown in </w:t>
+      </w:r>
+      <w:r>
+        <w:t>figure 2.6 (a) to an image shown in figure 2.6</w:t>
+      </w:r>
+      <w:r>
+        <w:t xml:space="preserve"> </w:t>
+      </w:r>
+      <w:r>
+        <w:t>(b)</w:t>
+      </w:r>
       <w:r>
         <w:t xml:space="preserve">. </w:t>
       </w:r>
       <w:r>
-        <w:t>It is important to note that the researchers introduced an idea of</w:t>
-      </w:r>
-      <w:r>
-        <w:t xml:space="preserve"> 3D modelling based on face fiducial points, which in turn is used to align faces. Simply put, the facial alignment methodology proposed by </w:t>
-      </w:r>
-      <w:proofErr w:type="spellStart"/>
+        <w:t xml:space="preserve">Resulting images from facial alignment are then subjected to a deep convolution neural network architecture that is thoroughly documented by </w:t>
+      </w:r>
       <w:r>
         <w:t>Taigman</w:t>
       </w:r>
-      <w:proofErr w:type="spellEnd"/>
-      <w:r>
-        <w:t xml:space="preserve"> et al., (2014) can transform an image shown in </w:t>
-      </w:r>
-      <w:r>
-        <w:t>figure 2.6 (a) to an image shown in figure 2.6</w:t>
-      </w:r>
-      <w:r>
-        <w:t xml:space="preserve"> </w:t>
-      </w:r>
-      <w:r>
-        <w:t>(b)</w:t>
-      </w:r>
-      <w:r>
-        <w:t xml:space="preserve">. </w:t>
-      </w:r>
-      <w:r>
-        <w:t xml:space="preserve">Resulting images from facial alignment are then subjected to a deep convolution neural network architecture that is thoroughly documented by </w:t>
-      </w:r>
-      <w:proofErr w:type="spellStart"/>
-      <w:r>
-        <w:t>Taigman</w:t>
-      </w:r>
-      <w:proofErr w:type="spellEnd"/>
       <w:r>
         <w:t xml:space="preserve"> et al., (2014). Vital to the </w:t>
       </w:r>
       <w:r>
         <w:lastRenderedPageBreak/>
-        <w:t xml:space="preserve">discussion is the fact that the </w:t>
-      </w:r>
-      <w:proofErr w:type="spellStart"/>
-      <w:r>
-        <w:t>DeepFace</w:t>
-      </w:r>
-      <w:proofErr w:type="spellEnd"/>
-      <w:r>
-        <w:t xml:space="preserve"> architecture was tested on </w:t>
+        <w:t xml:space="preserve">discussion is the fact that the DeepFace architecture was tested on </w:t>
       </w:r>
       <w:r>
         <w:t>the Labelled Faces in the Wild dataset, and the YouTube Faces dataset. It follows that this architecture achieved an accuracy of 97.5% in the Labelled Faces in the Wild dataset and a 91.4% accuracy on the YouTube Faces dataset.</w:t>
@@ -10584,42 +9918,10 @@
         <w:t xml:space="preserve"> Specifically, it is made up of 16 layers where the first thirteen layers are convolution layers while the last three layers are fully connected layers. </w:t>
       </w:r>
       <w:r>
-        <w:t xml:space="preserve">Critical to the discussion is the fact that the input image must have a dimension of 224 by 224 by 3. The sixteen layers used by this facial architecture can be divided into five major groups. Each of these groups contains convolution layers, a </w:t>
-      </w:r>
-      <w:proofErr w:type="spellStart"/>
-      <w:r>
-        <w:t>relu</w:t>
-      </w:r>
-      <w:proofErr w:type="spellEnd"/>
-      <w:r>
-        <w:t xml:space="preserve"> activation function, </w:t>
-      </w:r>
-      <w:proofErr w:type="spellStart"/>
-      <w:r>
-        <w:t>maxpooling</w:t>
-      </w:r>
-      <w:proofErr w:type="spellEnd"/>
-      <w:r>
-        <w:t xml:space="preserve">, kernel filters, strides and padding. A thorough explanation of this facial recognition architecture has been published by Koo et al., (2018). </w:t>
-      </w:r>
-      <w:r>
-        <w:t xml:space="preserve">It is important to mention that like Google </w:t>
-      </w:r>
-      <w:proofErr w:type="spellStart"/>
-      <w:r>
-        <w:t>Facenet</w:t>
-      </w:r>
-      <w:proofErr w:type="spellEnd"/>
-      <w:r>
-        <w:t xml:space="preserve"> and </w:t>
-      </w:r>
-      <w:proofErr w:type="spellStart"/>
-      <w:r>
-        <w:t>DeepFace</w:t>
-      </w:r>
-      <w:proofErr w:type="spellEnd"/>
-      <w:r>
-        <w:t xml:space="preserve">, VGGFACE-16 was also tested on famous datasets such as the </w:t>
+        <w:t xml:space="preserve">Critical to the discussion is the fact that the input image must have a dimension of 224 by 224 by 3. The sixteen layers used by this facial architecture can be divided into five major groups. Each of these groups contains convolution layers, a relu activation function, maxpooling, kernel filters, strides and padding. A thorough explanation of this facial recognition architecture has been published by Koo et al., (2018). </w:t>
+      </w:r>
+      <w:r>
+        <w:t xml:space="preserve">It is important to mention that like Google Facenet and DeepFace, VGGFACE-16 was also tested on famous datasets such as the </w:t>
       </w:r>
       <w:r>
         <w:t>Labeled Faces in the Wild dataset</w:t>
@@ -12198,14 +11500,7 @@
         <w:rPr>
           <w:rFonts w:ascii="Times New Roman" w:hAnsi="Times New Roman" w:cs="Times New Roman"/>
         </w:rPr>
-        <w:t xml:space="preserve"> be the weight matrices denoting the value of the synaptic weight that connects the </w:t>
-      </w:r>
-      <w:proofErr w:type="spellStart"/>
-      <w:r>
-        <w:rPr>
-          <w:rFonts w:ascii="Times New Roman" w:hAnsi="Times New Roman" w:cs="Times New Roman"/>
-        </w:rPr>
-        <w:t>j</w:t>
+        <w:t xml:space="preserve"> be the weight matrices denoting the value of the synaptic weight that connects the j</w:t>
       </w:r>
       <w:r>
         <w:rPr>
@@ -12214,19 +11509,11 @@
         </w:rPr>
         <w:t>th</w:t>
       </w:r>
-      <w:proofErr w:type="spellEnd"/>
-      <w:r>
-        <w:rPr>
-          <w:rFonts w:ascii="Times New Roman" w:hAnsi="Times New Roman" w:cs="Times New Roman"/>
-        </w:rPr>
-        <w:t xml:space="preserve"> neuron of layer (L) to the </w:t>
-      </w:r>
-      <w:proofErr w:type="spellStart"/>
-      <w:r>
-        <w:rPr>
-          <w:rFonts w:ascii="Times New Roman" w:hAnsi="Times New Roman" w:cs="Times New Roman"/>
-        </w:rPr>
-        <w:t>i</w:t>
+      <w:r>
+        <w:rPr>
+          <w:rFonts w:ascii="Times New Roman" w:hAnsi="Times New Roman" w:cs="Times New Roman"/>
+        </w:rPr>
+        <w:t xml:space="preserve"> neuron of layer (L) to the i</w:t>
       </w:r>
       <w:r>
         <w:rPr>
@@ -12235,7 +11522,6 @@
         </w:rPr>
         <w:t>th</w:t>
       </w:r>
-      <w:proofErr w:type="spellEnd"/>
       <w:r>
         <w:rPr>
           <w:rFonts w:ascii="Times New Roman" w:hAnsi="Times New Roman" w:cs="Times New Roman"/>
@@ -12303,14 +11589,7 @@
         <w:rPr>
           <w:rFonts w:ascii="Times New Roman" w:hAnsi="Times New Roman" w:cs="Times New Roman"/>
         </w:rPr>
-        <w:t xml:space="preserve"> Is the synaptic weight connecting the </w:t>
-      </w:r>
-      <w:proofErr w:type="spellStart"/>
-      <w:r>
-        <w:rPr>
-          <w:rFonts w:ascii="Times New Roman" w:hAnsi="Times New Roman" w:cs="Times New Roman"/>
-        </w:rPr>
-        <w:t>j</w:t>
+        <w:t xml:space="preserve"> Is the synaptic weight connecting the j</w:t>
       </w:r>
       <w:r>
         <w:rPr>
@@ -12319,19 +11598,11 @@
         </w:rPr>
         <w:t>th</w:t>
       </w:r>
-      <w:proofErr w:type="spellEnd"/>
-      <w:r>
-        <w:rPr>
-          <w:rFonts w:ascii="Times New Roman" w:hAnsi="Times New Roman" w:cs="Times New Roman"/>
-        </w:rPr>
-        <w:t xml:space="preserve"> neuron of output layer to the </w:t>
-      </w:r>
-      <w:proofErr w:type="spellStart"/>
-      <w:r>
-        <w:rPr>
-          <w:rFonts w:ascii="Times New Roman" w:hAnsi="Times New Roman" w:cs="Times New Roman"/>
-        </w:rPr>
-        <w:t>i</w:t>
+      <w:r>
+        <w:rPr>
+          <w:rFonts w:ascii="Times New Roman" w:hAnsi="Times New Roman" w:cs="Times New Roman"/>
+        </w:rPr>
+        <w:t xml:space="preserve"> neuron of output layer to the i</w:t>
       </w:r>
       <w:r>
         <w:rPr>
@@ -12340,7 +11611,6 @@
         </w:rPr>
         <w:t>th</w:t>
       </w:r>
-      <w:proofErr w:type="spellEnd"/>
       <w:r>
         <w:rPr>
           <w:rFonts w:ascii="Times New Roman" w:hAnsi="Times New Roman" w:cs="Times New Roman"/>
@@ -12408,14 +11678,7 @@
         <w:rPr>
           <w:rFonts w:ascii="Times New Roman" w:hAnsi="Times New Roman" w:cs="Times New Roman"/>
         </w:rPr>
-        <w:t xml:space="preserve"> Is the synaptic weight connecting the </w:t>
-      </w:r>
-      <w:proofErr w:type="spellStart"/>
-      <w:r>
-        <w:rPr>
-          <w:rFonts w:ascii="Times New Roman" w:hAnsi="Times New Roman" w:cs="Times New Roman"/>
-        </w:rPr>
-        <w:t>j</w:t>
+        <w:t xml:space="preserve"> Is the synaptic weight connecting the j</w:t>
       </w:r>
       <w:r>
         <w:rPr>
@@ -12424,19 +11687,11 @@
         </w:rPr>
         <w:t>th</w:t>
       </w:r>
-      <w:proofErr w:type="spellEnd"/>
-      <w:r>
-        <w:rPr>
-          <w:rFonts w:ascii="Times New Roman" w:hAnsi="Times New Roman" w:cs="Times New Roman"/>
-        </w:rPr>
-        <w:t xml:space="preserve"> neuron of hidden layer 2 to the </w:t>
-      </w:r>
-      <w:proofErr w:type="spellStart"/>
-      <w:r>
-        <w:rPr>
-          <w:rFonts w:ascii="Times New Roman" w:hAnsi="Times New Roman" w:cs="Times New Roman"/>
-        </w:rPr>
-        <w:t>i</w:t>
+      <w:r>
+        <w:rPr>
+          <w:rFonts w:ascii="Times New Roman" w:hAnsi="Times New Roman" w:cs="Times New Roman"/>
+        </w:rPr>
+        <w:t xml:space="preserve"> neuron of hidden layer 2 to the i</w:t>
       </w:r>
       <w:r>
         <w:rPr>
@@ -12445,7 +11700,6 @@
         </w:rPr>
         <w:t>th</w:t>
       </w:r>
-      <w:proofErr w:type="spellEnd"/>
       <w:r>
         <w:rPr>
           <w:rFonts w:ascii="Times New Roman" w:hAnsi="Times New Roman" w:cs="Times New Roman"/>
@@ -12513,14 +11767,7 @@
         <w:rPr>
           <w:rFonts w:ascii="Times New Roman" w:hAnsi="Times New Roman" w:cs="Times New Roman"/>
         </w:rPr>
-        <w:t xml:space="preserve"> Is the synaptic weight connecting the </w:t>
-      </w:r>
-      <w:proofErr w:type="spellStart"/>
-      <w:r>
-        <w:rPr>
-          <w:rFonts w:ascii="Times New Roman" w:hAnsi="Times New Roman" w:cs="Times New Roman"/>
-        </w:rPr>
-        <w:t>j</w:t>
+        <w:t xml:space="preserve"> Is the synaptic weight connecting the j</w:t>
       </w:r>
       <w:r>
         <w:rPr>
@@ -12529,19 +11776,11 @@
         </w:rPr>
         <w:t>th</w:t>
       </w:r>
-      <w:proofErr w:type="spellEnd"/>
-      <w:r>
-        <w:rPr>
-          <w:rFonts w:ascii="Times New Roman" w:hAnsi="Times New Roman" w:cs="Times New Roman"/>
-        </w:rPr>
-        <w:t xml:space="preserve"> neuron of hidden layer 1 to the </w:t>
-      </w:r>
-      <w:proofErr w:type="spellStart"/>
-      <w:r>
-        <w:rPr>
-          <w:rFonts w:ascii="Times New Roman" w:hAnsi="Times New Roman" w:cs="Times New Roman"/>
-        </w:rPr>
-        <w:t>i</w:t>
+      <w:r>
+        <w:rPr>
+          <w:rFonts w:ascii="Times New Roman" w:hAnsi="Times New Roman" w:cs="Times New Roman"/>
+        </w:rPr>
+        <w:t xml:space="preserve"> neuron of hidden layer 1 to the i</w:t>
       </w:r>
       <w:r>
         <w:rPr>
@@ -12550,7 +11789,6 @@
         </w:rPr>
         <w:t>th</w:t>
       </w:r>
-      <w:proofErr w:type="spellEnd"/>
       <w:r>
         <w:rPr>
           <w:rFonts w:ascii="Times New Roman" w:hAnsi="Times New Roman" w:cs="Times New Roman"/>
@@ -12714,11 +11952,7 @@
         </m:sSubSup>
       </m:oMath>
       <w:r>
-        <w:t xml:space="preserve"> be vectors whose elements denote the weighted inputs of the </w:t>
-      </w:r>
-      <w:proofErr w:type="spellStart"/>
-      <w:r>
-        <w:t>j</w:t>
+        <w:t xml:space="preserve"> be vectors whose elements denote the weighted inputs of the j</w:t>
       </w:r>
       <w:r>
         <w:rPr>
@@ -12726,7 +11960,6 @@
         </w:rPr>
         <w:t>th</w:t>
       </w:r>
-      <w:proofErr w:type="spellEnd"/>
       <w:r>
         <w:t xml:space="preserve"> neuron of layer L and are defined as the following.</w:t>
       </w:r>
@@ -17059,17 +16292,8 @@
           <w:i w:val="0"/>
           <w:iCs w:val="0"/>
         </w:rPr>
-        <w:t xml:space="preserve">   </w:t>
-      </w:r>
-      <w:proofErr w:type="gramStart"/>
-      <w:r>
-        <w:rPr>
-          <w:i w:val="0"/>
-          <w:iCs w:val="0"/>
-        </w:rPr>
-        <w:t xml:space="preserve">   (</w:t>
-      </w:r>
-      <w:proofErr w:type="gramEnd"/>
+        <w:t xml:space="preserve">      (</w:t>
+      </w:r>
       <w:r>
         <w:rPr>
           <w:i w:val="0"/>
@@ -17346,17 +16570,8 @@
           <w:i w:val="0"/>
           <w:iCs w:val="0"/>
         </w:rPr>
-        <w:t xml:space="preserve">   </w:t>
-      </w:r>
-      <w:proofErr w:type="gramStart"/>
-      <w:r>
-        <w:rPr>
-          <w:i w:val="0"/>
-          <w:iCs w:val="0"/>
-        </w:rPr>
-        <w:t xml:space="preserve">   (</w:t>
-      </w:r>
-      <w:proofErr w:type="gramEnd"/>
+        <w:t xml:space="preserve">      (</w:t>
+      </w:r>
       <w:r>
         <w:rPr>
           <w:i w:val="0"/>
@@ -19767,17 +18982,8 @@
           <w:i w:val="0"/>
           <w:iCs w:val="0"/>
         </w:rPr>
-        <w:t xml:space="preserve">   </w:t>
-      </w:r>
-      <w:proofErr w:type="gramStart"/>
-      <w:r>
-        <w:rPr>
-          <w:i w:val="0"/>
-          <w:iCs w:val="0"/>
-        </w:rPr>
-        <w:t xml:space="preserve">   (</w:t>
-      </w:r>
-      <w:proofErr w:type="gramEnd"/>
+        <w:t xml:space="preserve">      (</w:t>
+      </w:r>
       <w:r>
         <w:rPr>
           <w:i w:val="0"/>
@@ -20084,11 +19290,7 @@
       </w:r>
       <w:r>
         <w:tab/>
-        <w:t xml:space="preserve">   </w:t>
-      </w:r>
-      <w:proofErr w:type="gramStart"/>
-      <w:r>
-        <w:t xml:space="preserve">   </w:t>
+        <w:t xml:space="preserve">      </w:t>
       </w:r>
       <w:r>
         <w:rPr>
@@ -20097,7 +19299,6 @@
         </w:rPr>
         <w:t>(</w:t>
       </w:r>
-      <w:proofErr w:type="gramEnd"/>
       <w:r>
         <w:rPr>
           <w:i w:val="0"/>
@@ -21455,15 +20656,7 @@
         </m:sSubSup>
       </m:oMath>
       <w:r>
-        <w:t xml:space="preserve"> have been adjusted in the previous step based on errors, which will be used to adjust weights in the second intermediate layer. Moving on to parcel (</w:t>
-      </w:r>
-      <w:proofErr w:type="spellStart"/>
-      <w:r>
-        <w:t>i</w:t>
-      </w:r>
-      <w:proofErr w:type="spellEnd"/>
-      <w:r>
-        <w:t xml:space="preserve">) in equation </w:t>
+        <w:t xml:space="preserve"> have been adjusted in the previous step based on errors, which will be used to adjust weights in the second intermediate layer. Moving on to parcel (i) in equation </w:t>
       </w:r>
       <w:r>
         <w:t>3.22</w:t>
@@ -22745,13 +21938,8 @@
       <w:pPr>
         <w:spacing w:line="480" w:lineRule="auto"/>
       </w:pPr>
-      <w:proofErr w:type="gramStart"/>
-      <w:r>
-        <w:t>Where</w:t>
-      </w:r>
-      <w:proofErr w:type="gramEnd"/>
-      <w:r>
-        <w:t xml:space="preserve"> </w:t>
+      <w:r>
+        <w:t xml:space="preserve">Where </w:t>
       </w:r>
     </w:p>
     <w:p>
@@ -24259,17 +23447,8 @@
           <w:i w:val="0"/>
           <w:iCs w:val="0"/>
         </w:rPr>
-        <w:t xml:space="preserve">   </w:t>
-      </w:r>
-      <w:proofErr w:type="gramStart"/>
-      <w:r>
-        <w:rPr>
-          <w:i w:val="0"/>
-          <w:iCs w:val="0"/>
-        </w:rPr>
-        <w:t xml:space="preserve">   (</w:t>
-      </w:r>
-      <w:proofErr w:type="gramEnd"/>
+        <w:t xml:space="preserve">      (</w:t>
+      </w:r>
       <w:r>
         <w:rPr>
           <w:i w:val="0"/>
@@ -24578,11 +23757,7 @@
       </w:r>
       <w:r>
         <w:tab/>
-        <w:t xml:space="preserve">   </w:t>
-      </w:r>
-      <w:proofErr w:type="gramStart"/>
-      <w:r>
-        <w:t xml:space="preserve">   </w:t>
+        <w:t xml:space="preserve">      </w:t>
       </w:r>
       <w:r>
         <w:rPr>
@@ -24591,7 +23766,6 @@
         </w:rPr>
         <w:t>(</w:t>
       </w:r>
-      <w:proofErr w:type="gramEnd"/>
       <w:r>
         <w:rPr>
           <w:i w:val="0"/>
@@ -27245,13 +26419,8 @@
       <w:pPr>
         <w:spacing w:line="480" w:lineRule="auto"/>
       </w:pPr>
-      <w:proofErr w:type="gramStart"/>
-      <w:r>
-        <w:t>Where</w:t>
-      </w:r>
-      <w:proofErr w:type="gramEnd"/>
-      <w:r>
-        <w:t xml:space="preserve"> </w:t>
+      <w:r>
+        <w:t xml:space="preserve">Where </w:t>
       </w:r>
     </w:p>
     <w:p>
@@ -29812,21 +28981,7 @@
         <w:rPr>
           <w:rFonts w:ascii="Times New Roman" w:hAnsi="Times New Roman" w:cs="Times New Roman"/>
         </w:rPr>
-        <w:t xml:space="preserve">examining the effect of padding on a modified VGGFACE-16 </w:t>
-      </w:r>
-      <w:proofErr w:type="spellStart"/>
-      <w:r>
-        <w:rPr>
-          <w:rFonts w:ascii="Times New Roman" w:hAnsi="Times New Roman" w:cs="Times New Roman"/>
-        </w:rPr>
-        <w:t>modeld</w:t>
-      </w:r>
-      <w:proofErr w:type="spellEnd"/>
-      <w:r>
-        <w:rPr>
-          <w:rFonts w:ascii="Times New Roman" w:hAnsi="Times New Roman" w:cs="Times New Roman"/>
-        </w:rPr>
-        <w:t>. The chapter ends with a discussion comparing the effect of padding on Cycks and the modified VGGFACE-16.</w:t>
+        <w:t>examining the effect of padding on a modified VGGFACE-16 modeld. The chapter ends with a discussion comparing the effect of padding on Cycks and the modified VGGFACE-16.</w:t>
       </w:r>
     </w:p>
     <w:p>
@@ -29906,6 +29061,7 @@
       <w:r>
         <w:rPr>
           <w:rFonts w:ascii="Times New Roman" w:hAnsi="Times New Roman" w:cs="Times New Roman"/>
+          <w:noProof/>
         </w:rPr>
         <w:lastRenderedPageBreak/>
         <w:drawing>
@@ -30073,6 +29229,7 @@
       <w:r>
         <w:rPr>
           <w:rFonts w:ascii="Times New Roman" w:hAnsi="Times New Roman" w:cs="Times New Roman"/>
+          <w:noProof/>
         </w:rPr>
         <w:drawing>
           <wp:inline distT="0" distB="0" distL="0" distR="0" wp14:anchorId="33D01B8B" wp14:editId="0621657F">
@@ -31134,6 +30291,7 @@
       <w:r>
         <w:rPr>
           <w:rFonts w:ascii="Times New Roman" w:eastAsia="Times New Roman" w:hAnsi="Times New Roman" w:cs="Times New Roman"/>
+          <w:noProof/>
           <w:kern w:val="0"/>
           <w:lang w:eastAsia="en-US" w:bidi="ar-SA"/>
         </w:rPr>
@@ -31198,34 +30356,90 @@
         <w:rPr>
           <w:lang w:eastAsia="en-US" w:bidi="ar-SA"/>
         </w:rPr>
+        <w:t xml:space="preserve">The </w:t>
+      </w:r>
+      <w:r>
+        <w:rPr>
+          <w:lang w:eastAsia="en-US" w:bidi="ar-SA"/>
+        </w:rPr>
+        <w:t xml:space="preserve">Modified </w:t>
+      </w:r>
+      <w:r>
+        <w:rPr>
+          <w:lang w:eastAsia="en-US" w:bidi="ar-SA"/>
+        </w:rPr>
+        <w:t>VGG Model</w:t>
+      </w:r>
+    </w:p>
+    <w:p>
+      <w:pPr>
+        <w:pStyle w:val="BodyText"/>
+        <w:spacing w:line="480" w:lineRule="auto"/>
+        <w:ind w:firstLine="720"/>
+        <w:rPr>
+          <w:lang w:eastAsia="en-US" w:bidi="ar-SA"/>
+        </w:rPr>
+      </w:pPr>
+      <w:r>
+        <w:rPr>
+          <w:lang w:eastAsia="en-US" w:bidi="ar-SA"/>
+        </w:rPr>
+        <w:t>Like in the Cycks models, the modified VGG models were built both with padding and without padding in order to investigate the effect of padding on the modified VGG models. T</w:t>
+      </w:r>
+      <w:r>
+        <w:rPr>
+          <w:lang w:eastAsia="en-US" w:bidi="ar-SA"/>
+        </w:rPr>
+        <w:t xml:space="preserve">he </w:t>
+      </w:r>
+      <w:r>
+        <w:rPr>
+          <w:lang w:eastAsia="en-US" w:bidi="ar-SA"/>
+        </w:rPr>
         <w:lastRenderedPageBreak/>
-        <w:t>The Effect of Padding on a Modified VGG Model</w:t>
-      </w:r>
-    </w:p>
-    <w:p>
-      <w:pPr>
-        <w:pStyle w:val="Heading3"/>
+        <w:t>architecture presented in this study draws inspiration from the standard VGG16 framework</w:t>
+      </w:r>
+      <w:r>
         <w:rPr>
           <w:lang w:eastAsia="en-US" w:bidi="ar-SA"/>
         </w:rPr>
-      </w:pPr>
+        <w:t xml:space="preserve"> However</w:t>
+      </w:r>
       <w:r>
         <w:rPr>
           <w:lang w:eastAsia="en-US" w:bidi="ar-SA"/>
         </w:rPr>
-        <w:t xml:space="preserve">Why Do We Call it a </w:t>
+        <w:t xml:space="preserve"> a strategic reduction in depth was necessitated by the decision to exclude zero-padding. In a standard VGG16 implementation, the repetitive application of 3 </w:t>
       </w:r>
       <w:r>
         <w:rPr>
           <w:lang w:eastAsia="en-US" w:bidi="ar-SA"/>
         </w:rPr>
-        <w:t>Modified VGG Model</w:t>
+        <w:t>*</w:t>
+      </w:r>
+      <w:r>
+        <w:rPr>
+          <w:lang w:eastAsia="en-US" w:bidi="ar-SA"/>
+        </w:rPr>
+        <w:t xml:space="preserve"> 3</w:t>
+      </w:r>
+      <w:r>
+        <w:rPr>
+          <w:lang w:eastAsia="en-US" w:bidi="ar-SA"/>
+        </w:rPr>
+        <w:t xml:space="preserve"> </w:t>
+      </w:r>
+      <w:r>
+        <w:rPr>
+          <w:lang w:eastAsia="en-US" w:bidi="ar-SA"/>
+        </w:rPr>
+        <w:t>kernels—when coupled with "valid" (unpadded) convolutions—results in a rapid spatial contraction of the feature maps.</w:t>
       </w:r>
     </w:p>
     <w:p>
       <w:pPr>
         <w:pStyle w:val="BodyText"/>
-        <w:ind w:firstLine="720"/>
+        <w:spacing w:line="480" w:lineRule="auto"/>
         <w:rPr>
           <w:lang w:eastAsia="en-US" w:bidi="ar-SA"/>
         </w:rPr>
@@ -31234,62 +30448,13 @@
         <w:rPr>
           <w:lang w:eastAsia="en-US" w:bidi="ar-SA"/>
         </w:rPr>
-        <w:t xml:space="preserve">While the architecture presented in this study draws inspiration from the standard VGG16 framework, a strategic reduction in depth was necessitated by the decision to exclude zero-padding. In a standard VGG16 implementation, the repetitive application of 3 </w:t>
-      </w:r>
-      <w:r>
-        <w:rPr>
-          <w:lang w:eastAsia="en-US" w:bidi="ar-SA"/>
-        </w:rPr>
-        <w:t>*</w:t>
-      </w:r>
-      <w:r>
-        <w:rPr>
-          <w:lang w:eastAsia="en-US" w:bidi="ar-SA"/>
-        </w:rPr>
-        <w:t xml:space="preserve"> </w:t>
-      </w:r>
-      <w:r>
-        <w:rPr>
-          <w:lang w:eastAsia="en-US" w:bidi="ar-SA"/>
-        </w:rPr>
-        <w:t>3</w:t>
-      </w:r>
-      <w:r>
-        <w:rPr>
-          <w:lang w:eastAsia="en-US" w:bidi="ar-SA"/>
-        </w:rPr>
-        <w:t xml:space="preserve"> </w:t>
-      </w:r>
-      <w:r>
-        <w:rPr>
-          <w:lang w:eastAsia="en-US" w:bidi="ar-SA"/>
-        </w:rPr>
-        <w:t>kernels</w:t>
-      </w:r>
-      <w:r>
-        <w:rPr>
-          <w:lang w:eastAsia="en-US" w:bidi="ar-SA"/>
-        </w:rPr>
-        <w:t>—when coupled with "valid" (unpadded) convolutions—results in a rapid spatial contraction of the feature maps.</w:t>
+        <w:t>Mathematically, the output dimension O of a convolutional layer is defined as:</w:t>
       </w:r>
     </w:p>
     <w:p>
       <w:pPr>
         <w:pStyle w:val="BodyText"/>
-        <w:rPr>
-          <w:lang w:eastAsia="en-US" w:bidi="ar-SA"/>
-        </w:rPr>
-      </w:pPr>
-      <w:r>
-        <w:rPr>
-          <w:lang w:eastAsia="en-US" w:bidi="ar-SA"/>
-        </w:rPr>
-        <w:t>Mathematically, the output dimension O of a convolutional layer is defined as:</w:t>
-      </w:r>
-    </w:p>
-    <w:p>
-      <w:pPr>
-        <w:pStyle w:val="BodyText"/>
+        <w:spacing w:line="480" w:lineRule="auto"/>
         <w:rPr>
           <w:lang w:eastAsia="en-US" w:bidi="ar-SA"/>
         </w:rPr>
@@ -31340,14 +30505,7 @@
               <w:rFonts w:ascii="Cambria Math" w:hAnsi="Cambria Math"/>
               <w:lang w:eastAsia="en-US" w:bidi="ar-SA"/>
             </w:rPr>
-            <m:t>+</m:t>
-          </m:r>
-          <m:r>
-            <w:rPr>
-              <w:rFonts w:ascii="Cambria Math" w:hAnsi="Cambria Math"/>
-              <w:lang w:eastAsia="en-US" w:bidi="ar-SA"/>
-            </w:rPr>
-            <m:t>1</m:t>
+            <m:t>+1</m:t>
           </m:r>
         </m:oMath>
       </m:oMathPara>
@@ -31355,6 +30513,7 @@
     <w:p>
       <w:pPr>
         <w:pStyle w:val="BodyText"/>
+        <w:spacing w:line="480" w:lineRule="auto"/>
         <w:rPr>
           <w:lang w:eastAsia="en-US" w:bidi="ar-SA"/>
         </w:rPr>
@@ -31365,68 +30524,93 @@
           <w:iCs/>
           <w:lang w:eastAsia="en-US" w:bidi="ar-SA"/>
         </w:rPr>
-        <w:t xml:space="preserve">Where I </w:t>
-      </w:r>
-      <w:proofErr w:type="gramStart"/>
+        <w:t xml:space="preserve">Where I is input size, K is kernel size, P is padding, and </w:t>
+      </w:r>
       <w:r>
         <w:rPr>
           <w:i/>
           <w:iCs/>
           <w:lang w:eastAsia="en-US" w:bidi="ar-SA"/>
         </w:rPr>
-        <w:t>is</w:t>
-      </w:r>
-      <w:proofErr w:type="gramEnd"/>
+        <w:t>S</w:t>
+      </w:r>
       <w:r>
         <w:rPr>
           <w:i/>
           <w:iCs/>
           <w:lang w:eastAsia="en-US" w:bidi="ar-SA"/>
         </w:rPr>
-        <w:t xml:space="preserve"> input size, K is kernel size, P is padding, and </w:t>
-      </w:r>
-      <w:r>
-        <w:rPr>
-          <w:i/>
-          <w:iCs/>
+        <w:t xml:space="preserve"> is stride.</w:t>
+      </w:r>
+    </w:p>
+    <w:p>
+      <w:pPr>
+        <w:pStyle w:val="BodyText"/>
+        <w:spacing w:line="480" w:lineRule="auto"/>
+        <w:ind w:firstLine="720"/>
+        <w:rPr>
           <w:lang w:eastAsia="en-US" w:bidi="ar-SA"/>
         </w:rPr>
-        <w:t>S</w:t>
-      </w:r>
-      <w:r>
-        <w:rPr>
-          <w:i/>
-          <w:iCs/>
+      </w:pPr>
+      <w:r>
+        <w:rPr>
           <w:lang w:eastAsia="en-US" w:bidi="ar-SA"/>
         </w:rPr>
-        <w:t xml:space="preserve"> is stride.</w:t>
-      </w:r>
-    </w:p>
-    <w:p>
-      <w:pPr>
-        <w:pStyle w:val="BodyText"/>
-        <w:ind w:firstLine="720"/>
+        <w:t xml:space="preserve">Under the experimental constraint of P = 0, the spatial resolution diminishes by 2 pixels per layer. Adhering to the full 16-layer depth of the original VGG16 would cause the feature map dimensions to reach </w:t>
+      </w:r>
+      <w:r>
         <w:rPr>
           <w:lang w:eastAsia="en-US" w:bidi="ar-SA"/>
         </w:rPr>
-      </w:pPr>
+        <w:t>8*8*512</w:t>
+      </w:r>
       <w:r>
         <w:rPr>
           <w:lang w:eastAsia="en-US" w:bidi="ar-SA"/>
         </w:rPr>
-        <w:t xml:space="preserve">Under the experimental constraint of P = 0, the spatial resolution diminishes by 2 pixels per layer. Adhering to the full 16-layer depth of the original VGG16 would cause the feature map dimensions to reach a null or non-positive state (specifically 0 </w:t>
+        <w:t xml:space="preserve"> dimension</w:t>
       </w:r>
       <w:r>
         <w:rPr>
           <w:lang w:eastAsia="en-US" w:bidi="ar-SA"/>
         </w:rPr>
+        <w:t xml:space="preserve"> </w:t>
+      </w:r>
+      <w:r>
+        <w:rPr>
+          <w:lang w:eastAsia="en-US" w:bidi="ar-SA"/>
+        </w:rPr>
+        <w:t>by</w:t>
+      </w:r>
+      <w:r>
+        <w:rPr>
+          <w:lang w:eastAsia="en-US" w:bidi="ar-SA"/>
+        </w:rPr>
+        <w:t xml:space="preserve"> the final convolutional stage. </w:t>
+      </w:r>
+      <w:r>
+        <w:rPr>
+          <w:lang w:eastAsia="en-US" w:bidi="ar-SA"/>
+        </w:rPr>
+        <w:t xml:space="preserve">The researcher built a model on this dimension and noted that the model performed very poorly (perhaps due to fewer images in the KOMNET dataset that has 39, 600 images compared to the IMAGENET dataset that has 1.3 million images). </w:t>
+      </w:r>
+      <w:r>
+        <w:rPr>
+          <w:lang w:eastAsia="en-US" w:bidi="ar-SA"/>
+        </w:rPr>
+        <w:t xml:space="preserve">Consequently, the architecture was truncated to maintain a viable latent representation (61 </w:t>
+      </w:r>
+      <w:r>
+        <w:rPr>
+          <w:lang w:eastAsia="en-US" w:bidi="ar-SA"/>
+        </w:rPr>
         <w:t>*</w:t>
       </w:r>
       <w:r>
         <w:rPr>
           <w:lang w:eastAsia="en-US" w:bidi="ar-SA"/>
         </w:rPr>
-        <w:t xml:space="preserve"> 0) well before the final convolutional stage. Consequently, the architecture was truncated to maintain a viable latent representation (61 </w:t>
+        <w:t xml:space="preserve"> 61 </w:t>
       </w:r>
       <w:r>
         <w:rPr>
@@ -31438,222 +30622,91 @@
         <w:rPr>
           <w:lang w:eastAsia="en-US" w:bidi="ar-SA"/>
         </w:rPr>
-        <w:t xml:space="preserve"> 61 </w:t>
+        <w:t xml:space="preserve"> 128) prior to flattening, ensuring that the classification head received a mathematically valid and feature-rich input.</w:t>
       </w:r>
       <w:r>
         <w:rPr>
           <w:lang w:eastAsia="en-US" w:bidi="ar-SA"/>
         </w:rPr>
-        <w:t>*</w:t>
+        <w:t xml:space="preserve"> In simple terms, </w:t>
       </w:r>
       <w:r>
         <w:rPr>
           <w:lang w:eastAsia="en-US" w:bidi="ar-SA"/>
         </w:rPr>
-        <w:t xml:space="preserve"> 128) prior to flattening, ensuring that the classification head received a mathematically valid and feature-rich input.</w:t>
-      </w:r>
-    </w:p>
-    <w:p>
-      <w:pPr>
-        <w:pStyle w:val="BodyText"/>
+        <w:t>a lot of</w:t>
+      </w:r>
+      <w:r>
         <w:rPr>
           <w:lang w:eastAsia="en-US" w:bidi="ar-SA"/>
         </w:rPr>
-      </w:pPr>
-      <w:r>
+        <w:t xml:space="preserve"> data will be lost if we used 16 layers like in the original VGG16 model.</w:t>
+      </w:r>
+    </w:p>
+    <w:p>
+      <w:pPr>
+        <w:pStyle w:val="Heading3"/>
         <w:rPr>
           <w:lang w:eastAsia="en-US" w:bidi="ar-SA"/>
         </w:rPr>
-        <w:pict w14:anchorId="1F9F2F66">
-          <v:rect id="_x0000_i1031" style="width:0;height:1.5pt" o:hralign="center" o:hrstd="t" o:hr="t" fillcolor="#a0a0a0" stroked="f"/>
-        </w:pict>
-      </w:r>
-    </w:p>
-    <w:p>
-      <w:pPr>
-        <w:pStyle w:val="BodyText"/>
-        <w:numPr>
-          <w:ilvl w:val="0"/>
-          <w:numId w:val="8"/>
-        </w:numPr>
-        <w:rPr>
-          <w:b/>
-          <w:bCs/>
+      </w:pPr>
+      <w:r>
+        <w:rPr>
           <w:lang w:eastAsia="en-US" w:bidi="ar-SA"/>
         </w:rPr>
-      </w:pPr>
-      <w:r>
-        <w:rPr>
-          <w:b/>
-          <w:bCs/>
+        <w:t>Modified VGG Architecture</w:t>
+      </w:r>
+      <w:r>
+        <w:rPr>
           <w:lang w:eastAsia="en-US" w:bidi="ar-SA"/>
         </w:rPr>
-        <w:t>Key Points for your Discussion:</w:t>
-      </w:r>
-    </w:p>
-    <w:p>
-      <w:pPr>
-        <w:pStyle w:val="BodyText"/>
-        <w:numPr>
-          <w:ilvl w:val="0"/>
-          <w:numId w:val="16"/>
-        </w:numPr>
+        <w:t xml:space="preserve"> (</w:t>
+      </w:r>
+      <w:r>
         <w:rPr>
           <w:lang w:eastAsia="en-US" w:bidi="ar-SA"/>
         </w:rPr>
-      </w:pPr>
-      <w:r>
-        <w:rPr>
-          <w:b/>
-          <w:bCs/>
+        <w:t>VGG</w:t>
+      </w:r>
+      <w:r>
+        <w:rPr>
           <w:lang w:eastAsia="en-US" w:bidi="ar-SA"/>
         </w:rPr>
-        <w:t>Spatial Decay:</w:t>
+        <w:t xml:space="preserve"> Without </w:t>
       </w:r>
       <w:r>
         <w:rPr>
           <w:lang w:eastAsia="en-US" w:bidi="ar-SA"/>
         </w:rPr>
-        <w:t xml:space="preserve"> By mentioning the "spatial decay" of the feature maps, you explain that the model "outran" its own resolution.</w:t>
-      </w:r>
-    </w:p>
-    <w:p>
-      <w:pPr>
-        <w:pStyle w:val="BodyText"/>
-        <w:numPr>
-          <w:ilvl w:val="0"/>
-          <w:numId w:val="16"/>
-        </w:numPr>
+        <w:t>Padding</w:t>
+      </w:r>
+      <w:r>
         <w:rPr>
           <w:lang w:eastAsia="en-US" w:bidi="ar-SA"/>
         </w:rPr>
-      </w:pPr>
-      <w:r>
-        <w:rPr>
-          <w:b/>
-          <w:bCs/>
-          <w:lang w:eastAsia="en-US" w:bidi="ar-SA"/>
-        </w:rPr>
-        <w:t>Comparison to Padding:</w:t>
-      </w:r>
-      <w:r>
-        <w:rPr>
-          <w:lang w:eastAsia="en-US" w:bidi="ar-SA"/>
-        </w:rPr>
-        <w:t xml:space="preserve"> This effectively highlights the trade-off you made: you sacrificed network depth (number of layers) to gain data purity (no padding).</w:t>
-      </w:r>
-    </w:p>
-    <w:p>
-      <w:pPr>
-        <w:pStyle w:val="BodyText"/>
-        <w:numPr>
-          <w:ilvl w:val="0"/>
-          <w:numId w:val="16"/>
-        </w:numPr>
-        <w:rPr>
-          <w:lang w:eastAsia="en-US" w:bidi="ar-SA"/>
-        </w:rPr>
-      </w:pPr>
-      <w:r>
-        <w:rPr>
-          <w:b/>
-          <w:bCs/>
-          <w:lang w:eastAsia="en-US" w:bidi="ar-SA"/>
-        </w:rPr>
-        <w:t>Information Density:</w:t>
-      </w:r>
-      <w:r>
-        <w:rPr>
-          <w:lang w:eastAsia="en-US" w:bidi="ar-SA"/>
-        </w:rPr>
-        <w:t xml:space="preserve"> You can argue that even with fewer layers, the unpadded model is more efficient because every pixel processed is an original biometric signal rather than an artificial zero.</w:t>
-      </w:r>
-    </w:p>
-    <w:p>
-      <w:pPr>
-        <w:pStyle w:val="BodyText"/>
-        <w:numPr>
-          <w:ilvl w:val="0"/>
-          <w:numId w:val="8"/>
-        </w:numPr>
-        <w:rPr>
-          <w:b/>
-          <w:bCs/>
-          <w:lang w:eastAsia="en-US" w:bidi="ar-SA"/>
-        </w:rPr>
-      </w:pPr>
-      <w:r>
-        <w:rPr>
-          <w:b/>
-          <w:bCs/>
-          <w:lang w:eastAsia="en-US" w:bidi="ar-SA"/>
-        </w:rPr>
-        <w:t>Data for your Summary Table:</w:t>
-      </w:r>
-    </w:p>
-    <w:p>
-      <w:pPr>
-        <w:pStyle w:val="BodyText"/>
-        <w:rPr>
-          <w:lang w:eastAsia="en-US" w:bidi="ar-SA"/>
-        </w:rPr>
-      </w:pPr>
-      <w:r>
-        <w:rPr>
-          <w:lang w:eastAsia="en-US" w:bidi="ar-SA"/>
-        </w:rPr>
-        <w:t>You can add a note to your architecture table:</w:t>
-      </w:r>
-    </w:p>
-    <w:p>
-      <w:pPr>
-        <w:pStyle w:val="BodyText"/>
-        <w:rPr>
-          <w:lang w:eastAsia="en-US" w:bidi="ar-SA"/>
-        </w:rPr>
-      </w:pPr>
-      <w:r>
-        <w:rPr>
-          <w:i/>
-          <w:iCs/>
-          <w:lang w:eastAsia="en-US" w:bidi="ar-SA"/>
-        </w:rPr>
-        <w:t>"Note: Truncated depth relative to VGG16 to prevent spatial dimensionality exhaustion under non-padding constraints."</w:t>
-      </w:r>
-    </w:p>
-    <w:p>
-      <w:pPr>
-        <w:pStyle w:val="BodyText"/>
-        <w:rPr>
-          <w:lang w:eastAsia="en-US" w:bidi="ar-SA"/>
-        </w:rPr>
-      </w:pPr>
-      <w:r>
-        <w:rPr>
-          <w:lang w:eastAsia="en-US" w:bidi="ar-SA"/>
-        </w:rPr>
-        <w:t>How would you like to incorporate this explanation into your final draft—as a standalone paragraph or as a footnote to your architecture table?</w:t>
-      </w:r>
-    </w:p>
-    <w:p>
-      <w:pPr>
-        <w:pStyle w:val="BodyText"/>
-        <w:rPr>
-          <w:lang w:eastAsia="en-US" w:bidi="ar-SA"/>
-        </w:rPr>
-      </w:pPr>
-    </w:p>
-    <w:p>
-      <w:pPr>
-        <w:numPr>
-          <w:ilvl w:val="0"/>
-          <w:numId w:val="8"/>
-        </w:numPr>
-        <w:tabs>
-          <w:tab w:val="num" w:pos="360"/>
-        </w:tabs>
+        <w:t>)</w:t>
+      </w:r>
+    </w:p>
+    <w:p>
+      <w:pPr>
         <w:suppressAutoHyphens w:val="0"/>
         <w:spacing w:before="100" w:beforeAutospacing="1" w:after="100" w:afterAutospacing="1" w:line="480" w:lineRule="auto"/>
+        <w:ind w:firstLine="432"/>
+        <w:rPr>
+          <w:rFonts w:ascii="Times New Roman" w:eastAsia="Times New Roman" w:hAnsi="Times New Roman" w:cs="Times New Roman"/>
+          <w:kern w:val="0"/>
+          <w:lang w:eastAsia="en-US" w:bidi="ar-SA"/>
+        </w:rPr>
+      </w:pPr>
+      <w:r>
+        <w:rPr>
+          <w:rFonts w:ascii="Times New Roman" w:eastAsia="Times New Roman" w:hAnsi="Times New Roman" w:cs="Times New Roman"/>
+          <w:kern w:val="0"/>
+          <w:lang w:eastAsia="en-US" w:bidi="ar-SA"/>
+        </w:rPr>
+        <w:t xml:space="preserve">The </w:t>
+      </w:r>
+      <w:r>
         <w:rPr>
           <w:rFonts w:ascii="Times New Roman" w:eastAsia="Times New Roman" w:hAnsi="Times New Roman" w:cs="Times New Roman"/>
           <w:b/>
@@ -31661,7 +30714,32 @@
           <w:kern w:val="0"/>
           <w:lang w:eastAsia="en-US" w:bidi="ar-SA"/>
         </w:rPr>
-      </w:pPr>
+        <w:t>VGG_No_Padding</w:t>
+      </w:r>
+      <w:r>
+        <w:rPr>
+          <w:rFonts w:ascii="Times New Roman" w:eastAsia="Times New Roman" w:hAnsi="Times New Roman" w:cs="Times New Roman"/>
+          <w:kern w:val="0"/>
+          <w:lang w:eastAsia="en-US" w:bidi="ar-SA"/>
+        </w:rPr>
+        <w:t xml:space="preserve"> architecture is a customized deep convolutional neural network based on the VGG philosophy of utilizing small 3 </w:t>
+      </w:r>
+      <w:r>
+        <w:rPr>
+          <w:rFonts w:ascii="Times New Roman" w:eastAsia="Times New Roman" w:hAnsi="Times New Roman" w:cs="Times New Roman"/>
+          <w:kern w:val="0"/>
+          <w:lang w:eastAsia="en-US" w:bidi="ar-SA"/>
+        </w:rPr>
+        <w:t>*</w:t>
+      </w:r>
+      <w:r>
+        <w:rPr>
+          <w:rFonts w:ascii="Times New Roman" w:eastAsia="Times New Roman" w:hAnsi="Times New Roman" w:cs="Times New Roman"/>
+          <w:kern w:val="0"/>
+          <w:lang w:eastAsia="en-US" w:bidi="ar-SA"/>
+        </w:rPr>
+        <w:t xml:space="preserve"> 3. Unlike standard VGG implementations that employ zero-padding to maintain spatial resolution, this variant utilizes </w:t>
+      </w:r>
       <w:r>
         <w:rPr>
           <w:rFonts w:ascii="Times New Roman" w:eastAsia="Times New Roman" w:hAnsi="Times New Roman" w:cs="Times New Roman"/>
@@ -31670,107 +30748,15 @@
           <w:kern w:val="0"/>
           <w:lang w:eastAsia="en-US" w:bidi="ar-SA"/>
         </w:rPr>
-        <w:t xml:space="preserve">Modified VGG Architecture: </w:t>
-      </w:r>
-      <w:proofErr w:type="spellStart"/>
-      <w:r>
-        <w:rPr>
-          <w:rFonts w:ascii="Times New Roman" w:eastAsia="Times New Roman" w:hAnsi="Times New Roman" w:cs="Times New Roman"/>
-          <w:b/>
-          <w:bCs/>
-          <w:kern w:val="0"/>
-          <w:lang w:eastAsia="en-US" w:bidi="ar-SA"/>
-        </w:rPr>
-        <w:t>VGG_No_Padding</w:t>
-      </w:r>
-      <w:proofErr w:type="spellEnd"/>
-    </w:p>
-    <w:p>
-      <w:pPr>
-        <w:suppressAutoHyphens w:val="0"/>
-        <w:spacing w:before="100" w:beforeAutospacing="1" w:after="100" w:afterAutospacing="1" w:line="480" w:lineRule="auto"/>
+        <w:t>valid convolutions</w:t>
+      </w:r>
+      <w:r>
         <w:rPr>
           <w:rFonts w:ascii="Times New Roman" w:eastAsia="Times New Roman" w:hAnsi="Times New Roman" w:cs="Times New Roman"/>
           <w:kern w:val="0"/>
           <w:lang w:eastAsia="en-US" w:bidi="ar-SA"/>
         </w:rPr>
-      </w:pPr>
-      <w:r>
-        <w:rPr>
-          <w:rFonts w:ascii="Times New Roman" w:eastAsia="Times New Roman" w:hAnsi="Times New Roman" w:cs="Times New Roman"/>
-          <w:kern w:val="0"/>
-          <w:lang w:eastAsia="en-US" w:bidi="ar-SA"/>
-        </w:rPr>
-        <w:lastRenderedPageBreak/>
-        <w:t xml:space="preserve">The </w:t>
-      </w:r>
-      <w:proofErr w:type="spellStart"/>
-      <w:r>
-        <w:rPr>
-          <w:rFonts w:ascii="Times New Roman" w:eastAsia="Times New Roman" w:hAnsi="Times New Roman" w:cs="Times New Roman"/>
-          <w:b/>
-          <w:bCs/>
-          <w:kern w:val="0"/>
-          <w:lang w:eastAsia="en-US" w:bidi="ar-SA"/>
-        </w:rPr>
-        <w:t>VGG_No_Padding</w:t>
-      </w:r>
-      <w:proofErr w:type="spellEnd"/>
-      <w:r>
-        <w:rPr>
-          <w:rFonts w:ascii="Times New Roman" w:eastAsia="Times New Roman" w:hAnsi="Times New Roman" w:cs="Times New Roman"/>
-          <w:kern w:val="0"/>
-          <w:lang w:eastAsia="en-US" w:bidi="ar-SA"/>
-        </w:rPr>
-        <w:t xml:space="preserve"> architecture is a customized deep convolutional neural network based on the VGG philosophy of utilizing small $3 \times 3$ kernels. Unlike standard VGG implementations that employ zero-padding to maintain spatial resolution, this variant utilizes </w:t>
-      </w:r>
-      <w:r>
-        <w:rPr>
-          <w:rFonts w:ascii="Times New Roman" w:eastAsia="Times New Roman" w:hAnsi="Times New Roman" w:cs="Times New Roman"/>
-          <w:b/>
-          <w:bCs/>
-          <w:kern w:val="0"/>
-          <w:lang w:eastAsia="en-US" w:bidi="ar-SA"/>
-        </w:rPr>
-        <w:t>valid convolutions</w:t>
-      </w:r>
-      <w:r>
-        <w:rPr>
-          <w:rFonts w:ascii="Times New Roman" w:eastAsia="Times New Roman" w:hAnsi="Times New Roman" w:cs="Times New Roman"/>
-          <w:kern w:val="0"/>
-          <w:lang w:eastAsia="en-US" w:bidi="ar-SA"/>
-        </w:rPr>
         <w:t>. This design choice ensures that the model processes only original pixel data, thereby eliminating the potential for artificial foveation bias or boundary-induced artifacts.</w:t>
-      </w:r>
-    </w:p>
-    <w:p>
-      <w:pPr>
-        <w:numPr>
-          <w:ilvl w:val="0"/>
-          <w:numId w:val="8"/>
-        </w:numPr>
-        <w:tabs>
-          <w:tab w:val="num" w:pos="360"/>
-        </w:tabs>
-        <w:suppressAutoHyphens w:val="0"/>
-        <w:spacing w:before="100" w:beforeAutospacing="1" w:after="100" w:afterAutospacing="1" w:line="480" w:lineRule="auto"/>
-        <w:rPr>
-          <w:rFonts w:ascii="Times New Roman" w:eastAsia="Times New Roman" w:hAnsi="Times New Roman" w:cs="Times New Roman"/>
-          <w:b/>
-          <w:bCs/>
-          <w:kern w:val="0"/>
-          <w:lang w:eastAsia="en-US" w:bidi="ar-SA"/>
-        </w:rPr>
-      </w:pPr>
-      <w:r>
-        <w:rPr>
-          <w:rFonts w:ascii="Times New Roman" w:eastAsia="Times New Roman" w:hAnsi="Times New Roman" w:cs="Times New Roman"/>
-          <w:b/>
-          <w:bCs/>
-          <w:kern w:val="0"/>
-          <w:lang w:eastAsia="en-US" w:bidi="ar-SA"/>
-        </w:rPr>
-        <w:t>3.X.1 Feature Extraction and Spatial Reduction</w:t>
       </w:r>
     </w:p>
     <w:p>
@@ -31814,6 +30800,7 @@
           <w:kern w:val="0"/>
           <w:lang w:eastAsia="en-US" w:bidi="ar-SA"/>
         </w:rPr>
+        <w:lastRenderedPageBreak/>
         <w:t>Block 1:</w:t>
       </w:r>
       <w:r>
@@ -31822,7 +30809,55 @@
           <w:kern w:val="0"/>
           <w:lang w:eastAsia="en-US" w:bidi="ar-SA"/>
         </w:rPr>
-        <w:t xml:space="preserve"> Comprises two convolutional layers with $64$ filters each. Given the absence of padding, the initial $256 \times 256$ input is reduced to $254 \times 254$ and then to $252 \times 252$ before entering the first max-pooling stage.</w:t>
+        <w:t xml:space="preserve"> Comprises two convolutional layers with 64 filters each. Given the absence of padding, the initial 256 </w:t>
+      </w:r>
+      <w:r>
+        <w:rPr>
+          <w:rFonts w:ascii="Times New Roman" w:eastAsia="Times New Roman" w:hAnsi="Times New Roman" w:cs="Times New Roman"/>
+          <w:kern w:val="0"/>
+          <w:lang w:eastAsia="en-US" w:bidi="ar-SA"/>
+        </w:rPr>
+        <w:t>*</w:t>
+      </w:r>
+      <w:r>
+        <w:rPr>
+          <w:rFonts w:ascii="Times New Roman" w:eastAsia="Times New Roman" w:hAnsi="Times New Roman" w:cs="Times New Roman"/>
+          <w:kern w:val="0"/>
+          <w:lang w:eastAsia="en-US" w:bidi="ar-SA"/>
+        </w:rPr>
+        <w:t xml:space="preserve"> 256 input is reduced to 254 </w:t>
+      </w:r>
+      <w:r>
+        <w:rPr>
+          <w:rFonts w:ascii="Times New Roman" w:eastAsia="Times New Roman" w:hAnsi="Times New Roman" w:cs="Times New Roman"/>
+          <w:kern w:val="0"/>
+          <w:lang w:eastAsia="en-US" w:bidi="ar-SA"/>
+        </w:rPr>
+        <w:t>*</w:t>
+      </w:r>
+      <w:r>
+        <w:rPr>
+          <w:rFonts w:ascii="Times New Roman" w:eastAsia="Times New Roman" w:hAnsi="Times New Roman" w:cs="Times New Roman"/>
+          <w:kern w:val="0"/>
+          <w:lang w:eastAsia="en-US" w:bidi="ar-SA"/>
+        </w:rPr>
+        <w:t xml:space="preserve"> 254 and then to 252 </w:t>
+      </w:r>
+      <w:r>
+        <w:rPr>
+          <w:rFonts w:ascii="Times New Roman" w:eastAsia="Times New Roman" w:hAnsi="Times New Roman" w:cs="Times New Roman"/>
+          <w:kern w:val="0"/>
+          <w:lang w:eastAsia="en-US" w:bidi="ar-SA"/>
+        </w:rPr>
+        <w:t>*</w:t>
+      </w:r>
+      <w:r>
+        <w:rPr>
+          <w:rFonts w:ascii="Times New Roman" w:eastAsia="Times New Roman" w:hAnsi="Times New Roman" w:cs="Times New Roman"/>
+          <w:kern w:val="0"/>
+          <w:lang w:eastAsia="en-US" w:bidi="ar-SA"/>
+        </w:rPr>
+        <w:t xml:space="preserve"> 252 before entering the first max-pooling stage.</w:t>
       </w:r>
     </w:p>
     <w:p>
@@ -31855,37 +30890,55 @@
           <w:kern w:val="0"/>
           <w:lang w:eastAsia="en-US" w:bidi="ar-SA"/>
         </w:rPr>
-        <w:t xml:space="preserve"> Consists of two convolutional layers with $128$ filters. Further "valid" convolutions reduce the spatial grid to $122 \times 122$ before the final pooling layer outputs a feature map of $61 \times 61 \times 128$.</w:t>
-      </w:r>
-    </w:p>
-    <w:p>
-      <w:pPr>
-        <w:numPr>
-          <w:ilvl w:val="0"/>
-          <w:numId w:val="8"/>
-        </w:numPr>
-        <w:tabs>
-          <w:tab w:val="num" w:pos="360"/>
-        </w:tabs>
-        <w:suppressAutoHyphens w:val="0"/>
-        <w:spacing w:before="100" w:beforeAutospacing="1" w:after="100" w:afterAutospacing="1" w:line="480" w:lineRule="auto"/>
+        <w:t xml:space="preserve"> Consists of two convolutional layers with 128 filters. Further "valid" convolutions reduce the spatial grid to 122 </w:t>
+      </w:r>
+      <w:r>
         <w:rPr>
           <w:rFonts w:ascii="Times New Roman" w:eastAsia="Times New Roman" w:hAnsi="Times New Roman" w:cs="Times New Roman"/>
-          <w:b/>
-          <w:bCs/>
           <w:kern w:val="0"/>
           <w:lang w:eastAsia="en-US" w:bidi="ar-SA"/>
         </w:rPr>
-      </w:pPr>
+        <w:t xml:space="preserve">* </w:t>
+      </w:r>
       <w:r>
         <w:rPr>
           <w:rFonts w:ascii="Times New Roman" w:eastAsia="Times New Roman" w:hAnsi="Times New Roman" w:cs="Times New Roman"/>
-          <w:b/>
-          <w:bCs/>
           <w:kern w:val="0"/>
           <w:lang w:eastAsia="en-US" w:bidi="ar-SA"/>
         </w:rPr>
-        <w:t>3.X.2 Classification Head and Parameter Distribution</w:t>
+        <w:t xml:space="preserve">122 before the final pooling layer outputs a feature map of 61 </w:t>
+      </w:r>
+      <w:r>
+        <w:rPr>
+          <w:rFonts w:ascii="Times New Roman" w:eastAsia="Times New Roman" w:hAnsi="Times New Roman" w:cs="Times New Roman"/>
+          <w:kern w:val="0"/>
+          <w:lang w:eastAsia="en-US" w:bidi="ar-SA"/>
+        </w:rPr>
+        <w:t>*</w:t>
+      </w:r>
+      <w:r>
+        <w:rPr>
+          <w:rFonts w:ascii="Times New Roman" w:eastAsia="Times New Roman" w:hAnsi="Times New Roman" w:cs="Times New Roman"/>
+          <w:kern w:val="0"/>
+          <w:lang w:eastAsia="en-US" w:bidi="ar-SA"/>
+        </w:rPr>
+        <w:t xml:space="preserve"> 61 </w:t>
+      </w:r>
+      <w:r>
+        <w:rPr>
+          <w:rFonts w:ascii="Times New Roman" w:eastAsia="Times New Roman" w:hAnsi="Times New Roman" w:cs="Times New Roman"/>
+          <w:kern w:val="0"/>
+          <w:lang w:eastAsia="en-US" w:bidi="ar-SA"/>
+        </w:rPr>
+        <w:t>*</w:t>
+      </w:r>
+      <w:r>
+        <w:rPr>
+          <w:rFonts w:ascii="Times New Roman" w:eastAsia="Times New Roman" w:hAnsi="Times New Roman" w:cs="Times New Roman"/>
+          <w:kern w:val="0"/>
+          <w:lang w:eastAsia="en-US" w:bidi="ar-SA"/>
+        </w:rPr>
+        <w:t xml:space="preserve"> 128.</w:t>
       </w:r>
     </w:p>
     <w:p>
@@ -32024,7 +31077,7 @@
           <w:kern w:val="0"/>
           <w:lang w:eastAsia="en-US" w:bidi="ar-SA"/>
         </w:rPr>
-        <w:t xml:space="preserve"> layer ($p=0.5$ typically) is implemented following the primary dense layer to enforce feature independence and mitigate overfitting, which is critical given the model's high capacity.</w:t>
+        <w:t xml:space="preserve"> layer (p=0.5 typically) is implemented following the primary dense layer to enforce feature independence and mitigate overfitting, which is critical given the model's high capacity.</w:t>
       </w:r>
     </w:p>
     <w:p>
@@ -32049,7 +31102,6 @@
           <w:kern w:val="0"/>
           <w:lang w:eastAsia="en-US" w:bidi="ar-SA"/>
         </w:rPr>
-        <w:lastRenderedPageBreak/>
         <w:t>Output:</w:t>
       </w:r>
       <w:r>
@@ -32060,16 +31112,14 @@
         </w:rPr>
         <w:t xml:space="preserve"> The network terminates in a 50-unit dense layer with a </w:t>
       </w:r>
-      <w:proofErr w:type="spellStart"/>
       <w:r>
         <w:rPr>
           <w:rFonts w:ascii="Times New Roman" w:eastAsia="Times New Roman" w:hAnsi="Times New Roman" w:cs="Times New Roman"/>
           <w:kern w:val="0"/>
           <w:lang w:eastAsia="en-US" w:bidi="ar-SA"/>
         </w:rPr>
-        <w:t>Softmax</w:t>
-      </w:r>
-      <w:proofErr w:type="spellEnd"/>
+        <w:t>SoftMax</w:t>
+      </w:r>
       <w:r>
         <w:rPr>
           <w:rFonts w:ascii="Times New Roman" w:eastAsia="Times New Roman" w:hAnsi="Times New Roman" w:cs="Times New Roman"/>
@@ -32081,15 +31131,23 @@
     </w:p>
     <w:p>
       <w:pPr>
-        <w:numPr>
-          <w:ilvl w:val="0"/>
-          <w:numId w:val="8"/>
-        </w:numPr>
-        <w:tabs>
-          <w:tab w:val="num" w:pos="360"/>
-        </w:tabs>
         <w:suppressAutoHyphens w:val="0"/>
         <w:spacing w:before="100" w:beforeAutospacing="1" w:after="100" w:afterAutospacing="1" w:line="480" w:lineRule="auto"/>
+        <w:rPr>
+          <w:rFonts w:ascii="Times New Roman" w:eastAsia="Times New Roman" w:hAnsi="Times New Roman" w:cs="Times New Roman"/>
+          <w:kern w:val="0"/>
+          <w:lang w:eastAsia="en-US" w:bidi="ar-SA"/>
+        </w:rPr>
+      </w:pPr>
+      <w:r>
+        <w:rPr>
+          <w:rFonts w:ascii="Times New Roman" w:eastAsia="Times New Roman" w:hAnsi="Times New Roman" w:cs="Times New Roman"/>
+          <w:kern w:val="0"/>
+          <w:lang w:eastAsia="en-US" w:bidi="ar-SA"/>
+        </w:rPr>
+        <w:t xml:space="preserve">The model is characterized by a high parametric complexity, totaling approximately </w:t>
+      </w:r>
+      <w:r>
         <w:rPr>
           <w:rFonts w:ascii="Times New Roman" w:eastAsia="Times New Roman" w:hAnsi="Times New Roman" w:cs="Times New Roman"/>
           <w:b/>
@@ -32097,7 +31155,16 @@
           <w:kern w:val="0"/>
           <w:lang w:eastAsia="en-US" w:bidi="ar-SA"/>
         </w:rPr>
-      </w:pPr>
+        <w:t>488 million trainable parameters</w:t>
+      </w:r>
+      <w:r>
+        <w:rPr>
+          <w:rFonts w:ascii="Times New Roman" w:eastAsia="Times New Roman" w:hAnsi="Times New Roman" w:cs="Times New Roman"/>
+          <w:kern w:val="0"/>
+          <w:lang w:eastAsia="en-US" w:bidi="ar-SA"/>
+        </w:rPr>
+        <w:t xml:space="preserve">. Over </w:t>
+      </w:r>
       <w:r>
         <w:rPr>
           <w:rFonts w:ascii="Times New Roman" w:eastAsia="Times New Roman" w:hAnsi="Times New Roman" w:cs="Times New Roman"/>
@@ -32106,36 +31173,23 @@
           <w:kern w:val="0"/>
           <w:lang w:eastAsia="en-US" w:bidi="ar-SA"/>
         </w:rPr>
-        <w:t>3.X.3 Computational Complexity</w:t>
-      </w:r>
-    </w:p>
-    <w:p>
-      <w:pPr>
-        <w:suppressAutoHyphens w:val="0"/>
-        <w:spacing w:before="100" w:beforeAutospacing="1" w:after="100" w:afterAutospacing="1" w:line="480" w:lineRule="auto"/>
+        <w:t>99.9%</w:t>
+      </w:r>
+      <w:r>
         <w:rPr>
           <w:rFonts w:ascii="Times New Roman" w:eastAsia="Times New Roman" w:hAnsi="Times New Roman" w:cs="Times New Roman"/>
           <w:kern w:val="0"/>
           <w:lang w:eastAsia="en-US" w:bidi="ar-SA"/>
         </w:rPr>
-      </w:pPr>
+        <w:t xml:space="preserve"> of these parameters ($487.7$ million) are localized in the single weight matrix connecting the flattened layer to the first dense layer. This indicates a model with immense capacity for learning complex latent representations, albeit requiring significant memory overhead (approx</w:t>
+      </w:r>
       <w:r>
         <w:rPr>
           <w:rFonts w:ascii="Times New Roman" w:eastAsia="Times New Roman" w:hAnsi="Times New Roman" w:cs="Times New Roman"/>
           <w:kern w:val="0"/>
           <w:lang w:eastAsia="en-US" w:bidi="ar-SA"/>
         </w:rPr>
-        <w:t xml:space="preserve">The model is characterized by a high parametric complexity, totaling approximately </w:t>
-      </w:r>
-      <w:r>
-        <w:rPr>
-          <w:rFonts w:ascii="Times New Roman" w:eastAsia="Times New Roman" w:hAnsi="Times New Roman" w:cs="Times New Roman"/>
-          <w:b/>
-          <w:bCs/>
-          <w:kern w:val="0"/>
-          <w:lang w:eastAsia="en-US" w:bidi="ar-SA"/>
-        </w:rPr>
-        <w:t>488 million trainable parameters</w:t>
+        <w:t>imately</w:t>
       </w:r>
       <w:r>
         <w:rPr>
@@ -32143,44 +31197,19 @@
           <w:kern w:val="0"/>
           <w:lang w:eastAsia="en-US" w:bidi="ar-SA"/>
         </w:rPr>
-        <w:t xml:space="preserve">. Over </w:t>
-      </w:r>
-      <w:r>
-        <w:rPr>
-          <w:rFonts w:ascii="Times New Roman" w:eastAsia="Times New Roman" w:hAnsi="Times New Roman" w:cs="Times New Roman"/>
-          <w:b/>
-          <w:bCs/>
-          <w:kern w:val="0"/>
-          <w:lang w:eastAsia="en-US" w:bidi="ar-SA"/>
-        </w:rPr>
-        <w:t>99.9%</w:t>
-      </w:r>
-      <w:r>
+        <w:t xml:space="preserve"> 1.82 GB for weights).</w:t>
+      </w:r>
+    </w:p>
+    <w:p>
+      <w:pPr>
+        <w:suppressAutoHyphens w:val="0"/>
+        <w:spacing w:before="100" w:beforeAutospacing="1" w:after="100" w:afterAutospacing="1" w:line="480" w:lineRule="auto"/>
         <w:rPr>
           <w:rFonts w:ascii="Times New Roman" w:eastAsia="Times New Roman" w:hAnsi="Times New Roman" w:cs="Times New Roman"/>
           <w:kern w:val="0"/>
           <w:lang w:eastAsia="en-US" w:bidi="ar-SA"/>
         </w:rPr>
-        <w:t xml:space="preserve"> of these parameters ($487.7$ million) are localized in the single weight matrix connecting the flattened layer to the first dense layer. This indicates a model with immense capacity for learning complex latent representations, albeit requiring significant memory overhead ($\</w:t>
-      </w:r>
-      <w:proofErr w:type="spellStart"/>
-      <w:r>
-        <w:rPr>
-          <w:rFonts w:ascii="Times New Roman" w:eastAsia="Times New Roman" w:hAnsi="Times New Roman" w:cs="Times New Roman"/>
-          <w:kern w:val="0"/>
-          <w:lang w:eastAsia="en-US" w:bidi="ar-SA"/>
-        </w:rPr>
-        <w:t>approx</w:t>
-      </w:r>
-      <w:proofErr w:type="spellEnd"/>
-      <w:r>
-        <w:rPr>
-          <w:rFonts w:ascii="Times New Roman" w:eastAsia="Times New Roman" w:hAnsi="Times New Roman" w:cs="Times New Roman"/>
-          <w:kern w:val="0"/>
-          <w:lang w:eastAsia="en-US" w:bidi="ar-SA"/>
-        </w:rPr>
-        <w:t xml:space="preserve"> 1.82$ GB for weights).</w:t>
-      </w:r>
+      </w:pPr>
     </w:p>
     <w:p>
       <w:pPr>
@@ -37219,6 +36248,7 @@
   <w:style w:type="character" w:default="1" w:styleId="DefaultParagraphFont">
     <w:name w:val="Default Paragraph Font"/>
     <w:uiPriority w:val="1"/>
+    <w:semiHidden/>
     <w:unhideWhenUsed/>
   </w:style>
   <w:style w:type="table" w:default="1" w:styleId="TableNormal">

</xml_diff>